<commit_message>
Units 549/551/553/554: remove em-dashes from all learner-authored text; trim seven full inline citations in 549 Task 1 to author-date form; all files schema validated
</commit_message>
<xml_diff>
--- a/Documents/Assignments/Unit 549/HTQ Unit 549 - Assessment Booklet - GW.docx
+++ b/Documents/Assignments/Unit 549/HTQ Unit 549 - Assessment Booklet - GW.docx
@@ -331,9 +331,9 @@
           </mc:Choice>
           <mc:Fallback>
             <w:pict>
-              <v:group w14:anchorId="486F6F20" id="Group 2" o:spid="_x0000_s1026" style="width:537.1pt;height:28.45pt;mso-position-horizontal-relative:char;mso-position-vertical-relative:line" coordorigin="19352,35994" coordsize="68214,3610" o:gfxdata="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">
-                <v:group id="Group 1185102029" o:spid="_x0000_s1027" style="position:absolute;left:19352;top:35994;width:68215;height:3611" coordorigin="19352,36089" coordsize="68214,3420" o:gfxdata="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">
-                  <v:rect id="Rectangle 1671087594" o:spid="_x0000_s1028" style="position:absolute;left:19352;top:36089;width:68215;height:3421;visibility:visible;mso-wrap-style:square;v-text-anchor:middle" o:gfxdata="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" filled="f" stroked="f">
+              <v:group w14:anchorId="486F6F20" id="Group 2" o:spid="_x0000_s1026" style="width:537.1pt;height:28.45pt;mso-position-horizontal-relative:char;mso-position-vertical-relative:line" coordorigin="19352,35994" coordsize="68214,3610" o:gfxdata="UEsDBBQABgAIAAAAIQC2gziS/gAAAOEBAAATAAAAW0NvbnRlbnRfVHlwZXNdLnhtbJSRQU7DMBBF 90jcwfIWJU67QAgl6YK0S0CoHGBkTxKLZGx5TGhvj5O2G0SRWNoz/78nu9wcxkFMGNg6quQqL6RA 0s5Y6ir5vt9lD1JwBDIwOMJKHpHlpr69KfdHjyxSmriSfYz+USnWPY7AufNIadK6MEJMx9ApD/oD OlTrorhX2lFEilmcO2RdNtjC5xDF9pCuTyYBB5bi6bQ4syoJ3g9WQ0ymaiLzg5KdCXlKLjvcW893 SUOqXwnz5DrgnHtJTxOsQfEKIT7DmDSUCaxw7Rqn8787ZsmRM9e2VmPeBN4uqYvTtW7jvijg9N/y JsXecLq0q+WD6m8AAAD//wMAUEsDBBQABgAIAAAAIQA4/SH/1gAAAJQBAAALAAAAX3JlbHMvLnJl bHOkkMFqwzAMhu+DvYPRfXGawxijTi+j0GvpHsDYimMaW0Yy2fr2M4PBMnrbUb/Q94l/f/hMi1qR JVI2sOt6UJgd+ZiDgffL8ekFlFSbvV0oo4EbChzGx4f9GRdb25HMsYhqlCwG5lrLq9biZkxWOiqY 22YiTra2kYMu1l1tQD30/bPm3wwYN0x18gb45AdQl1tp5j/sFB2T0FQ7R0nTNEV3j6o9feQzro1i OWA14Fm+Q8a1a8+Bvu/d/dMb2JY5uiPbhG/ktn4cqGU/er3pcvwCAAD//wMAUEsDBBQABgAIAAAA IQCvKIH2CgQAAI0VAAAOAAAAZHJzL2Uyb0RvYy54bWzsWNtu4zYQfS/QfyD03oikbpQQZ7HY3QQF Ft1gt/0AWpZkAZKokkrs/H2HlCxRdtzE2dati+bBES+iZs6cMzPS9bttXaHHTKpSNAuHXGEHZU0q VmVTLJzffr39iTlIdbxZ8Uo02cJ5ypTz7ubHH643bZJRsRbVKpMIDmlUsmkXzrrr2sR1VbrOaq6u RJs1sJgLWfMOhrJwV5Jv4PS6cinGobsRctVKkWZKwezHftG5MefneZZ2X/JcZR2qFg7Y1plfaX6X +te9ueZJIXm7LtPBDP4GK2peNvDQ8aiPvOPoQZYHR9VlKoUSeXeVitoVeV6mmfEBvCF4z5s7KR5a 40uRbIp2hAmg3cPpzcemvzzeyfZbey8BiU1bABZmpH3Z5rLW/8FKtDWQPY2QZdsOpTAZMkp84jso hTUvJJjSHtN0DcDr20jsBTQKHKQ3BHHsw7VBPV1/sg8JIDy7Q+Aatrg7E9yZYeOgNxg8uJeoXMGT CAvAAExjBzW8BrYZAJE1Pzh5gtfG/NibzGdxb/4bEQgxi19CwKf4BQRALGrig/o+Pnxb8zYzNFOJ hWYYEcyiIIbg9mh+BTXxpqgyRKY1g6i5bySRShTw6RkGzahgAzHDciTCIQw8aaXq7jJRI32xcCSY ZHTHHz+rrufMbos2oBG3ZVXBPE+qZjYB5NIzQK2dufqq2y63g0dLsXoCYqk2vS3hWZ+56u65hORA HLSBhLFw1O8PXGYOqn5uIAIx8SmwvLMH0h4s7QFv0rWAPJR20kH94ENn8lJv5fuHTuSl8Ujb1Rsz mAuht7S6rwJKaBywKPKAs7YKrHnjYaFj/Vrtz1SgIxcPqXMWuTEPQOQo2an8uTxgB/9YHjgM/34e OIcKPEwiSmlAd2haKpjWBs4Aov8VFfQZVcdw4t/liYHEcRRjn1FoQ2wxWPP/AjGQyMeDno6JAQjY bzlaFM8gBhaEjPgRHjPLpIVp6e1SsGCYpZWxIByCcJaCYKRg2ppLlkKI/RgStz8Gr2+OpunvFQKE j0R/1hvRgIThXlXwPAx/fXeF41CXULCDJ5MOYhIy3xuaQ5/S6J/XAcUspAzyCtT7/dbIWjtFCcdw 2AnBoKD7C90iP4PC+YTgXUxNOENGjHCoKwwbRfXlkVdomj2FAjGOgkgTXb8o2VrYcWAI+6spkFVV 2Srd2fPkSH+sRFWudIus9yhZLD9UEoELC+fWf0/IJx1rqDizba9upE3e9P+ny/ROFfjwKhwyNjaT hi7T7Cl0eSljXCRbTPa/iCp7juQSYI9hePU6rDLRuHQKZQIf0yg6nmBY5AemGv9VRWaWN/6W9GL6 iQsgzPTqal7ih+9sL1zDNz+Tfofvk/qjoj02d09fUW/+AAAA//8DAFBLAwQUAAYACAAAACEAJ70M Mt0AAAAFAQAADwAAAGRycy9kb3ducmV2LnhtbEyPQWvCQBCF74X+h2UK3uomttqaZiMiticRqoXi bcyOSTA7G7JrEv99117ay8DjPd77Jl0MphYdta6yrCAeRyCIc6srLhR87d8fX0E4j6yxtkwKruRg kd3fpZho2/MndTtfiFDCLkEFpfdNIqXLSzLoxrYhDt7JtgZ9kG0hdYt9KDe1nETRTBqsOCyU2NCq pPy8uxgFHz32y6d43W3Op9X1sJ9uvzcxKTV6GJZvIDwN/i8MN/yADllgOtoLaydqBeER/3tvXvTy PAFxVDCdzUFmqfxPn/0AAAD//wMAUEsBAi0AFAAGAAgAAAAhALaDOJL+AAAA4QEAABMAAAAAAAAA AAAAAAAAAAAAAFtDb250ZW50X1R5cGVzXS54bWxQSwECLQAUAAYACAAAACEAOP0h/9YAAACUAQAA CwAAAAAAAAAAAAAAAAAvAQAAX3JlbHMvLnJlbHNQSwECLQAUAAYACAAAACEAryiB9goEAACNFQAA DgAAAAAAAAAAAAAAAAAuAgAAZHJzL2Uyb0RvYy54bWxQSwECLQAUAAYACAAAACEAJ70MMt0AAAAF AQAADwAAAAAAAAAAAAAAAABkBgAAZHJzL2Rvd25yZXYueG1sUEsFBgAAAAAEAAQA8wAAAG4HAAAA AA== ">
+                <v:group id="Group 1185102029" o:spid="_x0000_s1027" style="position:absolute;left:19352;top:35994;width:68215;height:3611" coordorigin="19352,36089" coordsize="68214,3420" o:gfxdata="UEsDBBQABgAIAAAAIQDb4fbL7gAAAIUBAAATAAAAW0NvbnRlbnRfVHlwZXNdLnhtbHyQz07DMAyH 70i8Q+QralM4IITa7kDhCAiNB7ASt43WOlEcyvb2pNu4IODoPz9/n1xv9vOkForiPDdwXVagiI23 jocG3rdPxR0oScgWJ8/UwIEENu3lRb09BBKV0ywNjCmFe63FjDSjlD4Q50nv44wpl3HQAc0OB9I3 VXWrjedEnIq03oC27qjHjympx31un0wiTQLq4bS4shrAECZnMGVTvbD9QSnOhDInjzsyuiBXWQP0 r4R18jfgnHvJr4nOknrFmJ5xzhraRtHWf3Kkpfz/yGo5S+H73hkquyhdjr3R8m2lj09svwAAAP// AwBQSwMEFAAGAAgAAAAhAFr0LFu/AAAAFQEAAAsAAABfcmVscy8ucmVsc2zPwWrDMAwG4Ptg72B0 X5TuUMaI01uh19I+gLGVxCy2jGSy9e1nemrHjpL4P0nD4SetZiPRyNnCruvBUPYcYp4tXC/Htw8w Wl0ObuVMFm6kcBhfX4Yzra62kC6xqGlKVgtLreUTUf1CyWnHhXKbTCzJ1VbKjMX5LzcTvvf9HuXR gPHJNKdgQU5hB+ZyK23zHztFL6w81c5zQp6m6P9TMfB3PtPWFCczVQtB9N4U2rp2HOA44NMz4y8A AAD//wMAUEsDBBQABgAIAAAAIQALP//XyAAAAOMAAAAPAAAAZHJzL2Rvd25yZXYueG1sRE9fa8Iw EH8f7DuEG+xtJqk4XGcUER17kMF0MPZ2NGdbbC6liW399stg4OP9/t9iNbpG9NSF2rMBPVEgiAtv ay4NfB13T3MQISJbbDyTgSsFWC3v7xaYWz/wJ/WHWIoUwiFHA1WMbS5lKCpyGCa+JU7cyXcOYzq7 UtoOhxTuGpkp9Swd1pwaKmxpU1FxPlycgbcBh/VUb/v9+bS5/hxnH997TcY8PozrVxCRxngT/7vf bZqv5zOtMpW9wN9PCQC5/AUAAP//AwBQSwECLQAUAAYACAAAACEA2+H2y+4AAACFAQAAEwAAAAAA AAAAAAAAAAAAAAAAW0NvbnRlbnRfVHlwZXNdLnhtbFBLAQItABQABgAIAAAAIQBa9CxbvwAAABUB AAALAAAAAAAAAAAAAAAAAB8BAABfcmVscy8ucmVsc1BLAQItABQABgAIAAAAIQALP//XyAAAAOMA AAAPAAAAAAAAAAAAAAAAAAcCAABkcnMvZG93bnJldi54bWxQSwUGAAAAAAMAAwC3AAAA/AIAAAAA ">
+                  <v:rect id="Rectangle 1671087594" o:spid="_x0000_s1028" style="position:absolute;left:19352;top:36089;width:68215;height:3421;visibility:visible;mso-wrap-style:square;v-text-anchor:middle" o:gfxdata="UEsDBBQABgAIAAAAIQDb4fbL7gAAAIUBAAATAAAAW0NvbnRlbnRfVHlwZXNdLnhtbHyQz07DMAyH 70i8Q+QralM4IITa7kDhCAiNB7ASt43WOlEcyvb2pNu4IODoPz9/n1xv9vOkForiPDdwXVagiI23 jocG3rdPxR0oScgWJ8/UwIEENu3lRb09BBKV0ywNjCmFe63FjDSjlD4Q50nv44wpl3HQAc0OB9I3 VXWrjedEnIq03oC27qjHjympx31un0wiTQLq4bS4shrAECZnMGVTvbD9QSnOhDInjzsyuiBXWQP0 r4R18jfgnHvJr4nOknrFmJ5xzhraRtHWf3Kkpfz/yGo5S+H73hkquyhdjr3R8m2lj09svwAAAP// AwBQSwMEFAAGAAgAAAAhAFr0LFu/AAAAFQEAAAsAAABfcmVscy8ucmVsc2zPwWrDMAwG4Ptg72B0 X5TuUMaI01uh19I+gLGVxCy2jGSy9e1nemrHjpL4P0nD4SetZiPRyNnCruvBUPYcYp4tXC/Htw8w Wl0ObuVMFm6kcBhfX4Yzra62kC6xqGlKVgtLreUTUf1CyWnHhXKbTCzJ1VbKjMX5LzcTvvf9HuXR gPHJNKdgQU5hB+ZyK23zHztFL6w81c5zQp6m6P9TMfB3PtPWFCczVQtB9N4U2rp2HOA44NMz4y8A AAD//wMAUEsDBBQABgAIAAAAIQAJR0bBxwAAAOMAAAAPAAAAZHJzL2Rvd25yZXYueG1sRE9fT8Iw EH834Ts0Z+KbdCwwYFIIGEmEJxh+gHM918X1OtYK89tbExIe7/f/FqveNuJCna8dKxgNExDEpdM1 Vwo+TtvnGQgfkDU2jknBL3lYLQcPC8y1u/KRLkWoRAxhn6MCE0KbS+lLQxb90LXEkftyncUQz66S usNrDLeNTJMkkxZrjg0GW3o1VH4XP1bBYewofUv9pqjs3PSfp/3ujJlST4/9+gVEoD7cxTf3u47z s+komU0n8zH8/xQBkMs/AAAA//8DAFBLAQItABQABgAIAAAAIQDb4fbL7gAAAIUBAAATAAAAAAAA AAAAAAAAAAAAAABbQ29udGVudF9UeXBlc10ueG1sUEsBAi0AFAAGAAgAAAAhAFr0LFu/AAAAFQEA AAsAAAAAAAAAAAAAAAAAHwEAAF9yZWxzLy5yZWxzUEsBAi0AFAAGAAgAAAAhAAlHRsHHAAAA4wAA AA8AAAAAAAAAAAAAAAAABwIAAGRycy9kb3ducmV2LnhtbFBLBQYAAAAAAwADALcAAAD7AgAAAAA= " filled="f" stroked="f">
                     <v:textbox inset="2.53958mm,2.53958mm,2.53958mm,2.53958mm">
                       <w:txbxContent>
                         <w:p>
@@ -345,8 +345,8 @@
                       </w:txbxContent>
                     </v:textbox>
                   </v:rect>
-                  <v:group id="Group 2129587733" o:spid="_x0000_s1029" style="position:absolute;left:19352;top:36089;width:68215;height:3421" coordorigin="19352,36089" coordsize="68214,3420" o:gfxdata="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">
-                    <v:rect id="Rectangle 1301722252" o:spid="_x0000_s1030" style="position:absolute;left:19352;top:36089;width:68215;height:3421;visibility:visible;mso-wrap-style:square;v-text-anchor:middle" o:gfxdata="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" filled="f" stroked="f">
+                  <v:group id="Group 2129587733" o:spid="_x0000_s1029" style="position:absolute;left:19352;top:36089;width:68215;height:3421" coordorigin="19352,36089" coordsize="68214,3420" o:gfxdata="UEsDBBQABgAIAAAAIQDb4fbL7gAAAIUBAAATAAAAW0NvbnRlbnRfVHlwZXNdLnhtbHyQz07DMAyH 70i8Q+QralM4IITa7kDhCAiNB7ASt43WOlEcyvb2pNu4IODoPz9/n1xv9vOkForiPDdwXVagiI23 jocG3rdPxR0oScgWJ8/UwIEENu3lRb09BBKV0ywNjCmFe63FjDSjlD4Q50nv44wpl3HQAc0OB9I3 VXWrjedEnIq03oC27qjHjympx31un0wiTQLq4bS4shrAECZnMGVTvbD9QSnOhDInjzsyuiBXWQP0 r4R18jfgnHvJr4nOknrFmJ5xzhraRtHWf3Kkpfz/yGo5S+H73hkquyhdjr3R8m2lj09svwAAAP// AwBQSwMEFAAGAAgAAAAhAFr0LFu/AAAAFQEAAAsAAABfcmVscy8ucmVsc2zPwWrDMAwG4Ptg72B0 X5TuUMaI01uh19I+gLGVxCy2jGSy9e1nemrHjpL4P0nD4SetZiPRyNnCruvBUPYcYp4tXC/Htw8w Wl0ObuVMFm6kcBhfX4Yzra62kC6xqGlKVgtLreUTUf1CyWnHhXKbTCzJ1VbKjMX5LzcTvvf9HuXR gPHJNKdgQU5hB+ZyK23zHztFL6w81c5zQp6m6P9TMfB3PtPWFCczVQtB9N4U2rp2HOA44NMz4y8A AAD//wMAUEsDBBQABgAIAAAAIQC5Qv2szAAAAOMAAAAPAAAAZHJzL2Rvd25yZXYueG1sRI9La8Mw EITvhf4HsYXeGvlBXm6UEEIbegiFPCD0tlgb28RaGUu1nX8fFQI9DjPzDbNYDaYWHbWusqwgHkUg iHOrKy4UnI6fbzMQziNrrC2Tghs5WC2fnxaYadvznrqDL0SAsMtQQel9k0np8pIMupFtiIN3sa1B H2RbSN1iH+CmlkkUTaTBisNCiQ1tSsqvh1+jYNtjv07jj253vWxuP8fx93kXk1KvL8P6HYSnwf+H H+0vrSCJk/l4Np2mKfx9Cn9ALu8AAAD//wMAUEsBAi0AFAAGAAgAAAAhANvh9svuAAAAhQEAABMA AAAAAAAAAAAAAAAAAAAAAFtDb250ZW50X1R5cGVzXS54bWxQSwECLQAUAAYACAAAACEAWvQsW78A AAAVAQAACwAAAAAAAAAAAAAAAAAfAQAAX3JlbHMvLnJlbHNQSwECLQAUAAYACAAAACEAuUL9rMwA AADjAAAADwAAAAAAAAAAAAAAAAAHAgAAZHJzL2Rvd25yZXYueG1sUEsFBgAAAAADAAMAtwAAAAAD AAAAAA== ">
+                    <v:rect id="Rectangle 1301722252" o:spid="_x0000_s1030" style="position:absolute;left:19352;top:36089;width:68215;height:3421;visibility:visible;mso-wrap-style:square;v-text-anchor:middle" o:gfxdata="UEsDBBQABgAIAAAAIQDb4fbL7gAAAIUBAAATAAAAW0NvbnRlbnRfVHlwZXNdLnhtbHyQz07DMAyH 70i8Q+QralM4IITa7kDhCAiNB7ASt43WOlEcyvb2pNu4IODoPz9/n1xv9vOkForiPDdwXVagiI23 jocG3rdPxR0oScgWJ8/UwIEENu3lRb09BBKV0ywNjCmFe63FjDSjlD4Q50nv44wpl3HQAc0OB9I3 VXWrjedEnIq03oC27qjHjympx31un0wiTQLq4bS4shrAECZnMGVTvbD9QSnOhDInjzsyuiBXWQP0 r4R18jfgnHvJr4nOknrFmJ5xzhraRtHWf3Kkpfz/yGo5S+H73hkquyhdjr3R8m2lj09svwAAAP// AwBQSwMEFAAGAAgAAAAhAFr0LFu/AAAAFQEAAAsAAABfcmVscy8ucmVsc2zPwWrDMAwG4Ptg72B0 X5TuUMaI01uh19I+gLGVxCy2jGSy9e1nemrHjpL4P0nD4SetZiPRyNnCruvBUPYcYp4tXC/Htw8w Wl0ObuVMFm6kcBhfX4Yzra62kC6xqGlKVgtLreUTUf1CyWnHhXKbTCzJ1VbKjMX5LzcTvvf9HuXR gPHJNKdgQU5hB+ZyK23zHztFL6w81c5zQp6m6P9TMfB3PtPWFCczVQtB9N4U2rp2HOA44NMz4y8A AAD//wMAUEsDBBQABgAIAAAAIQBq0h5XxgAAAOMAAAAPAAAAZHJzL2Rvd25yZXYueG1sRE9fT8Iw EH8n4Ts0R+IbdFRAnRSiBhLxSYcf4FyPdWG9zrXA/PbWhMTH+/2/5bp3jThTF2rPGqaTDARx6U3N lYbP/XZ8DyJEZIONZ9LwQwHWq+FgibnxF/6gcxErkUI45KjBxtjmUobSksMw8S1x4g6+cxjT2VXS dHhJ4a6RKssW0mHNqcFiSy+WymNxchreZ57URoXnonIPtv/av+2+caH1zah/egQRqY//4qv71aT5 t9n0Tik1V/D3UwJArn4BAAD//wMAUEsBAi0AFAAGAAgAAAAhANvh9svuAAAAhQEAABMAAAAAAAAA AAAAAAAAAAAAAFtDb250ZW50X1R5cGVzXS54bWxQSwECLQAUAAYACAAAACEAWvQsW78AAAAVAQAA CwAAAAAAAAAAAAAAAAAfAQAAX3JlbHMvLnJlbHNQSwECLQAUAAYACAAAACEAatIeV8YAAADjAAAA DwAAAAAAAAAAAAAAAAAHAgAAZHJzL2Rvd25yZXYueG1sUEsFBgAAAAADAAMAtwAAAPoCAAAAAA== " filled="f" stroked="f">
                       <v:textbox inset="2.53958mm,2.53958mm,2.53958mm,2.53958mm">
                         <w:txbxContent>
                           <w:p>
@@ -358,8 +358,8 @@
                         </w:txbxContent>
                       </v:textbox>
                     </v:rect>
-                    <v:group id="Group 1997904828" o:spid="_x0000_s1031" style="position:absolute;left:19352;top:36089;width:68215;height:3421" coordorigin="19352,36174" coordsize="68214,3252" o:gfxdata="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">
-                      <v:rect id="Rectangle 856814703" o:spid="_x0000_s1032" style="position:absolute;left:19352;top:36174;width:68215;height:3252;visibility:visible;mso-wrap-style:square;v-text-anchor:middle" o:gfxdata="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" filled="f" stroked="f">
+                    <v:group id="Group 1997904828" o:spid="_x0000_s1031" style="position:absolute;left:19352;top:36089;width:68215;height:3421" coordorigin="19352,36174" coordsize="68214,3252" o:gfxdata="UEsDBBQABgAIAAAAIQDb4fbL7gAAAIUBAAATAAAAW0NvbnRlbnRfVHlwZXNdLnhtbHyQz07DMAyH 70i8Q+QralM4IITa7kDhCAiNB7ASt43WOlEcyvb2pNu4IODoPz9/n1xv9vOkForiPDdwXVagiI23 jocG3rdPxR0oScgWJ8/UwIEENu3lRb09BBKV0ywNjCmFe63FjDSjlD4Q50nv44wpl3HQAc0OB9I3 VXWrjedEnIq03oC27qjHjympx31un0wiTQLq4bS4shrAECZnMGVTvbD9QSnOhDInjzsyuiBXWQP0 r4R18jfgnHvJr4nOknrFmJ5xzhraRtHWf3Kkpfz/yGo5S+H73hkquyhdjr3R8m2lj09svwAAAP// AwBQSwMEFAAGAAgAAAAhAFr0LFu/AAAAFQEAAAsAAABfcmVscy8ucmVsc2zPwWrDMAwG4Ptg72B0 X5TuUMaI01uh19I+gLGVxCy2jGSy9e1nemrHjpL4P0nD4SetZiPRyNnCruvBUPYcYp4tXC/Htw8w Wl0ObuVMFm6kcBhfX4Yzra62kC6xqGlKVgtLreUTUf1CyWnHhXKbTCzJ1VbKjMX5LzcTvvf9HuXR gPHJNKdgQU5hB+ZyK23zHztFL6w81c5zQp6m6P9TMfB3PtPWFCczVQtB9N4U2rp2HOA44NMz4y8A AAD//wMAUEsDBBQABgAIAAAAIQBXywT0zQAAAOMAAAAPAAAAZHJzL2Rvd25yZXYueG1sRI9Pa8JA EMXvBb/DMoXe6ibaPyZ1FREtPUihWii9DdkxCWZnQ3abxG/fORR6nHlv3vvNcj26RvXUhdqzgXSa gCIuvK25NPB52t8vQIWIbLHxTAauFGC9mtwsMbd+4A/qj7FUEsIhRwNVjG2udSgqchimviUW7ew7 h1HGrtS2w0HCXaNnSfKkHdYsDRW2tK2ouBx/nIHXAYfNPN31h8t5e/0+Pb5/HVIy5u523LyAijTG f/Pf9ZsV/Cx7zpKHxUyg5SdZgF79AgAA//8DAFBLAQItABQABgAIAAAAIQDb4fbL7gAAAIUBAAAT AAAAAAAAAAAAAAAAAAAAAABbQ29udGVudF9UeXBlc10ueG1sUEsBAi0AFAAGAAgAAAAhAFr0LFu/ AAAAFQEAAAsAAAAAAAAAAAAAAAAAHwEAAF9yZWxzLy5yZWxzUEsBAi0AFAAGAAgAAAAhAFfLBPTN AAAA4wAAAA8AAAAAAAAAAAAAAAAABwIAAGRycy9kb3ducmV2LnhtbFBLBQYAAAAAAwADALcAAAAB AwAAAAA= ">
+                      <v:rect id="Rectangle 856814703" o:spid="_x0000_s1032" style="position:absolute;left:19352;top:36174;width:68215;height:3252;visibility:visible;mso-wrap-style:square;v-text-anchor:middle" o:gfxdata="UEsDBBQABgAIAAAAIQDb4fbL7gAAAIUBAAATAAAAW0NvbnRlbnRfVHlwZXNdLnhtbHyQz07DMAyH 70i8Q+QralM4IITa7kDhCAiNB7ASt43WOlEcyvb2pNu4IODoPz9/n1xv9vOkForiPDdwXVagiI23 jocG3rdPxR0oScgWJ8/UwIEENu3lRb09BBKV0ywNjCmFe63FjDSjlD4Q50nv44wpl3HQAc0OB9I3 VXWrjedEnIq03oC27qjHjympx31un0wiTQLq4bS4shrAECZnMGVTvbD9QSnOhDInjzsyuiBXWQP0 r4R18jfgnHvJr4nOknrFmJ5xzhraRtHWf3Kkpfz/yGo5S+H73hkquyhdjr3R8m2lj09svwAAAP// AwBQSwMEFAAGAAgAAAAhAFr0LFu/AAAAFQEAAAsAAABfcmVscy8ucmVsc2zPwWrDMAwG4Ptg72B0 X5TuUMaI01uh19I+gLGVxCy2jGSy9e1nemrHjpL4P0nD4SetZiPRyNnCruvBUPYcYp4tXC/Htw8w Wl0ObuVMFm6kcBhfX4Yzra62kC6xqGlKVgtLreUTUf1CyWnHhXKbTCzJ1VbKjMX5LzcTvvf9HuXR gPHJNKdgQU5hB+ZyK23zHztFL6w81c5zQp6m6P9TMfB3PtPWFCczVQtB9N4U2rp2HOA44NMz4y8A AAD//wMAUEsDBBQABgAIAAAAIQCMmWRtygAAAOIAAAAPAAAAZHJzL2Rvd25yZXYueG1sRI/RTsJA FETfTfyHzTXxTbZULLWyEDSaAE9a+IBr99pt6N6t3RXK37MkJjxOZuZMZrYYbCsO1PvGsYLxKAFB XDndcK1gt/14yEH4gKyxdUwKTuRhMb+9mWGh3ZG/6FCGWkQI+wIVmBC6QkpfGbLoR64jjt6P6y2G KPta6h6PEW5bmSZJJi02HBcMdvRmqNqXf1bB58RR+p7617K2z2b43m7Wv5gpdX83LF9ABBrCNfzf XmkF+VOWjyfT5BEul+IdkPMzAAAA//8DAFBLAQItABQABgAIAAAAIQDb4fbL7gAAAIUBAAATAAAA AAAAAAAAAAAAAAAAAABbQ29udGVudF9UeXBlc10ueG1sUEsBAi0AFAAGAAgAAAAhAFr0LFu/AAAA FQEAAAsAAAAAAAAAAAAAAAAAHwEAAF9yZWxzLy5yZWxzUEsBAi0AFAAGAAgAAAAhAIyZZG3KAAAA 4gAAAA8AAAAAAAAAAAAAAAAABwIAAGRycy9kb3ducmV2LnhtbFBLBQYAAAAAAwADALcAAAD+AgAA AAA= " filled="f" stroked="f">
                         <v:textbox inset="2.53958mm,2.53958mm,2.53958mm,2.53958mm">
                           <w:txbxContent>
                             <w:p>
@@ -371,8 +371,8 @@
                           </w:txbxContent>
                         </v:textbox>
                       </v:rect>
-                      <v:group id="Group 604908943" o:spid="_x0000_s1033" style="position:absolute;left:19352;top:36174;width:68215;height:3251" coordorigin="3300,30964" coordsize="91684,4227" o:gfxdata="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">
-                        <v:rect id="Rectangle 2086289045" o:spid="_x0000_s1034" style="position:absolute;left:3300;top:30964;width:91684;height:4227;visibility:visible;mso-wrap-style:square;v-text-anchor:middle" o:gfxdata="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" filled="f" stroked="f">
+                      <v:group id="Group 604908943" o:spid="_x0000_s1033" style="position:absolute;left:19352;top:36174;width:68215;height:3251" coordorigin="3300,30964" coordsize="91684,4227" o:gfxdata="UEsDBBQABgAIAAAAIQDb4fbL7gAAAIUBAAATAAAAW0NvbnRlbnRfVHlwZXNdLnhtbHyQz07DMAyH 70i8Q+QralM4IITa7kDhCAiNB7ASt43WOlEcyvb2pNu4IODoPz9/n1xv9vOkForiPDdwXVagiI23 jocG3rdPxR0oScgWJ8/UwIEENu3lRb09BBKV0ywNjCmFe63FjDSjlD4Q50nv44wpl3HQAc0OB9I3 VXWrjedEnIq03oC27qjHjympx31un0wiTQLq4bS4shrAECZnMGVTvbD9QSnOhDInjzsyuiBXWQP0 r4R18jfgnHvJr4nOknrFmJ5xzhraRtHWf3Kkpfz/yGo5S+H73hkquyhdjr3R8m2lj09svwAAAP// AwBQSwMEFAAGAAgAAAAhAFr0LFu/AAAAFQEAAAsAAABfcmVscy8ucmVsc2zPwWrDMAwG4Ptg72B0 X5TuUMaI01uh19I+gLGVxCy2jGSy9e1nemrHjpL4P0nD4SetZiPRyNnCruvBUPYcYp4tXC/Htw8w Wl0ObuVMFm6kcBhfX4Yzra62kC6xqGlKVgtLreUTUf1CyWnHhXKbTCzJ1VbKjMX5LzcTvvf9HuXR gPHJNKdgQU5hB+ZyK23zHztFL6w81c5zQp6m6P9TMfB3PtPWFCczVQtB9N4U2rp2HOA44NMz4y8A AAD//wMAUEsDBBQABgAIAAAAIQCg3k5wywAAAOIAAAAPAAAAZHJzL2Rvd25yZXYueG1sRI9Ba8JA FITvQv/D8oTedDfVikZXEWmLBylUC+LtkX0mwezbkN0m8d93hUKPw8x8w6w2va1ES40vHWtIxgoE ceZMybmG79P7aA7CB2SDlWPScCcPm/XTYIWpcR1/UXsMuYgQ9ilqKEKoUyl9VpBFP3Y1cfSurrEY omxyaRrsItxW8kWpmbRYclwosKZdQdnt+GM1fHTYbSfJW3u4XXf3y+n183xISOvnYb9dggjUh//w X3tvNMzUdKHmi+kEHpfiHZDrXwAAAP//AwBQSwECLQAUAAYACAAAACEA2+H2y+4AAACFAQAAEwAA AAAAAAAAAAAAAAAAAAAAW0NvbnRlbnRfVHlwZXNdLnhtbFBLAQItABQABgAIAAAAIQBa9CxbvwAA ABUBAAALAAAAAAAAAAAAAAAAAB8BAABfcmVscy8ucmVsc1BLAQItABQABgAIAAAAIQCg3k5wywAA AOIAAAAPAAAAAAAAAAAAAAAAAAcCAABkcnMvZG93bnJldi54bWxQSwUGAAAAAAMAAwC3AAAA/wIA AAAA ">
+                        <v:rect id="Rectangle 2086289045" o:spid="_x0000_s1034" style="position:absolute;left:3300;top:30964;width:91684;height:4227;visibility:visible;mso-wrap-style:square;v-text-anchor:middle" o:gfxdata="UEsDBBQABgAIAAAAIQDb4fbL7gAAAIUBAAATAAAAW0NvbnRlbnRfVHlwZXNdLnhtbHyQz07DMAyH 70i8Q+QralM4IITa7kDhCAiNB7ASt43WOlEcyvb2pNu4IODoPz9/n1xv9vOkForiPDdwXVagiI23 jocG3rdPxR0oScgWJ8/UwIEENu3lRb09BBKV0ywNjCmFe63FjDSjlD4Q50nv44wpl3HQAc0OB9I3 VXWrjedEnIq03oC27qjHjympx31un0wiTQLq4bS4shrAECZnMGVTvbD9QSnOhDInjzsyuiBXWQP0 r4R18jfgnHvJr4nOknrFmJ5xzhraRtHWf3Kkpfz/yGo5S+H73hkquyhdjr3R8m2lj09svwAAAP// AwBQSwMEFAAGAAgAAAAhAFr0LFu/AAAAFQEAAAsAAABfcmVscy8ucmVsc2zPwWrDMAwG4Ptg72B0 X5TuUMaI01uh19I+gLGVxCy2jGSy9e1nemrHjpL4P0nD4SetZiPRyNnCruvBUPYcYp4tXC/Htw8w Wl0ObuVMFm6kcBhfX4Yzra62kC6xqGlKVgtLreUTUf1CyWnHhXKbTCzJ1VbKjMX5LzcTvvf9HuXR gPHJNKdgQU5hB+ZyK23zHztFL6w81c5zQp6m6P9TMfB3PtPWFCczVQtB9N4U2rp2HOA44NMz4y8A AAD//wMAUEsDBBQABgAIAAAAIQBbDq/9yQAAAOMAAAAPAAAAZHJzL2Rvd25yZXYueG1sRI/BTsMw EETvSP0HaytxozZWidJQt2oRSMAJUj5giZc4Il6H2LTh7zESUo+jmXmjWW8n34sjjbELbOB6oUAQ N8F23Bp4OzxclSBiQrbYByYDPxRhu5ldrLGy4cSvdKxTKzKEY4UGXEpDJWVsHHmMizAQZ+8jjB5T lmMr7YinDPe91EoV0mPHecHhQHeOms/62xt4WQbS9zru69av3PR+eH76wsKYy/m0uwWRaErn8H/7 0RrQqix0uVLLG/j7lP+A3PwCAAD//wMAUEsBAi0AFAAGAAgAAAAhANvh9svuAAAAhQEAABMAAAAA AAAAAAAAAAAAAAAAAFtDb250ZW50X1R5cGVzXS54bWxQSwECLQAUAAYACAAAACEAWvQsW78AAAAV AQAACwAAAAAAAAAAAAAAAAAfAQAAX3JlbHMvLnJlbHNQSwECLQAUAAYACAAAACEAWw6v/ckAAADj AAAADwAAAAAAAAAAAAAAAAAHAgAAZHJzL2Rvd25yZXYueG1sUEsFBgAAAAADAAMAtwAAAP0CAAAA AA== " filled="f" stroked="f">
                           <v:textbox inset="2.53958mm,2.53958mm,2.53958mm,2.53958mm">
                             <w:txbxContent>
                               <w:p>
@@ -384,7 +384,7 @@
                             </w:txbxContent>
                           </v:textbox>
                         </v:rect>
-                        <v:oval id="Oval 706997983" o:spid="_x0000_s1035" style="position:absolute;left:90757;top:30964;width:4227;height:4227;visibility:visible;mso-wrap-style:square;v-text-anchor:middle" o:gfxdata="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" fillcolor="#f4a11e" stroked="f">
+                        <v:oval id="Oval 706997983" o:spid="_x0000_s1035" style="position:absolute;left:90757;top:30964;width:4227;height:4227;visibility:visible;mso-wrap-style:square;v-text-anchor:middle" o:gfxdata="UEsDBBQABgAIAAAAIQDb4fbL7gAAAIUBAAATAAAAW0NvbnRlbnRfVHlwZXNdLnhtbHyQz07DMAyH 70i8Q+QralM4IITa7kDhCAiNB7ASt43WOlEcyvb2pNu4IODoPz9/n1xv9vOkForiPDdwXVagiI23 jocG3rdPxR0oScgWJ8/UwIEENu3lRb09BBKV0ywNjCmFe63FjDSjlD4Q50nv44wpl3HQAc0OB9I3 VXWrjedEnIq03oC27qjHjympx31un0wiTQLq4bS4shrAECZnMGVTvbD9QSnOhDInjzsyuiBXWQP0 r4R18jfgnHvJr4nOknrFmJ5xzhraRtHWf3Kkpfz/yGo5S+H73hkquyhdjr3R8m2lj09svwAAAP// AwBQSwMEFAAGAAgAAAAhAFr0LFu/AAAAFQEAAAsAAABfcmVscy8ucmVsc2zPwWrDMAwG4Ptg72B0 X5TuUMaI01uh19I+gLGVxCy2jGSy9e1nemrHjpL4P0nD4SetZiPRyNnCruvBUPYcYp4tXC/Htw8w Wl0ObuVMFm6kcBhfX4Yzra62kC6xqGlKVgtLreUTUf1CyWnHhXKbTCzJ1VbKjMX5LzcTvvf9HuXR gPHJNKdgQU5hB+ZyK23zHztFL6w81c5zQp6m6P9TMfB3PtPWFCczVQtB9N4U2rp2HOA44NMz4y8A AAD//wMAUEsDBBQABgAIAAAAIQAQt/XMygAAAOIAAAAPAAAAZHJzL2Rvd25yZXYueG1sRI9RS8NA EITfBf/DsQVfxG5USJu01yJCQKmIxvZ9yW2T0NxezF3b9N97guDjMDPfMMv1aDt14sG3TjTcTxNQ LJUzrdQatl/F3RyUDySGOies4cIe1qvrqyXlxp3lk09lqFWEiM9JQxNCnyP6qmFLfup6lujt3WAp RDnUaAY6R7jt8CFJUrTUSlxoqOfnhqtDebQa8PaV8aMvsfje4O6Yvu3e6VBofTMZnxagAo/hP/zX fjEaZkmaZbNs/gi/l+IdwNUPAAAA//8DAFBLAQItABQABgAIAAAAIQDb4fbL7gAAAIUBAAATAAAA AAAAAAAAAAAAAAAAAABbQ29udGVudF9UeXBlc10ueG1sUEsBAi0AFAAGAAgAAAAhAFr0LFu/AAAA FQEAAAsAAAAAAAAAAAAAAAAAHwEAAF9yZWxzLy5yZWxzUEsBAi0AFAAGAAgAAAAhABC39czKAAAA 4gAAAA8AAAAAAAAAAAAAAAAABwIAAGRycy9kb3ducmV2LnhtbFBLBQYAAAAAAwADALcAAAD+AgAA AAA= " fillcolor="#f4a11e" stroked="f">
                           <v:textbox inset="2.53958mm,2.53958mm,2.53958mm,2.53958mm">
                             <w:txbxContent>
                               <w:p>
@@ -396,7 +396,7 @@
                             </w:txbxContent>
                           </v:textbox>
                         </v:oval>
-                        <v:oval id="Oval 545276882" o:spid="_x0000_s1036" style="position:absolute;left:3300;top:30964;width:4227;height:4227;visibility:visible;mso-wrap-style:square;v-text-anchor:middle" o:gfxdata="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" fillcolor="#f4a11e" stroked="f">
+                        <v:oval id="Oval 545276882" o:spid="_x0000_s1036" style="position:absolute;left:3300;top:30964;width:4227;height:4227;visibility:visible;mso-wrap-style:square;v-text-anchor:middle" o:gfxdata="UEsDBBQABgAIAAAAIQDb4fbL7gAAAIUBAAATAAAAW0NvbnRlbnRfVHlwZXNdLnhtbHyQz07DMAyH 70i8Q+QralM4IITa7kDhCAiNB7ASt43WOlEcyvb2pNu4IODoPz9/n1xv9vOkForiPDdwXVagiI23 jocG3rdPxR0oScgWJ8/UwIEENu3lRb09BBKV0ywNjCmFe63FjDSjlD4Q50nv44wpl3HQAc0OB9I3 VXWrjedEnIq03oC27qjHjympx31un0wiTQLq4bS4shrAECZnMGVTvbD9QSnOhDInjzsyuiBXWQP0 r4R18jfgnHvJr4nOknrFmJ5xzhraRtHWf3Kkpfz/yGo5S+H73hkquyhdjr3R8m2lj09svwAAAP// AwBQSwMEFAAGAAgAAAAhAFr0LFu/AAAAFQEAAAsAAABfcmVscy8ucmVsc2zPwWrDMAwG4Ptg72B0 X5TuUMaI01uh19I+gLGVxCy2jGSy9e1nemrHjpL4P0nD4SetZiPRyNnCruvBUPYcYp4tXC/Htw8w Wl0ObuVMFm6kcBhfX4Yzra62kC6xqGlKVgtLreUTUf1CyWnHhXKbTCzJ1VbKjMX5LzcTvvf9HuXR gPHJNKdgQU5hB+ZyK23zHztFL6w81c5zQp6m6P9TMfB3PtPWFCczVQtB9N4U2rp2HOA44NMz4y8A AAD//wMAUEsDBBQABgAIAAAAIQBchYwvyQAAAOIAAAAPAAAAZHJzL2Rvd25yZXYueG1sRI9RS8NA EITfBf/DsYIvYjcNNobYaylCQKmIRvu+5NYkNLcXc9c2/feeIPg4zMw3zHI92V4defSdEw3zWQKK pXamk0bD50d5m4PygcRQ74Q1nNnDenV5saTCuJO887EKjYoQ8QVpaEMYCkRft2zJz9zAEr0vN1oK UY4NmpFOEW57TJMkQ0udxIWWBn5sud5XB6sBb54Z34YKy+8t7g7Zy+6V9qXW11fT5gFU4Cn8h//a T0bD4m6R3md5nsLvpXgHcPUDAAD//wMAUEsBAi0AFAAGAAgAAAAhANvh9svuAAAAhQEAABMAAAAA AAAAAAAAAAAAAAAAAFtDb250ZW50X1R5cGVzXS54bWxQSwECLQAUAAYACAAAACEAWvQsW78AAAAV AQAACwAAAAAAAAAAAAAAAAAfAQAAX3JlbHMvLnJlbHNQSwECLQAUAAYACAAAACEAXIWML8kAAADi AAAADwAAAAAAAAAAAAAAAAAHAgAAZHJzL2Rvd25yZXYueG1sUEsFBgAAAAADAAMAtwAAAP0CAAAA AA== " fillcolor="#f4a11e" stroked="f">
                           <v:textbox inset="2.53958mm,2.53958mm,2.53958mm,2.53958mm">
                             <w:txbxContent>
                               <w:p>
@@ -408,7 +408,7 @@
                             </w:txbxContent>
                           </v:textbox>
                         </v:oval>
-                        <v:rect id="Rectangle 750380193" o:spid="_x0000_s1037" style="position:absolute;left:5402;top:30964;width:87450;height:4227;visibility:visible;mso-wrap-style:square;v-text-anchor:middle" o:gfxdata="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" fillcolor="#f4a11e" stroked="f">
+                        <v:rect id="Rectangle 750380193" o:spid="_x0000_s1037" style="position:absolute;left:5402;top:30964;width:87450;height:4227;visibility:visible;mso-wrap-style:square;v-text-anchor:middle" o:gfxdata="UEsDBBQABgAIAAAAIQDb4fbL7gAAAIUBAAATAAAAW0NvbnRlbnRfVHlwZXNdLnhtbHyQz07DMAyH 70i8Q+QralM4IITa7kDhCAiNB7ASt43WOlEcyvb2pNu4IODoPz9/n1xv9vOkForiPDdwXVagiI23 jocG3rdPxR0oScgWJ8/UwIEENu3lRb09BBKV0ywNjCmFe63FjDSjlD4Q50nv44wpl3HQAc0OB9I3 VXWrjedEnIq03oC27qjHjympx31un0wiTQLq4bS4shrAECZnMGVTvbD9QSnOhDInjzsyuiBXWQP0 r4R18jfgnHvJr4nOknrFmJ5xzhraRtHWf3Kkpfz/yGo5S+H73hkquyhdjr3R8m2lj09svwAAAP// AwBQSwMEFAAGAAgAAAAhAFr0LFu/AAAAFQEAAAsAAABfcmVscy8ucmVsc2zPwWrDMAwG4Ptg72B0 X5TuUMaI01uh19I+gLGVxCy2jGSy9e1nemrHjpL4P0nD4SetZiPRyNnCruvBUPYcYp4tXC/Htw8w Wl0ObuVMFm6kcBhfX4Yzra62kC6xqGlKVgtLreUTUf1CyWnHhXKbTCzJ1VbKjMX5LzcTvvf9HuXR gPHJNKdgQU5hB+ZyK23zHztFL6w81c5zQp6m6P9TMfB3PtPWFCczVQtB9N4U2rp2HOA44NMz4y8A AAD//wMAUEsDBBQABgAIAAAAIQB5BibbzAAAAOIAAAAPAAAAZHJzL2Rvd25yZXYueG1sRI9BS8NA FITvhf6H5Qne2t0mtbax21IKQg8eNOrB2yP7TKLZt2l2k6b/3hUEj8PMfMNs96NtxECdrx1rWMwV COLCmZpLDW+vj7M1CB+QDTaOScOVPOx308kWM+Mu/EJDHkoRIewz1FCF0GZS+qIii37uWuLofbrO YoiyK6Xp8BLhtpGJUitpsea4UGFLx4qK77y3GjZDnXyc08au3sdl8pU/9eb63Gt9ezMeHkAEGsN/ +K99Mhru71S6VotNCr+X4h2Qux8AAAD//wMAUEsBAi0AFAAGAAgAAAAhANvh9svuAAAAhQEAABMA AAAAAAAAAAAAAAAAAAAAAFtDb250ZW50X1R5cGVzXS54bWxQSwECLQAUAAYACAAAACEAWvQsW78A AAAVAQAACwAAAAAAAAAAAAAAAAAfAQAAX3JlbHMvLnJlbHNQSwECLQAUAAYACAAAACEAeQYm28wA AADiAAAADwAAAAAAAAAAAAAAAAAHAgAAZHJzL2Rvd25yZXYueG1sUEsFBgAAAAADAAMAtwAAAAAD AAAAAA== " fillcolor="#f4a11e" stroked="f">
                           <v:textbox inset="2.53958mm,2.53958mm,2.53958mm,2.53958mm">
                             <w:txbxContent>
                               <w:p>
@@ -1013,39 +1013,7 @@
           <w:sz w:val="20"/>
           <w:szCs w:val="20"/>
         </w:rPr>
-        <w:t>I _____</w:t>
-      </w:r>
-      <w:r>
-        <w:rPr>
-          <w:b/>
-          <w:sz w:val="20"/>
-          <w:szCs w:val="20"/>
-        </w:rPr>
-        <w:t xml:space="preserve"> </w:t>
-      </w:r>
-      <w:r>
-        <w:rPr>
-          <w:b/>
-          <w:sz w:val="20"/>
-          <w:szCs w:val="20"/>
-        </w:rPr>
-        <w:t>Graeme Wright</w:t>
-      </w:r>
-      <w:r>
-        <w:rPr>
-          <w:b/>
-          <w:sz w:val="20"/>
-          <w:szCs w:val="20"/>
-        </w:rPr>
-        <w:t xml:space="preserve"> </w:t>
-      </w:r>
-      <w:r>
-        <w:rPr>
-          <w:b/>
-          <w:sz w:val="20"/>
-          <w:szCs w:val="20"/>
-        </w:rPr>
-        <w:t xml:space="preserve">_____ confirm that the work submitted is my own and that I am the sole author of this completed assessment and Sections 1 &amp; 2 of this form have been checked and completed before submission. I have referenced/acknowledged any sources of information and Artificial Intelligence (AI) tools used in the submission; in line with the Qualification Handbook, </w:t>
+        <w:t xml:space="preserve">I _____ Graeme Wright _____ confirm that the work submitted is my own and that I am the sole author of this completed assessment and Sections 1 &amp; 2 of this form have been checked and completed before submission. I have referenced/acknowledged any sources of information and Artificial Intelligence (AI) tools used in the submission; in line with the Qualification Handbook, </w:t>
       </w:r>
       <w:hyperlink r:id="rId9">
         <w:r>
@@ -1408,39 +1376,7 @@
                 <w:sz w:val="20"/>
                 <w:szCs w:val="20"/>
               </w:rPr>
-              <w:t xml:space="preserve">The Assessment Criteria (AC) have been used as </w:t>
-            </w:r>
-            <w:proofErr w:type="gramStart"/>
-            <w:r>
-              <w:rPr>
-                <w:sz w:val="20"/>
-                <w:szCs w:val="20"/>
-              </w:rPr>
-              <w:t>headings</w:t>
-            </w:r>
-            <w:proofErr w:type="gramEnd"/>
-            <w:r>
-              <w:rPr>
-                <w:sz w:val="20"/>
-                <w:szCs w:val="20"/>
-              </w:rPr>
-              <w:t xml:space="preserve"> or I have indicated or sign-posted within my work where each </w:t>
-            </w:r>
-            <w:proofErr w:type="gramStart"/>
-            <w:r>
-              <w:rPr>
-                <w:sz w:val="20"/>
-                <w:szCs w:val="20"/>
-              </w:rPr>
-              <w:t>AC  has</w:t>
-            </w:r>
-            <w:proofErr w:type="gramEnd"/>
-            <w:r>
-              <w:rPr>
-                <w:sz w:val="20"/>
-                <w:szCs w:val="20"/>
-              </w:rPr>
-              <w:t xml:space="preserve"> been met.</w:t>
+              <w:t xml:space="preserve">The Assessment Criteria (AC) have been used as headings or I have indicated or sign-posted within my work where each AC  has been met.</w:t>
             </w:r>
           </w:p>
         </w:tc>
@@ -1465,7 +1401,7 @@
                 <wp:inline distT="0" distB="0" distL="0" distR="0" wp14:anchorId="5976E0BB" wp14:editId="409856B3">
                   <wp:extent cx="666750" cy="304800"/>
                   <wp:effectExtent l="0" t="0" r="0" b="0"/>
-                  <wp:docPr id="1152279246" name="Picture 90" descr="A black background with a black square&#10;&#10;AI-generated content may be incorrect."/>
+                  <wp:docPr id="1152279246" name="Picture 90" descr="A black background with a black square  AI-generated content may be incorrect."/>
                   <wp:cNvGraphicFramePr>
                     <a:graphicFrameLocks xmlns:a="http://schemas.openxmlformats.org/drawingml/2006/main" noChangeAspect="1"/>
                   </wp:cNvGraphicFramePr>
@@ -1473,7 +1409,7 @@
                     <a:graphicData uri="http://schemas.openxmlformats.org/drawingml/2006/picture">
                       <pic:pic xmlns:pic="http://schemas.openxmlformats.org/drawingml/2006/picture">
                         <pic:nvPicPr>
-                          <pic:cNvPr id="0" name="Picture 3" descr="A black background with a black square&#10;&#10;AI-generated content may be incorrect."/>
+                          <pic:cNvPr id="0" name="Picture 3" descr="A black background with a black square  AI-generated content may be incorrect."/>
                           <pic:cNvPicPr>
                             <a:picLocks noChangeAspect="1" noChangeArrowheads="1"/>
                           </pic:cNvPicPr>
@@ -1560,7 +1496,7 @@
                 <wp:inline distT="0" distB="0" distL="0" distR="0" wp14:anchorId="487A9E15" wp14:editId="230F71E8">
                   <wp:extent cx="666750" cy="304800"/>
                   <wp:effectExtent l="0" t="0" r="0" b="0"/>
-                  <wp:docPr id="1392413371" name="Picture 90" descr="A black background with a black square&#10;&#10;AI-generated content may be incorrect."/>
+                  <wp:docPr id="1392413371" name="Picture 90" descr="A black background with a black square  AI-generated content may be incorrect."/>
                   <wp:cNvGraphicFramePr>
                     <a:graphicFrameLocks xmlns:a="http://schemas.openxmlformats.org/drawingml/2006/main" noChangeAspect="1"/>
                   </wp:cNvGraphicFramePr>
@@ -1568,7 +1504,7 @@
                     <a:graphicData uri="http://schemas.openxmlformats.org/drawingml/2006/picture">
                       <pic:pic xmlns:pic="http://schemas.openxmlformats.org/drawingml/2006/picture">
                         <pic:nvPicPr>
-                          <pic:cNvPr id="0" name="Picture 3" descr="A black background with a black square&#10;&#10;AI-generated content may be incorrect."/>
+                          <pic:cNvPr id="0" name="Picture 3" descr="A black background with a black square  AI-generated content may be incorrect."/>
                           <pic:cNvPicPr>
                             <a:picLocks noChangeAspect="1" noChangeArrowheads="1"/>
                           </pic:cNvPicPr>
@@ -1652,7 +1588,7 @@
                 <wp:inline distT="0" distB="0" distL="0" distR="0" wp14:anchorId="16983E8B" wp14:editId="69A406DA">
                   <wp:extent cx="666750" cy="304800"/>
                   <wp:effectExtent l="0" t="0" r="0" b="0"/>
-                  <wp:docPr id="883343186" name="Picture 90" descr="A black background with a black square&#10;&#10;AI-generated content may be incorrect."/>
+                  <wp:docPr id="883343186" name="Picture 90" descr="A black background with a black square  AI-generated content may be incorrect."/>
                   <wp:cNvGraphicFramePr>
                     <a:graphicFrameLocks xmlns:a="http://schemas.openxmlformats.org/drawingml/2006/main" noChangeAspect="1"/>
                   </wp:cNvGraphicFramePr>
@@ -1660,7 +1596,7 @@
                     <a:graphicData uri="http://schemas.openxmlformats.org/drawingml/2006/picture">
                       <pic:pic xmlns:pic="http://schemas.openxmlformats.org/drawingml/2006/picture">
                         <pic:nvPicPr>
-                          <pic:cNvPr id="0" name="Picture 3" descr="A black background with a black square&#10;&#10;AI-generated content may be incorrect."/>
+                          <pic:cNvPr id="0" name="Picture 3" descr="A black background with a black square  AI-generated content may be incorrect."/>
                           <pic:cNvPicPr>
                             <a:picLocks noChangeAspect="1" noChangeArrowheads="1"/>
                           </pic:cNvPicPr>
@@ -1747,7 +1683,7 @@
                 <wp:inline distT="0" distB="0" distL="0" distR="0" wp14:anchorId="3062A8FE" wp14:editId="53F9D830">
                   <wp:extent cx="666750" cy="304800"/>
                   <wp:effectExtent l="0" t="0" r="0" b="0"/>
-                  <wp:docPr id="310960056" name="Picture 90" descr="A black background with a black square&#10;&#10;AI-generated content may be incorrect."/>
+                  <wp:docPr id="310960056" name="Picture 90" descr="A black background with a black square  AI-generated content may be incorrect."/>
                   <wp:cNvGraphicFramePr>
                     <a:graphicFrameLocks xmlns:a="http://schemas.openxmlformats.org/drawingml/2006/main" noChangeAspect="1"/>
                   </wp:cNvGraphicFramePr>
@@ -1755,7 +1691,7 @@
                     <a:graphicData uri="http://schemas.openxmlformats.org/drawingml/2006/picture">
                       <pic:pic xmlns:pic="http://schemas.openxmlformats.org/drawingml/2006/picture">
                         <pic:nvPicPr>
-                          <pic:cNvPr id="0" name="Picture 3" descr="A black background with a black square&#10;&#10;AI-generated content may be incorrect."/>
+                          <pic:cNvPr id="0" name="Picture 3" descr="A black background with a black square  AI-generated content may be incorrect."/>
                           <pic:cNvPicPr>
                             <a:picLocks noChangeAspect="1" noChangeArrowheads="1"/>
                           </pic:cNvPicPr>
@@ -1854,7 +1790,7 @@
                 <wp:inline distT="0" distB="0" distL="0" distR="0" wp14:anchorId="714C9959" wp14:editId="22A3EE29">
                   <wp:extent cx="666750" cy="304800"/>
                   <wp:effectExtent l="0" t="0" r="0" b="0"/>
-                  <wp:docPr id="1236554316" name="Picture 90" descr="A black background with a black square&#10;&#10;AI-generated content may be incorrect."/>
+                  <wp:docPr id="1236554316" name="Picture 90" descr="A black background with a black square  AI-generated content may be incorrect."/>
                   <wp:cNvGraphicFramePr>
                     <a:graphicFrameLocks xmlns:a="http://schemas.openxmlformats.org/drawingml/2006/main" noChangeAspect="1"/>
                   </wp:cNvGraphicFramePr>
@@ -1862,7 +1798,7 @@
                     <a:graphicData uri="http://schemas.openxmlformats.org/drawingml/2006/picture">
                       <pic:pic xmlns:pic="http://schemas.openxmlformats.org/drawingml/2006/picture">
                         <pic:nvPicPr>
-                          <pic:cNvPr id="0" name="Picture 3" descr="A black background with a black square&#10;&#10;AI-generated content may be incorrect."/>
+                          <pic:cNvPr id="0" name="Picture 3" descr="A black background with a black square  AI-generated content may be incorrect."/>
                           <pic:cNvPicPr>
                             <a:picLocks noChangeAspect="1" noChangeArrowheads="1"/>
                           </pic:cNvPicPr>
@@ -1949,7 +1885,7 @@
                 <wp:inline distT="0" distB="0" distL="0" distR="0" wp14:anchorId="6A51425A" wp14:editId="4A6B6ECE">
                   <wp:extent cx="666750" cy="304800"/>
                   <wp:effectExtent l="0" t="0" r="0" b="0"/>
-                  <wp:docPr id="2025371939" name="Picture 90" descr="A black background with a black square&#10;&#10;AI-generated content may be incorrect."/>
+                  <wp:docPr id="2025371939" name="Picture 90" descr="A black background with a black square  AI-generated content may be incorrect."/>
                   <wp:cNvGraphicFramePr>
                     <a:graphicFrameLocks xmlns:a="http://schemas.openxmlformats.org/drawingml/2006/main" noChangeAspect="1"/>
                   </wp:cNvGraphicFramePr>
@@ -1957,7 +1893,7 @@
                     <a:graphicData uri="http://schemas.openxmlformats.org/drawingml/2006/picture">
                       <pic:pic xmlns:pic="http://schemas.openxmlformats.org/drawingml/2006/picture">
                         <pic:nvPicPr>
-                          <pic:cNvPr id="0" name="Picture 3" descr="A black background with a black square&#10;&#10;AI-generated content may be incorrect."/>
+                          <pic:cNvPr id="0" name="Picture 3" descr="A black background with a black square  AI-generated content may be incorrect."/>
                           <pic:cNvPicPr>
                             <a:picLocks noChangeAspect="1" noChangeArrowheads="1"/>
                           </pic:cNvPicPr>
@@ -2045,7 +1981,7 @@
                 <wp:inline distT="0" distB="0" distL="0" distR="0" wp14:anchorId="50B7A8E8" wp14:editId="30D7AFA3">
                   <wp:extent cx="666750" cy="304800"/>
                   <wp:effectExtent l="0" t="0" r="0" b="0"/>
-                  <wp:docPr id="1012798279" name="Picture 90" descr="A black background with a black square&#10;&#10;AI-generated content may be incorrect."/>
+                  <wp:docPr id="1012798279" name="Picture 90" descr="A black background with a black square  AI-generated content may be incorrect."/>
                   <wp:cNvGraphicFramePr>
                     <a:graphicFrameLocks xmlns:a="http://schemas.openxmlformats.org/drawingml/2006/main" noChangeAspect="1"/>
                   </wp:cNvGraphicFramePr>
@@ -2053,7 +1989,7 @@
                     <a:graphicData uri="http://schemas.openxmlformats.org/drawingml/2006/picture">
                       <pic:pic xmlns:pic="http://schemas.openxmlformats.org/drawingml/2006/picture">
                         <pic:nvPicPr>
-                          <pic:cNvPr id="0" name="Picture 3" descr="A black background with a black square&#10;&#10;AI-generated content may be incorrect."/>
+                          <pic:cNvPr id="0" name="Picture 3" descr="A black background with a black square  AI-generated content may be incorrect."/>
                           <pic:cNvPicPr>
                             <a:picLocks noChangeAspect="1" noChangeArrowheads="1"/>
                           </pic:cNvPicPr>
@@ -2140,7 +2076,7 @@
                 <wp:inline distT="0" distB="0" distL="0" distR="0" wp14:anchorId="31B1663F" wp14:editId="7DAC4A30">
                   <wp:extent cx="666750" cy="304800"/>
                   <wp:effectExtent l="0" t="0" r="0" b="0"/>
-                  <wp:docPr id="1150737927" name="Picture 90" descr="A black background with a black square&#10;&#10;AI-generated content may be incorrect."/>
+                  <wp:docPr id="1150737927" name="Picture 90" descr="A black background with a black square  AI-generated content may be incorrect."/>
                   <wp:cNvGraphicFramePr>
                     <a:graphicFrameLocks xmlns:a="http://schemas.openxmlformats.org/drawingml/2006/main" noChangeAspect="1"/>
                   </wp:cNvGraphicFramePr>
@@ -2148,7 +2084,7 @@
                     <a:graphicData uri="http://schemas.openxmlformats.org/drawingml/2006/picture">
                       <pic:pic xmlns:pic="http://schemas.openxmlformats.org/drawingml/2006/picture">
                         <pic:nvPicPr>
-                          <pic:cNvPr id="0" name="Picture 3" descr="A black background with a black square&#10;&#10;AI-generated content may be incorrect."/>
+                          <pic:cNvPr id="0" name="Picture 3" descr="A black background with a black square  AI-generated content may be incorrect."/>
                           <pic:cNvPicPr>
                             <a:picLocks noChangeAspect="1" noChangeArrowheads="1"/>
                           </pic:cNvPicPr>
@@ -2304,7 +2240,7 @@
                 <wp:inline distT="0" distB="0" distL="0" distR="0" wp14:anchorId="2D5CD4A2" wp14:editId="5D5623A4">
                   <wp:extent cx="666750" cy="304800"/>
                   <wp:effectExtent l="0" t="0" r="0" b="0"/>
-                  <wp:docPr id="82394062" name="Picture 90" descr="A black background with a black square&#10;&#10;AI-generated content may be incorrect."/>
+                  <wp:docPr id="82394062" name="Picture 90" descr="A black background with a black square  AI-generated content may be incorrect."/>
                   <wp:cNvGraphicFramePr>
                     <a:graphicFrameLocks xmlns:a="http://schemas.openxmlformats.org/drawingml/2006/main" noChangeAspect="1"/>
                   </wp:cNvGraphicFramePr>
@@ -2312,7 +2248,7 @@
                     <a:graphicData uri="http://schemas.openxmlformats.org/drawingml/2006/picture">
                       <pic:pic xmlns:pic="http://schemas.openxmlformats.org/drawingml/2006/picture">
                         <pic:nvPicPr>
-                          <pic:cNvPr id="0" name="Picture 3" descr="A black background with a black square&#10;&#10;AI-generated content may be incorrect."/>
+                          <pic:cNvPr id="0" name="Picture 3" descr="A black background with a black square  AI-generated content may be incorrect."/>
                           <pic:cNvPicPr>
                             <a:picLocks noChangeAspect="1" noChangeArrowheads="1"/>
                           </pic:cNvPicPr>
@@ -3037,9 +2973,9 @@
           </mc:Choice>
           <mc:Fallback>
             <w:pict>
-              <v:group w14:anchorId="0431C203" id="Group 1" o:spid="_x0000_s1038" style="width:537.1pt;height:26.95pt;mso-position-horizontal-relative:char;mso-position-vertical-relative:line" coordorigin="19352,36089" coordsize="68214,3420" o:gfxdata="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">
-                <v:group id="Group 836533199" o:spid="_x0000_s1039" style="position:absolute;left:19352;top:36089;width:68215;height:3421" coordorigin="19352,36089" coordsize="68214,3420" o:gfxdata="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">
-                  <v:rect id="Rectangle 2097776138" o:spid="_x0000_s1040" style="position:absolute;left:19352;top:36089;width:68215;height:3421;visibility:visible;mso-wrap-style:square;v-text-anchor:middle" o:gfxdata="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" filled="f" stroked="f">
+              <v:group w14:anchorId="0431C203" id="Group 1" o:spid="_x0000_s1038" style="width:537.1pt;height:26.95pt;mso-position-horizontal-relative:char;mso-position-vertical-relative:line" coordorigin="19352,36089" coordsize="68214,3420" o:gfxdata="UEsDBBQABgAIAAAAIQC2gziS/gAAAOEBAAATAAAAW0NvbnRlbnRfVHlwZXNdLnhtbJSRQU7DMBBF 90jcwfIWJU67QAgl6YK0S0CoHGBkTxKLZGx5TGhvj5O2G0SRWNoz/78nu9wcxkFMGNg6quQqL6RA 0s5Y6ir5vt9lD1JwBDIwOMJKHpHlpr69KfdHjyxSmriSfYz+USnWPY7AufNIadK6MEJMx9ApD/oD OlTrorhX2lFEilmcO2RdNtjC5xDF9pCuTyYBB5bi6bQ4syoJ3g9WQ0ymaiLzg5KdCXlKLjvcW893 SUOqXwnz5DrgnHtJTxOsQfEKIT7DmDSUCaxw7Rqn8787ZsmRM9e2VmPeBN4uqYvTtW7jvijg9N/y JsXecLq0q+WD6m8AAAD//wMAUEsDBBQABgAIAAAAIQA4/SH/1gAAAJQBAAALAAAAX3JlbHMvLnJl bHOkkMFqwzAMhu+DvYPRfXGawxijTi+j0GvpHsDYimMaW0Yy2fr2M4PBMnrbUb/Q94l/f/hMi1qR JVI2sOt6UJgd+ZiDgffL8ekFlFSbvV0oo4EbChzGx4f9GRdb25HMsYhqlCwG5lrLq9biZkxWOiqY 22YiTra2kYMu1l1tQD30/bPm3wwYN0x18gb45AdQl1tp5j/sFB2T0FQ7R0nTNEV3j6o9feQzro1i OWA14Fm+Q8a1a8+Bvu/d/dMb2JY5uiPbhG/ktn4cqGU/er3pcvwCAAD//wMAUEsDBBQABgAIAAAA IQDRiMB83QMAAJgVAAAOAAAAZHJzL2Uyb0RvYy54bWzsWG1v2zYQ/j5g/4Hg98UiRb1QiFIUbRIM KNZg3X4ALUuyAEnUSCZ2/v2OlCzJadzWKebW7fLBEY8Udffwee5Ouny1bWr0kCtdyTbF5MLDKG8z uaraMsV//3XzW4yRNqJdiVq2eYofc41fXf36y+WmS3Iq17Je5QrBJq1ONl2K18Z0yWKhs3XeCH0h u7yFyUKqRhgYqnKxUmIDuzf1gnpeuNhIteqUzHKtwfq2n8RXbv+iyDPzvih0blCdYvDNuF/lfpf2 d3F1KZJSiW5dZYMb4gVeNKJq4aHjVm+FEeheVR9t1VSZkloW5iKTzUIWRZXlLgaIhnhPorlV8r5z sZTJpuxGmADaJzi9eNvsj4db1X3o7hQgselKwMKNbCzbQjX2P3iJtg6yxxGyfGtQBsYwpoQRhlEG cz6jHiU9ptkagLe3Ee4HNAowsgtCL+Zw7VDP1tfzTQI4nt0mcA1LFjsXFnuOjYPeYYjgTqFqleLY DwPfJ5xj1IoGyObwQ5N5CPGImJ3z3J+c5wNlvmn8IBU9sUF/HRs+rEWXO5LpZMKSejyKopD4oN8e zD9BS6It6xzN5hyi7r6RQjrRwKZn+HOQCHtYfoIGIumUNre5bJC9SLECl5zqxMM7bXrG7JZYB1p5 U9U12EVSt3sGoJa1ALF27tors11uHZMiSz9rWcrVI7BLd9lNBY98J7S5EwoyBMFoA1kjxfqfe6Fy jOrfWzgIThgFqpv5QM0Hy/lAtNlaQjLKjMKoH7wxLjn1zr6+N7KoXGCTM4PXwICZYJ9KgTHOaRzx aHd6vRQms4uvtAf+pfL/aaXgx4EfEx7THZaTEqapgS+A5w8lhPjchUAoCUIWMwY5fF4UZvbvQAok Yt5QWA5VRRpAu/PJqniKqkB8HjAS07HETlqg09zLxTAD4vmq8DEMp6sK/NzFEHihH/k+g+I118Jk /lopwPERVztFsnd8Y4NIAxKGFkaRjA2i73vw17dYHg9tAR0WXA/9ISdhzPyhP2SURt9eCYR5UUAI f04Js7ljlHAIhx2SDgXbXdgu+RkUTicE4hLR1JJ8x/3RKZIi5cwPvKk/eP8gakRH6zEc4MCqyDLd vizNxbAjwXDuX8yBvK6rTtv+XiQHumQt62plG2W7Rqty+aZWCEJI8Q17Tcj1UHT2lh3XThP3Tvg/ X/rXVBJAZx6FIR0bSkeYmfkYxnwua5wnYejZlNoTJBgSs8DzAhKNPezUdc3mjmFNwDwawcvhoTQT R/aRhyvu0bVmL3v8N0nGPxPOTF+z3Kv88MntM9fw+Q9W7H1fnI/d3dMH1at/AQAA//8DAFBLAwQU AAYACAAAACEAOG2GGd0AAAAFAQAADwAAAGRycy9kb3ducmV2LnhtbEyPQWvCQBCF70L/wzKF3uom WtuaZiMibU8iVAvF25gdk2B2NmTXJP77rr3Uy8DjPd77Jl0MphYdta6yrCAeRyCIc6srLhR87z4e X0E4j6yxtkwKLuRgkd2NUky07fmLuq0vRChhl6CC0vsmkdLlJRl0Y9sQB+9oW4M+yLaQusU+lJta TqLoWRqsOCyU2NCqpPy0PRsFnz32y2n83q1Px9Vlv5ttftYxKfVwPyzfQHga/H8YrvgBHbLAdLBn 1k7UCsIj/u9evejlaQLioGA2nYPMUnlLn/0CAAD//wMAUEsBAi0AFAAGAAgAAAAhALaDOJL+AAAA 4QEAABMAAAAAAAAAAAAAAAAAAAAAAFtDb250ZW50X1R5cGVzXS54bWxQSwECLQAUAAYACAAAACEA OP0h/9YAAACUAQAACwAAAAAAAAAAAAAAAAAvAQAAX3JlbHMvLnJlbHNQSwECLQAUAAYACAAAACEA 0YjAfN0DAACYFQAADgAAAAAAAAAAAAAAAAAuAgAAZHJzL2Uyb0RvYy54bWxQSwECLQAUAAYACAAA ACEAOG2GGd0AAAAFAQAADwAAAAAAAAAAAAAAAAA3BgAAZHJzL2Rvd25yZXYueG1sUEsFBgAAAAAE AAQA8wAAAEEHAAAAAA== ">
+                <v:group id="Group 836533199" o:spid="_x0000_s1039" style="position:absolute;left:19352;top:36089;width:68215;height:3421" coordorigin="19352,36089" coordsize="68214,3420" o:gfxdata="UEsDBBQABgAIAAAAIQDb4fbL7gAAAIUBAAATAAAAW0NvbnRlbnRfVHlwZXNdLnhtbHyQz07DMAyH 70i8Q+QralM4IITa7kDhCAiNB7ASt43WOlEcyvb2pNu4IODoPz9/n1xv9vOkForiPDdwXVagiI23 jocG3rdPxR0oScgWJ8/UwIEENu3lRb09BBKV0ywNjCmFe63FjDSjlD4Q50nv44wpl3HQAc0OB9I3 VXWrjedEnIq03oC27qjHjympx31un0wiTQLq4bS4shrAECZnMGVTvbD9QSnOhDInjzsyuiBXWQP0 r4R18jfgnHvJr4nOknrFmJ5xzhraRtHWf3Kkpfz/yGo5S+H73hkquyhdjr3R8m2lj09svwAAAP// AwBQSwMEFAAGAAgAAAAhAFr0LFu/AAAAFQEAAAsAAABfcmVscy8ucmVsc2zPwWrDMAwG4Ptg72B0 X5TuUMaI01uh19I+gLGVxCy2jGSy9e1nemrHjpL4P0nD4SetZiPRyNnCruvBUPYcYp4tXC/Htw8w Wl0ObuVMFm6kcBhfX4Yzra62kC6xqGlKVgtLreUTUf1CyWnHhXKbTCzJ1VbKjMX5LzcTvvf9HuXR gPHJNKdgQU5hB+ZyK23zHztFL6w81c5zQp6m6P9TMfB3PtPWFCczVQtB9N4U2rp2HOA44NMz4y8A AAD//wMAUEsDBBQABgAIAAAAIQCZlFIzygAAAOIAAAAPAAAAZHJzL2Rvd25yZXYueG1sRI9Ba8JA FITvQv/D8oTedJMGRaOriFjxIEK1UHp7ZJ9JMPs2ZNck/vtuQfA4zMw3zHLdm0q01LjSsoJ4HIEg zqwuOVfwffkczUA4j6yxskwKHuRgvXobLDHVtuMvas8+FwHCLkUFhfd1KqXLCjLoxrYmDt7VNgZ9 kE0udYNdgJtKfkTRVBosOSwUWNO2oOx2vhsF+w67TRLv2uPtun38Xiann2NMSr0P+80ChKfev8LP 9kErmCXTSZLE8zn8Xwp3QK7+AAAA//8DAFBLAQItABQABgAIAAAAIQDb4fbL7gAAAIUBAAATAAAA AAAAAAAAAAAAAAAAAABbQ29udGVudF9UeXBlc10ueG1sUEsBAi0AFAAGAAgAAAAhAFr0LFu/AAAA FQEAAAsAAAAAAAAAAAAAAAAAHwEAAF9yZWxzLy5yZWxzUEsBAi0AFAAGAAgAAAAhAJmUUjPKAAAA 4gAAAA8AAAAAAAAAAAAAAAAABwIAAGRycy9kb3ducmV2LnhtbFBLBQYAAAAAAwADALcAAAD+AgAA AAA= ">
+                  <v:rect id="Rectangle 2097776138" o:spid="_x0000_s1040" style="position:absolute;left:19352;top:36089;width:68215;height:3421;visibility:visible;mso-wrap-style:square;v-text-anchor:middle" o:gfxdata="UEsDBBQABgAIAAAAIQDb4fbL7gAAAIUBAAATAAAAW0NvbnRlbnRfVHlwZXNdLnhtbHyQz07DMAyH 70i8Q+QralM4IITa7kDhCAiNB7ASt43WOlEcyvb2pNu4IODoPz9/n1xv9vOkForiPDdwXVagiI23 jocG3rdPxR0oScgWJ8/UwIEENu3lRb09BBKV0ywNjCmFe63FjDSjlD4Q50nv44wpl3HQAc0OB9I3 VXWrjedEnIq03oC27qjHjympx31un0wiTQLq4bS4shrAECZnMGVTvbD9QSnOhDInjzsyuiBXWQP0 r4R18jfgnHvJr4nOknrFmJ5xzhraRtHWf3Kkpfz/yGo5S+H73hkquyhdjr3R8m2lj09svwAAAP// AwBQSwMEFAAGAAgAAAAhAFr0LFu/AAAAFQEAAAsAAABfcmVscy8ucmVsc2zPwWrDMAwG4Ptg72B0 X5TuUMaI01uh19I+gLGVxCy2jGSy9e1nemrHjpL4P0nD4SetZiPRyNnCruvBUPYcYp4tXC/Htw8w Wl0ObuVMFm6kcBhfX4Yzra62kC6xqGlKVgtLreUTUf1CyWnHhXKbTCzJ1VbKjMX5LzcTvvf9HuXR gPHJNKdgQU5hB+ZyK23zHztFL6w81c5zQp6m6P9TMfB3PtPWFCczVQtB9N4U2rp2HOA44NMz4y8A AAD//wMAUEsDBBQABgAIAAAAIQAJlgCVxwAAAOMAAAAPAAAAZHJzL2Rvd25yZXYueG1sRE/dTsIw FL434R2aQ+KddEyzwaQQIJooVzB4gON6WBfW07FWmG9vL0y8/PL9L1aDbcWNet84VjCdJCCIK6cb rhWcju9PMxA+IGtsHZOCH/KwWo4eFlhod+cD3cpQixjCvkAFJoSukNJXhiz6ieuII3d2vcUQYV9L 3eM9httWpkmSSYsNxwaDHW0NVZfy2yrYvzhK31K/KWs7N8PXcfd5xUypx/GwfgURaAj/4j/3h1aQ JvM8z7PpcxwdP8U/IJe/AAAA//8DAFBLAQItABQABgAIAAAAIQDb4fbL7gAAAIUBAAATAAAAAAAA AAAAAAAAAAAAAABbQ29udGVudF9UeXBlc10ueG1sUEsBAi0AFAAGAAgAAAAhAFr0LFu/AAAAFQEA AAsAAAAAAAAAAAAAAAAAHwEAAF9yZWxzLy5yZWxzUEsBAi0AFAAGAAgAAAAhAAmWAJXHAAAA4wAA AA8AAAAAAAAAAAAAAAAABwIAAGRycy9kb3ducmV2LnhtbFBLBQYAAAAAAwADALcAAAD7AgAAAAA= " filled="f" stroked="f">
                     <v:textbox inset="2.53958mm,2.53958mm,2.53958mm,2.53958mm">
                       <w:txbxContent>
                         <w:p>
@@ -3051,8 +2987,8 @@
                       </w:txbxContent>
                     </v:textbox>
                   </v:rect>
-                  <v:group id="Group 449928797" o:spid="_x0000_s1041" style="position:absolute;left:19352;top:36089;width:68215;height:3421" coordorigin="19352,36089" coordsize="68214,3420" o:gfxdata="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">
-                    <v:rect id="Rectangle 385381982" o:spid="_x0000_s1042" style="position:absolute;left:19352;top:36089;width:68215;height:3421;visibility:visible;mso-wrap-style:square;v-text-anchor:middle" o:gfxdata="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" filled="f" stroked="f">
+                  <v:group id="Group 449928797" o:spid="_x0000_s1041" style="position:absolute;left:19352;top:36089;width:68215;height:3421" coordorigin="19352,36089" coordsize="68214,3420" o:gfxdata="UEsDBBQABgAIAAAAIQDb4fbL7gAAAIUBAAATAAAAW0NvbnRlbnRfVHlwZXNdLnhtbHyQz07DMAyH 70i8Q+QralM4IITa7kDhCAiNB7ASt43WOlEcyvb2pNu4IODoPz9/n1xv9vOkForiPDdwXVagiI23 jocG3rdPxR0oScgWJ8/UwIEENu3lRb09BBKV0ywNjCmFe63FjDSjlD4Q50nv44wpl3HQAc0OB9I3 VXWrjedEnIq03oC27qjHjympx31un0wiTQLq4bS4shrAECZnMGVTvbD9QSnOhDInjzsyuiBXWQP0 r4R18jfgnHvJr4nOknrFmJ5xzhraRtHWf3Kkpfz/yGo5S+H73hkquyhdjr3R8m2lj09svwAAAP// AwBQSwMEFAAGAAgAAAAhAFr0LFu/AAAAFQEAAAsAAABfcmVscy8ucmVsc2zPwWrDMAwG4Ptg72B0 X5TuUMaI01uh19I+gLGVxCy2jGSy9e1nemrHjpL4P0nD4SetZiPRyNnCruvBUPYcYp4tXC/Htw8w Wl0ObuVMFm6kcBhfX4Yzra62kC6xqGlKVgtLreUTUf1CyWnHhXKbTCzJ1VbKjMX5LzcTvvf9HuXR gPHJNKdgQU5hB+ZyK23zHztFL6w81c5zQp6m6P9TMfB3PtPWFCczVQtB9N4U2rp2HOA44NMz4y8A AAD//wMAUEsDBBQABgAIAAAAIQDHQVKozAAAAOIAAAAPAAAAZHJzL2Rvd25yZXYueG1sRI9Ba8JA FITvQv/D8gredBOrjUldRaQtPUihWii9PbLPJJh9G7JrEv99tyB4HGbmG2a1GUwtOmpdZVlBPI1A EOdWV1wo+D6+TZYgnEfWWFsmBVdysFk/jFaYadvzF3UHX4gAYZehgtL7JpPS5SUZdFPbEAfvZFuD Psi2kLrFPsBNLWdR9CwNVhwWSmxoV1J+PlyMgvce++1T/Nrtz6fd9fe4+PzZx6TU+HHYvoDwNPh7 +Nb+0Arm8zSdLZM0gf9L4Q7I9R8AAAD//wMAUEsBAi0AFAAGAAgAAAAhANvh9svuAAAAhQEAABMA AAAAAAAAAAAAAAAAAAAAAFtDb250ZW50X1R5cGVzXS54bWxQSwECLQAUAAYACAAAACEAWvQsW78A AAAVAQAACwAAAAAAAAAAAAAAAAAfAQAAX3JlbHMvLnJlbHNQSwECLQAUAAYACAAAACEAx0FSqMwA AADiAAAADwAAAAAAAAAAAAAAAAAHAgAAZHJzL2Rvd25yZXYueG1sUEsFBgAAAAADAAMAtwAAAAAD AAAAAA== ">
+                    <v:rect id="Rectangle 385381982" o:spid="_x0000_s1042" style="position:absolute;left:19352;top:36089;width:68215;height:3421;visibility:visible;mso-wrap-style:square;v-text-anchor:middle" o:gfxdata="UEsDBBQABgAIAAAAIQDb4fbL7gAAAIUBAAATAAAAW0NvbnRlbnRfVHlwZXNdLnhtbHyQz07DMAyH 70i8Q+QralM4IITa7kDhCAiNB7ASt43WOlEcyvb2pNu4IODoPz9/n1xv9vOkForiPDdwXVagiI23 jocG3rdPxR0oScgWJ8/UwIEENu3lRb09BBKV0ywNjCmFe63FjDSjlD4Q50nv44wpl3HQAc0OB9I3 VXWrjedEnIq03oC27qjHjympx31un0wiTQLq4bS4shrAECZnMGVTvbD9QSnOhDInjzsyuiBXWQP0 r4R18jfgnHvJr4nOknrFmJ5xzhraRtHWf3Kkpfz/yGo5S+H73hkquyhdjr3R8m2lj09svwAAAP// AwBQSwMEFAAGAAgAAAAhAFr0LFu/AAAAFQEAAAsAAABfcmVscy8ucmVsc2zPwWrDMAwG4Ptg72B0 X5TuUMaI01uh19I+gLGVxCy2jGSy9e1nemrHjpL4P0nD4SetZiPRyNnCruvBUPYcYp4tXC/Htw8w Wl0ObuVMFm6kcBhfX4Yzra62kC6xqGlKVgtLreUTUf1CyWnHhXKbTCzJ1VbKjMX5LzcTvvf9HuXR gPHJNKdgQU5hB+ZyK23zHztFL6w81c5zQp6m6P9TMfB3PtPWFCczVQtB9N4U2rp2HOA44NMz4y8A AAD//wMAUEsDBBQABgAIAAAAIQBkIfDTyQAAAOIAAAAPAAAAZHJzL2Rvd25yZXYueG1sRI/BbsIw EETvSPyDtUi9gUNoUUgxiFatVDjR0A/YxkscEa9D7EL69zVSJY6jmXmjWa5724gLdb52rGA6SUAQ l07XXCn4OryPMxA+IGtsHJOCX/KwXg0HS8y1u/InXYpQiQhhn6MCE0KbS+lLQxb9xLXE0Tu6zmKI squk7vAa4baRaZLMpcWa44LBll4NlafixyrYPzpK31L/UlR2Yfrvw257xrlSD6N+8wwiUB/u4f/2 h1Ywy55m2XSRpXC7FO+AXP0BAAD//wMAUEsBAi0AFAAGAAgAAAAhANvh9svuAAAAhQEAABMAAAAA AAAAAAAAAAAAAAAAAFtDb250ZW50X1R5cGVzXS54bWxQSwECLQAUAAYACAAAACEAWvQsW78AAAAV AQAACwAAAAAAAAAAAAAAAAAfAQAAX3JlbHMvLnJlbHNQSwECLQAUAAYACAAAACEAZCHw08kAAADi AAAADwAAAAAAAAAAAAAAAAAHAgAAZHJzL2Rvd25yZXYueG1sUEsFBgAAAAADAAMAtwAAAP0CAAAA AA== " filled="f" stroked="f">
                       <v:textbox inset="2.53958mm,2.53958mm,2.53958mm,2.53958mm">
                         <w:txbxContent>
                           <w:p>
@@ -3064,8 +3000,8 @@
                         </w:txbxContent>
                       </v:textbox>
                     </v:rect>
-                    <v:group id="Group 1215648443" o:spid="_x0000_s1043" style="position:absolute;left:19352;top:36089;width:68215;height:3421" coordorigin="19352,36174" coordsize="68214,3252" o:gfxdata="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">
-                      <v:rect id="Rectangle 2139541829" o:spid="_x0000_s1044" style="position:absolute;left:19352;top:36174;width:68215;height:3252;visibility:visible;mso-wrap-style:square;v-text-anchor:middle" o:gfxdata="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" filled="f" stroked="f">
+                    <v:group id="Group 1215648443" o:spid="_x0000_s1043" style="position:absolute;left:19352;top:36089;width:68215;height:3421" coordorigin="19352,36174" coordsize="68214,3252" o:gfxdata="UEsDBBQABgAIAAAAIQDb4fbL7gAAAIUBAAATAAAAW0NvbnRlbnRfVHlwZXNdLnhtbHyQz07DMAyH 70i8Q+QralM4IITa7kDhCAiNB7ASt43WOlEcyvb2pNu4IODoPz9/n1xv9vOkForiPDdwXVagiI23 jocG3rdPxR0oScgWJ8/UwIEENu3lRb09BBKV0ywNjCmFe63FjDSjlD4Q50nv44wpl3HQAc0OB9I3 VXWrjedEnIq03oC27qjHjympx31un0wiTQLq4bS4shrAECZnMGVTvbD9QSnOhDInjzsyuiBXWQP0 r4R18jfgnHvJr4nOknrFmJ5xzhraRtHWf3Kkpfz/yGo5S+H73hkquyhdjr3R8m2lj09svwAAAP// AwBQSwMEFAAGAAgAAAAhAFr0LFu/AAAAFQEAAAsAAABfcmVscy8ucmVsc2zPwWrDMAwG4Ptg72B0 X5TuUMaI01uh19I+gLGVxCy2jGSy9e1nemrHjpL4P0nD4SetZiPRyNnCruvBUPYcYp4tXC/Htw8w Wl0ObuVMFm6kcBhfX4Yzra62kC6xqGlKVgtLreUTUf1CyWnHhXKbTCzJ1VbKjMX5LzcTvvf9HuXR gPHJNKdgQU5hB+ZyK23zHztFL6w81c5zQp6m6P9TMfB3PtPWFCczVQtB9N4U2rp2HOA44NMz4y8A AAD//wMAUEsDBBQABgAIAAAAIQBhGsdmyAAAAOMAAAAPAAAAZHJzL2Rvd25yZXYueG1sRE/NasJA EL4X+g7LFHqrm2gUia4i0pYeRDAWirchOybB7GzIbpP49q4geJzvf5brwdSio9ZVlhXEowgEcW51 xYWC3+PXxxyE88gaa8uk4EoO1qvXlyWm2vZ8oC7zhQgh7FJUUHrfpFK6vCSDbmQb4sCdbWvQh7Mt pG6xD+GmluMomkmDFYeGEhvalpRfsn+j4LvHfjOJP7vd5by9no7T/d8uJqXe34bNAoSnwT/FD/eP DvPH8XSWzJNkAvefAgBydQMAAP//AwBQSwECLQAUAAYACAAAACEA2+H2y+4AAACFAQAAEwAAAAAA AAAAAAAAAAAAAAAAW0NvbnRlbnRfVHlwZXNdLnhtbFBLAQItABQABgAIAAAAIQBa9CxbvwAAABUB AAALAAAAAAAAAAAAAAAAAB8BAABfcmVscy8ucmVsc1BLAQItABQABgAIAAAAIQBhGsdmyAAAAOMA AAAPAAAAAAAAAAAAAAAAAAcCAABkcnMvZG93bnJldi54bWxQSwUGAAAAAAMAAwC3AAAA/AIAAAAA ">
+                      <v:rect id="Rectangle 2139541829" o:spid="_x0000_s1044" style="position:absolute;left:19352;top:36174;width:68215;height:3252;visibility:visible;mso-wrap-style:square;v-text-anchor:middle" o:gfxdata="UEsDBBQABgAIAAAAIQDb4fbL7gAAAIUBAAATAAAAW0NvbnRlbnRfVHlwZXNdLnhtbHyQz07DMAyH 70i8Q+QralM4IITa7kDhCAiNB7ASt43WOlEcyvb2pNu4IODoPz9/n1xv9vOkForiPDdwXVagiI23 jocG3rdPxR0oScgWJ8/UwIEENu3lRb09BBKV0ywNjCmFe63FjDSjlD4Q50nv44wpl3HQAc0OB9I3 VXWrjedEnIq03oC27qjHjympx31un0wiTQLq4bS4shrAECZnMGVTvbD9QSnOhDInjzsyuiBXWQP0 r4R18jfgnHvJr4nOknrFmJ5xzhraRtHWf3Kkpfz/yGo5S+H73hkquyhdjr3R8m2lj09svwAAAP// AwBQSwMEFAAGAAgAAAAhAFr0LFu/AAAAFQEAAAsAAABfcmVscy8ucmVsc2zPwWrDMAwG4Ptg72B0 X5TuUMaI01uh19I+gLGVxCy2jGSy9e1nemrHjpL4P0nD4SetZiPRyNnCruvBUPYcYp4tXC/Htw8w Wl0ObuVMFm6kcBhfX4Yzra62kC6xqGlKVgtLreUTUf1CyWnHhXKbTCzJ1VbKjMX5LzcTvvf9HuXR gPHJNKdgQU5hB+ZyK23zHztFL6w81c5zQp6m6P9TMfB3PtPWFCczVQtB9N4U2rp2HOA44NMz4y8A AAD//wMAUEsDBBQABgAIAAAAIQA35c8aygAAAOMAAAAPAAAAZHJzL2Rvd25yZXYueG1sRI/BTsMw EETvSP0Haytxo05MqZq0bgUIJOippHzANl7iiHgdYtOGv8dISD2OZuaNZr0dXSdONITWs4Z8loEg rr1pudHwfni+WYIIEdlg55k0/FCA7WZytcbS+DO/0amKjUgQDiVqsDH2pZShtuQwzHxPnLwPPziM SQ6NNAOeE9x1UmXZQjpsOS1Y7OnRUv1ZfTsN+7kn9aTCQ9W4wo7Hw+71CxdaX0/H+xWISGO8hP/b L0aDym+Lu3m+VAX8fUp/QG5+AQAA//8DAFBLAQItABQABgAIAAAAIQDb4fbL7gAAAIUBAAATAAAA AAAAAAAAAAAAAAAAAABbQ29udGVudF9UeXBlc10ueG1sUEsBAi0AFAAGAAgAAAAhAFr0LFu/AAAA FQEAAAsAAAAAAAAAAAAAAAAAHwEAAF9yZWxzLy5yZWxzUEsBAi0AFAAGAAgAAAAhADflzxrKAAAA 4wAAAA8AAAAAAAAAAAAAAAAABwIAAGRycy9kb3ducmV2LnhtbFBLBQYAAAAAAwADALcAAAD+AgAA AAA= " filled="f" stroked="f">
                         <v:textbox inset="2.53958mm,2.53958mm,2.53958mm,2.53958mm">
                           <w:txbxContent>
                             <w:p>
@@ -3077,8 +3013,8 @@
                           </w:txbxContent>
                         </v:textbox>
                       </v:rect>
-                      <v:group id="Group 506373341" o:spid="_x0000_s1045" style="position:absolute;left:19352;top:36174;width:68215;height:3251" coordorigin="3300,30964" coordsize="91684,4227" o:gfxdata="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">
-                        <v:rect id="Rectangle 1407511929" o:spid="_x0000_s1046" style="position:absolute;left:3300;top:30964;width:91684;height:4227;visibility:visible;mso-wrap-style:square;v-text-anchor:middle" o:gfxdata="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" filled="f" stroked="f">
+                      <v:group id="Group 506373341" o:spid="_x0000_s1045" style="position:absolute;left:19352;top:36174;width:68215;height:3251" coordorigin="3300,30964" coordsize="91684,4227" o:gfxdata="UEsDBBQABgAIAAAAIQDb4fbL7gAAAIUBAAATAAAAW0NvbnRlbnRfVHlwZXNdLnhtbHyQz07DMAyH 70i8Q+QralM4IITa7kDhCAiNB7ASt43WOlEcyvb2pNu4IODoPz9/n1xv9vOkForiPDdwXVagiI23 jocG3rdPxR0oScgWJ8/UwIEENu3lRb09BBKV0ywNjCmFe63FjDSjlD4Q50nv44wpl3HQAc0OB9I3 VXWrjedEnIq03oC27qjHjympx31un0wiTQLq4bS4shrAECZnMGVTvbD9QSnOhDInjzsyuiBXWQP0 r4R18jfgnHvJr4nOknrFmJ5xzhraRtHWf3Kkpfz/yGo5S+H73hkquyhdjr3R8m2lj09svwAAAP// AwBQSwMEFAAGAAgAAAAhAFr0LFu/AAAAFQEAAAsAAABfcmVscy8ucmVsc2zPwWrDMAwG4Ptg72B0 X5TuUMaI01uh19I+gLGVxCy2jGSy9e1nemrHjpL4P0nD4SetZiPRyNnCruvBUPYcYp4tXC/Htw8w Wl0ObuVMFm6kcBhfX4Yzra62kC6xqGlKVgtLreUTUf1CyWnHhXKbTCzJ1VbKjMX5LzcTvvf9HuXR gPHJNKdgQU5hB+ZyK23zHztFL6w81c5zQp6m6P9TMfB3PtPWFCczVQtB9N4U2rp2HOA44NMz4y8A AAD//wMAUEsDBBQABgAIAAAAIQA/PR71ywAAAOIAAAAPAAAAZHJzL2Rvd25yZXYueG1sRI9Pa8JA FMTvBb/D8gRvdZOm2hKzikiVHqRQLRRvj+zLH8y+Ddk1id++Wyj0OMzMb5hsM5pG9NS52rKCeB6B IM6trrlU8HXeP76CcB5ZY2OZFNzJwWY9ecgw1XbgT+pPvhQBwi5FBZX3bSqlyysy6Oa2JQ5eYTuD PsiulLrDIcBNI5+iaCkN1hwWKmxpV1F+Pd2MgsOAwzaJ3/rjtdjdL+fFx/cxJqVm03G7AuFp9P/h v/a7VrCIlslLkjzH8Hsp3AG5/gEAAP//AwBQSwECLQAUAAYACAAAACEA2+H2y+4AAACFAQAAEwAA AAAAAAAAAAAAAAAAAAAAW0NvbnRlbnRfVHlwZXNdLnhtbFBLAQItABQABgAIAAAAIQBa9CxbvwAA ABUBAAALAAAAAAAAAAAAAAAAAB8BAABfcmVscy8ucmVsc1BLAQItABQABgAIAAAAIQA/PR71ywAA AOIAAAAPAAAAAAAAAAAAAAAAAAcCAABkcnMvZG93bnJldi54bWxQSwUGAAAAAAMAAwC3AAAA/wIA AAAA ">
+                        <v:rect id="Rectangle 1407511929" o:spid="_x0000_s1046" style="position:absolute;left:3300;top:30964;width:91684;height:4227;visibility:visible;mso-wrap-style:square;v-text-anchor:middle" o:gfxdata="UEsDBBQABgAIAAAAIQDb4fbL7gAAAIUBAAATAAAAW0NvbnRlbnRfVHlwZXNdLnhtbHyQz07DMAyH 70i8Q+QralM4IITa7kDhCAiNB7ASt43WOlEcyvb2pNu4IODoPz9/n1xv9vOkForiPDdwXVagiI23 jocG3rdPxR0oScgWJ8/UwIEENu3lRb09BBKV0ywNjCmFe63FjDSjlD4Q50nv44wpl3HQAc0OB9I3 VXWrjedEnIq03oC27qjHjympx31un0wiTQLq4bS4shrAECZnMGVTvbD9QSnOhDInjzsyuiBXWQP0 r4R18jfgnHvJr4nOknrFmJ5xzhraRtHWf3Kkpfz/yGo5S+H73hkquyhdjr3R8m2lj09svwAAAP// AwBQSwMEFAAGAAgAAAAhAFr0LFu/AAAAFQEAAAsAAABfcmVscy8ucmVsc2zPwWrDMAwG4Ptg72B0 X5TuUMaI01uh19I+gLGVxCy2jGSy9e1nemrHjpL4P0nD4SetZiPRyNnCruvBUPYcYp4tXC/Htw8w Wl0ObuVMFm6kcBhfX4Yzra62kC6xqGlKVgtLreUTUf1CyWnHhXKbTCzJ1VbKjMX5LzcTvvf9HuXR gPHJNKdgQU5hB+ZyK23zHztFL6w81c5zQp6m6P9TMfB3PtPWFCczVQtB9N4U2rp2HOA44NMz4y8A AAD//wMAUEsDBBQABgAIAAAAIQCLH3YXxwAAAOMAAAAPAAAAZHJzL2Rvd25yZXYueG1sRE9fT8Iw EH834Ts0R+KbdFsQ2aAQIJqgTzr4AMd6rovrdawV5renJiY+3u//LdeDbcWFet84VpBOEhDEldMN 1wqOh5eHOQgfkDW2jknBD3lYr0Z3Syy0u/IHXcpQixjCvkAFJoSukNJXhiz6ieuII/fpeoshnn0t dY/XGG5bmSXJTFpsODYY7GhnqPoqv62C96mj7Dnz27K2uRlOh7fXM86Uuh8PmwWIQEP4F/+59zrO nyZPj2maZzn8/hQBkKsbAAAA//8DAFBLAQItABQABgAIAAAAIQDb4fbL7gAAAIUBAAATAAAAAAAA AAAAAAAAAAAAAABbQ29udGVudF9UeXBlc10ueG1sUEsBAi0AFAAGAAgAAAAhAFr0LFu/AAAAFQEA AAsAAAAAAAAAAAAAAAAAHwEAAF9yZWxzLy5yZWxzUEsBAi0AFAAGAAgAAAAhAIsfdhfHAAAA4wAA AA8AAAAAAAAAAAAAAAAABwIAAGRycy9kb3ducmV2LnhtbFBLBQYAAAAAAwADALcAAAD7AgAAAAA= " filled="f" stroked="f">
                           <v:textbox inset="2.53958mm,2.53958mm,2.53958mm,2.53958mm">
                             <w:txbxContent>
                               <w:p>
@@ -3090,7 +3026,7 @@
                             </w:txbxContent>
                           </v:textbox>
                         </v:rect>
-                        <v:oval id="Oval 229435082" o:spid="_x0000_s1047" style="position:absolute;left:90757;top:30964;width:4227;height:4227;visibility:visible;mso-wrap-style:square;v-text-anchor:middle" o:gfxdata="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" fillcolor="#f4a11e" stroked="f">
+                        <v:oval id="Oval 229435082" o:spid="_x0000_s1047" style="position:absolute;left:90757;top:30964;width:4227;height:4227;visibility:visible;mso-wrap-style:square;v-text-anchor:middle" o:gfxdata="UEsDBBQABgAIAAAAIQDb4fbL7gAAAIUBAAATAAAAW0NvbnRlbnRfVHlwZXNdLnhtbHyQz07DMAyH 70i8Q+QralM4IITa7kDhCAiNB7ASt43WOlEcyvb2pNu4IODoPz9/n1xv9vOkForiPDdwXVagiI23 jocG3rdPxR0oScgWJ8/UwIEENu3lRb09BBKV0ywNjCmFe63FjDSjlD4Q50nv44wpl3HQAc0OB9I3 VXWrjedEnIq03oC27qjHjympx31un0wiTQLq4bS4shrAECZnMGVTvbD9QSnOhDInjzsyuiBXWQP0 r4R18jfgnHvJr4nOknrFmJ5xzhraRtHWf3Kkpfz/yGo5S+H73hkquyhdjr3R8m2lj09svwAAAP// AwBQSwMEFAAGAAgAAAAhAFr0LFu/AAAAFQEAAAsAAABfcmVscy8ucmVsc2zPwWrDMAwG4Ptg72B0 X5TuUMaI01uh19I+gLGVxCy2jGSy9e1nemrHjpL4P0nD4SetZiPRyNnCruvBUPYcYp4tXC/Htw8w Wl0ObuVMFm6kcBhfX4Yzra62kC6xqGlKVgtLreUTUf1CyWnHhXKbTCzJ1VbKjMX5LzcTvvf9HuXR gPHJNKdgQU5hB+ZyK23zHztFL6w81c5zQp6m6P9TMfB3PtPWFCczVQtB9N4U2rp2HOA44NMz4y8A AAD//wMAUEsDBBQABgAIAAAAIQAW3sweygAAAOIAAAAPAAAAZHJzL2Rvd25yZXYueG1sRI9RS8NA EITfBf/DsUJfxG6MWmrstZRCQGkpGu37kluT0Nxemru28d/3BMHHYWa+YWaLwbbqxL1vnGi4Hyeg WEpnGqk0fH3md1NQPpAYap2whh/2sJhfX80oM+4sH3wqQqUiRHxGGuoQugzRlzVb8mPXsUTv2/WW QpR9haanc4TbFtMkmaClRuJCTR2vai73xdFqwNs3xveuwPywxt1xstltaZ9rPboZli+gAg/hP/zX fjUa0vT58eEpmabweyneAZxfAAAA//8DAFBLAQItABQABgAIAAAAIQDb4fbL7gAAAIUBAAATAAAA AAAAAAAAAAAAAAAAAABbQ29udGVudF9UeXBlc10ueG1sUEsBAi0AFAAGAAgAAAAhAFr0LFu/AAAA FQEAAAsAAAAAAAAAAAAAAAAAHwEAAF9yZWxzLy5yZWxzUEsBAi0AFAAGAAgAAAAhABbezB7KAAAA 4gAAAA8AAAAAAAAAAAAAAAAABwIAAGRycy9kb3ducmV2LnhtbFBLBQYAAAAAAwADALcAAAD+AgAA AAA= " fillcolor="#f4a11e" stroked="f">
                           <v:textbox inset="2.53958mm,2.53958mm,2.53958mm,2.53958mm">
                             <w:txbxContent>
                               <w:p>
@@ -3102,7 +3038,7 @@
                             </w:txbxContent>
                           </v:textbox>
                         </v:oval>
-                        <v:oval id="Oval 1528776622" o:spid="_x0000_s1048" style="position:absolute;left:3300;top:30964;width:4227;height:4227;visibility:visible;mso-wrap-style:square;v-text-anchor:middle" o:gfxdata="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" fillcolor="#f4a11e" stroked="f">
+                        <v:oval id="Oval 1528776622" o:spid="_x0000_s1048" style="position:absolute;left:3300;top:30964;width:4227;height:4227;visibility:visible;mso-wrap-style:square;v-text-anchor:middle" o:gfxdata="UEsDBBQABgAIAAAAIQDb4fbL7gAAAIUBAAATAAAAW0NvbnRlbnRfVHlwZXNdLnhtbHyQz07DMAyH 70i8Q+QralM4IITa7kDhCAiNB7ASt43WOlEcyvb2pNu4IODoPz9/n1xv9vOkForiPDdwXVagiI23 jocG3rdPxR0oScgWJ8/UwIEENu3lRb09BBKV0ywNjCmFe63FjDSjlD4Q50nv44wpl3HQAc0OB9I3 VXWrjedEnIq03oC27qjHjympx31un0wiTQLq4bS4shrAECZnMGVTvbD9QSnOhDInjzsyuiBXWQP0 r4R18jfgnHvJr4nOknrFmJ5xzhraRtHWf3Kkpfz/yGo5S+H73hkquyhdjr3R8m2lj09svwAAAP// AwBQSwMEFAAGAAgAAAAhAFr0LFu/AAAAFQEAAAsAAABfcmVscy8ucmVsc2zPwWrDMAwG4Ptg72B0 X5TuUMaI01uh19I+gLGVxCy2jGSy9e1nemrHjpL4P0nD4SetZiPRyNnCruvBUPYcYp4tXC/Htw8w Wl0ObuVMFm6kcBhfX4Yzra62kC6xqGlKVgtLreUTUf1CyWnHhXKbTCzJ1VbKjMX5LzcTvvf9HuXR gPHJNKdgQU5hB+ZyK23zHztFL6w81c5zQp6m6P9TMfB3PtPWFCczVQtB9N4U2rp2HOA44NMz4y8A AAD//wMAUEsDBBQABgAIAAAAIQArOlerxwAAAOMAAAAPAAAAZHJzL2Rvd25yZXYueG1sRE/NSsNA EL4LvsMyghexEwOmJe22lEJAUaRN7X3ITpPQ7GzMbtv49q4geJzvfxar0XbqwoNvnWh4miSgWCpn Wqk1fO6LxxkoH0gMdU5Ywzd7WC1vbxaUG3eVHV/KUKsYIj4nDU0IfY7oq4Yt+YnrWSJ3dIOlEM+h RjPQNYbbDtMkydBSK7GhoZ43DVen8mw14MMr47Yvsfh6w8M5ez980KnQ+v5uXM9BBR7Dv/jP/WLi /Od0Np1mWZrC708RAFz+AAAA//8DAFBLAQItABQABgAIAAAAIQDb4fbL7gAAAIUBAAATAAAAAAAA AAAAAAAAAAAAAABbQ29udGVudF9UeXBlc10ueG1sUEsBAi0AFAAGAAgAAAAhAFr0LFu/AAAAFQEA AAsAAAAAAAAAAAAAAAAAHwEAAF9yZWxzLy5yZWxzUEsBAi0AFAAGAAgAAAAhACs6V6vHAAAA4wAA AA8AAAAAAAAAAAAAAAAABwIAAGRycy9kb3ducmV2LnhtbFBLBQYAAAAAAwADALcAAAD7AgAAAAA= " fillcolor="#f4a11e" stroked="f">
                           <v:textbox inset="2.53958mm,2.53958mm,2.53958mm,2.53958mm">
                             <w:txbxContent>
                               <w:p>
@@ -3114,7 +3050,7 @@
                             </w:txbxContent>
                           </v:textbox>
                         </v:oval>
-                        <v:rect id="Rectangle 1845005173" o:spid="_x0000_s1049" style="position:absolute;left:5402;top:30964;width:87450;height:4227;visibility:visible;mso-wrap-style:square;v-text-anchor:middle" o:gfxdata="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" fillcolor="#f4a11e" stroked="f">
+                        <v:rect id="Rectangle 1845005173" o:spid="_x0000_s1049" style="position:absolute;left:5402;top:30964;width:87450;height:4227;visibility:visible;mso-wrap-style:square;v-text-anchor:middle" o:gfxdata="UEsDBBQABgAIAAAAIQDb4fbL7gAAAIUBAAATAAAAW0NvbnRlbnRfVHlwZXNdLnhtbHyQz07DMAyH 70i8Q+QralM4IITa7kDhCAiNB7ASt43WOlEcyvb2pNu4IODoPz9/n1xv9vOkForiPDdwXVagiI23 jocG3rdPxR0oScgWJ8/UwIEENu3lRb09BBKV0ywNjCmFe63FjDSjlD4Q50nv44wpl3HQAc0OB9I3 VXWrjedEnIq03oC27qjHjympx31un0wiTQLq4bS4shrAECZnMGVTvbD9QSnOhDInjzsyuiBXWQP0 r4R18jfgnHvJr4nOknrFmJ5xzhraRtHWf3Kkpfz/yGo5S+H73hkquyhdjr3R8m2lj09svwAAAP// AwBQSwMEFAAGAAgAAAAhAFr0LFu/AAAAFQEAAAsAAABfcmVscy8ucmVsc2zPwWrDMAwG4Ptg72B0 X5TuUMaI01uh19I+gLGVxCy2jGSy9e1nemrHjpL4P0nD4SetZiPRyNnCruvBUPYcYp4tXC/Htw8w Wl0ObuVMFm6kcBhfX4Yzra62kC6xqGlKVgtLreUTUf1CyWnHhXKbTCzJ1VbKjMX5LzcTvvf9HuXR gPHJNKdgQU5hB+ZyK23zHztFL6w81c5zQp6m6P9TMfB3PtPWFCczVQtB9N4U2rp2HOA44NMz4y8A AAD//wMAUEsDBBQABgAIAAAAIQCMSVPkyQAAAOMAAAAPAAAAZHJzL2Rvd25yZXYueG1sRE9LT8JA EL6T+B82Y+INdikPobIQY2LiwQNUOXCbdIe22p2t3W0p/941IfE433s2u8HWoqfWV441TCcKBHHu TMWFhs+P1/EKhA/IBmvHpOFKHnbbu9EGU+MufKA+C4WIIexT1FCG0KRS+rwki37iGuLInV1rMcSz LaRp8RLDbS0TpZbSYsWxocSGXkrKv7POalj3VXL6mdV2eRzmyVf23pnrvtP64X54fgIRaAj/4pv7 zcT5q/lCqcX0cQZ/P0UA5PYXAAD//wMAUEsBAi0AFAAGAAgAAAAhANvh9svuAAAAhQEAABMAAAAA AAAAAAAAAAAAAAAAAFtDb250ZW50X1R5cGVzXS54bWxQSwECLQAUAAYACAAAACEAWvQsW78AAAAV AQAACwAAAAAAAAAAAAAAAAAfAQAAX3JlbHMvLnJlbHNQSwECLQAUAAYACAAAACEAjElT5MkAAADj AAAADwAAAAAAAAAAAAAAAAAHAgAAZHJzL2Rvd25yZXYueG1sUEsFBgAAAAADAAMAtwAAAP0CAAAA AA== " fillcolor="#f4a11e" stroked="f">
                           <v:textbox inset="2.53958mm,2.53958mm,2.53958mm,2.53958mm">
                             <w:txbxContent>
                               <w:p>
@@ -3933,21 +3869,12 @@
                       <w:szCs w:val="20"/>
                     </w:rPr>
                   </w:pPr>
-                  <w:proofErr w:type="gramStart"/>
                   <w:r>
                     <w:rPr>
                       <w:sz w:val="20"/>
                       <w:szCs w:val="20"/>
                     </w:rPr>
-                    <w:t>1.3  Develop</w:t>
-                  </w:r>
-                  <w:proofErr w:type="gramEnd"/>
-                  <w:r>
-                    <w:rPr>
-                      <w:sz w:val="20"/>
-                      <w:szCs w:val="20"/>
-                    </w:rPr>
-                    <w:t xml:space="preserve"> approaches to respond to the challenges of managing and leading multiple and remote teams </w:t>
+                    <w:t xml:space="preserve">1.3  Develop approaches to respond to the challenges of managing and leading multiple and remote teams </w:t>
                   </w:r>
                 </w:p>
               </w:tc>
@@ -5747,25 +5674,7 @@
           <w:sz w:val="20"/>
           <w:szCs w:val="20"/>
         </w:rPr>
-        <w:t xml:space="preserve">The written word, whether generated and/or recorded, is expected to form </w:t>
-      </w:r>
-      <w:proofErr w:type="gramStart"/>
-      <w:r>
-        <w:rPr>
-          <w:color w:val="222222"/>
-          <w:sz w:val="20"/>
-          <w:szCs w:val="20"/>
-        </w:rPr>
-        <w:t>the majority of</w:t>
-      </w:r>
-      <w:proofErr w:type="gramEnd"/>
-      <w:r>
-        <w:rPr>
-          <w:color w:val="222222"/>
-          <w:sz w:val="20"/>
-          <w:szCs w:val="20"/>
-        </w:rPr>
-        <w:t xml:space="preserve"> assessable work produced by Learners at Level 5. The amount and volume of written work for this unit should be broadly comparable to a word count of </w:t>
+        <w:t xml:space="preserve">The written word, whether generated and/or recorded, is expected to form the majority of assessable work produced by Learners at Level 5. The amount and volume of written work for this unit should be broadly comparable to a word count of </w:t>
       </w:r>
       <w:r>
         <w:rPr>
@@ -5783,13 +5692,6 @@
           <w:szCs w:val="20"/>
         </w:rPr>
         <w:t xml:space="preserve"> words within a margin of +/-10%. The unit also includes additional work in </w:t>
-      </w:r>
-      <w:r>
-        <w:rPr>
-          <w:color w:val="222222"/>
-          <w:sz w:val="20"/>
-          <w:szCs w:val="20"/>
-        </w:rPr>
         <w:lastRenderedPageBreak/>
         <w:t xml:space="preserve">the form of work based evidence. Excessive use of word count is not grounds for referral, however, the CMI reserves the right to return work to the Centre for editing and resubmission by the Learner.  </w:t>
       </w:r>
@@ -6565,9 +6467,9 @@
           </mc:Choice>
           <mc:Fallback>
             <w:pict>
-              <v:group w14:anchorId="256048CD" id="Group 4" o:spid="_x0000_s1050" style="width:537.1pt;height:35.15pt;mso-position-horizontal-relative:char;mso-position-vertical-relative:line" coordorigin="19352,35567" coordsize="68214,4465" o:gfxdata="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">
-                <v:group id="Group 1375522579" o:spid="_x0000_s1051" style="position:absolute;left:19352;top:35567;width:68215;height:4465" coordorigin="19352,35567" coordsize="68214,4465" o:gfxdata="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">
-                  <v:rect id="Rectangle 1193908311" o:spid="_x0000_s1052" style="position:absolute;left:19352;top:35567;width:68215;height:4465;visibility:visible;mso-wrap-style:square;v-text-anchor:middle" o:gfxdata="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" filled="f" stroked="f">
+              <v:group w14:anchorId="256048CD" id="Group 4" o:spid="_x0000_s1050" style="width:537.1pt;height:35.15pt;mso-position-horizontal-relative:char;mso-position-vertical-relative:line" coordorigin="19352,35567" coordsize="68214,4465" o:gfxdata="UEsDBBQABgAIAAAAIQC2gziS/gAAAOEBAAATAAAAW0NvbnRlbnRfVHlwZXNdLnhtbJSRQU7DMBBF 90jcwfIWJU67QAgl6YK0S0CoHGBkTxKLZGx5TGhvj5O2G0SRWNoz/78nu9wcxkFMGNg6quQqL6RA 0s5Y6ir5vt9lD1JwBDIwOMJKHpHlpr69KfdHjyxSmriSfYz+USnWPY7AufNIadK6MEJMx9ApD/oD OlTrorhX2lFEilmcO2RdNtjC5xDF9pCuTyYBB5bi6bQ4syoJ3g9WQ0ymaiLzg5KdCXlKLjvcW893 SUOqXwnz5DrgnHtJTxOsQfEKIT7DmDSUCaxw7Rqn8787ZsmRM9e2VmPeBN4uqYvTtW7jvijg9N/y JsXecLq0q+WD6m8AAAD//wMAUEsDBBQABgAIAAAAIQA4/SH/1gAAAJQBAAALAAAAX3JlbHMvLnJl bHOkkMFqwzAMhu+DvYPRfXGawxijTi+j0GvpHsDYimMaW0Yy2fr2M4PBMnrbUb/Q94l/f/hMi1qR JVI2sOt6UJgd+ZiDgffL8ekFlFSbvV0oo4EbChzGx4f9GRdb25HMsYhqlCwG5lrLq9biZkxWOiqY 22YiTra2kYMu1l1tQD30/bPm3wwYN0x18gb45AdQl1tp5j/sFB2T0FQ7R0nTNEV3j6o9feQzro1i OWA14Fm+Q8a1a8+Bvu/d/dMb2JY5uiPbhG/ktn4cqGU/er3pcvwCAAD//wMAUEsDBBQABgAIAAAA IQBohBC/5wMAAJ8VAAAOAAAAZHJzL2Uyb0RvYy54bWzsWG1v2zYQ/j5g/4HQ90UiJeoNcYqibYIB xRq02w+gZUoWIIkaycTOv9+ReqGczsmcYem8NR8c8Uid7o7Pc3fk5Zt926B7LlUtupWHLwIP8a4Q m7qrVt5vv17/lHpIadZtWCM6vvIeuPLeXP34w+WuzzkRW9FsuESgpFP5rl95W6373PdVseUtUxei 5x1MlkK2TMNQVv5Gsh1obxufBEHs74Tc9FIUXCmQvh8mvSurvyx5oT+VpeIaNSsPbNP2V9rftfn1 ry5ZXknWb+tiNIO9wIqW1R18dFb1nmmG7mT9laq2LqRQotQXhWh9UZZ1wa0P4A0OHnlzI8Vdb32p 8l3Vz2GC0D6K04vVFr/c38j+S38rIRK7voJY2JHxZV/K1vwHK9HehuxhDhnfa1SAME4JjnDkoQLm oiimJBliWmwh8OY1nIUgpB6CBSGlcULotOLDUgmF7ZmUwDOY408m+AeGzYPBYPDgVqJ6A18KE0oJ oUnmoY61gDYbQLSQj06e4LU1Pwud+eHo4DeNAJBFOTyov4eHL1vWcwszlS+iCZ5nQRpiPEXzM7CJ dVXDEXZzNqL2vRlEKleApz9B0FEoHMTyCSCwvJdK33DRIvOw8iSYZHnH7j8qPWBmWmIM6MR13TQg Z3nTHQgAXEYC0JrMNU96v94PWIoMAo1oLTYPADDVF9c1fPMjU/qWSUgSEJcdJI6Vp36/Y5J7qPm5 g53IcAQIR3o5kMvBejlgXbEVkI8KLT00DN5pm58Ga9/eaVHW1jNnzGg2QGDB2cdsIBhYl8ZRMu/f wIaF3HpYmT3/qzngf8sGEpA0iSC/zLnFsWExN2IGIvrfYoNN2Q6AZ8iGANgQpTSb929kg5P/C9gQ R+FQ+lhebJfVMTQpxVbHEEOFe7I6vkZtSJMgzGgaQOEfKq1jA3ZzL2fDIhDL2vBUGF6xNsTnXhsw JlEYJjh+xIaF/IVsSEGjbfRgB2Ns4sTygx0M4EAwAhln44K5VwzDAP4GDUEWm0JqNTgyZDhObX01 OmiM4YVvTQboejHNcDrXWccFN3UKFY5FYYrjczF4RSbYXvgs6sIrZEU4CiVpmhEyJcVP96xBTnoK BrIgoeakZMm0pMIEgoiQxFDlCA++wgBvmrpXps1n+ZFmWYmm3ph+2axRslq/ayQCF1bedfQW4w8j 0Q6WndhVp0bHd7wM59UYyllKcQy7OBRRixcnPQUvz+WM84RL9h0u7kBOAprCDUcQzPnFFZrF3Cmo oZFpf48nGTjywPdOyDLymfP4Qe74R1IMsf3AGaQYd6llj/Pjzdszz3ALCCsOrhmXY/u2u1e9+gMA AP//AwBQSwMEFAAGAAgAAAAhAPs6/i/dAAAABQEAAA8AAABkcnMvZG93bnJldi54bWxMj0FLw0AQ he+C/2EZwZvdTau2pNmUUtRTEWwF8TbNTpPQ7GzIbpP037v1opeBx3u89022Gm0jeup87VhDMlEg iAtnai41fO5fHxYgfEA22DgmDRfysMpvbzJMjRv4g/pdKEUsYZ+ihiqENpXSFxVZ9BPXEkfv6DqL IcqulKbDIZbbRk6VepYWa44LFba0qag47c5Ww9uAw3qWvPTb03Fz+d4/vX9tE9L6/m5cL0EEGsNf GK74ER3yyHRwZzZeNBriI+H3Xj01f5yCOGiYqxnIPJP/6fMfAAAA//8DAFBLAQItABQABgAIAAAA IQC2gziS/gAAAOEBAAATAAAAAAAAAAAAAAAAAAAAAABbQ29udGVudF9UeXBlc10ueG1sUEsBAi0A FAAGAAgAAAAhADj9If/WAAAAlAEAAAsAAAAAAAAAAAAAAAAALwEAAF9yZWxzLy5yZWxzUEsBAi0A FAAGAAgAAAAhAGiEEL/nAwAAnxUAAA4AAAAAAAAAAAAAAAAALgIAAGRycy9lMm9Eb2MueG1sUEsB Ai0AFAAGAAgAAAAhAPs6/i/dAAAABQEAAA8AAAAAAAAAAAAAAAAAQQYAAGRycy9kb3ducmV2Lnht bFBLBQYAAAAABAAEAPMAAABLBwAAAAA= ">
+                <v:group id="Group 1375522579" o:spid="_x0000_s1051" style="position:absolute;left:19352;top:35567;width:68215;height:4465" coordorigin="19352,35567" coordsize="68214,4465" o:gfxdata="UEsDBBQABgAIAAAAIQDb4fbL7gAAAIUBAAATAAAAW0NvbnRlbnRfVHlwZXNdLnhtbHyQz07DMAyH 70i8Q+QralM4IITa7kDhCAiNB7ASt43WOlEcyvb2pNu4IODoPz9/n1xv9vOkForiPDdwXVagiI23 jocG3rdPxR0oScgWJ8/UwIEENu3lRb09BBKV0ywNjCmFe63FjDSjlD4Q50nv44wpl3HQAc0OB9I3 VXWrjedEnIq03oC27qjHjympx31un0wiTQLq4bS4shrAECZnMGVTvbD9QSnOhDInjzsyuiBXWQP0 r4R18jfgnHvJr4nOknrFmJ5xzhraRtHWf3Kkpfz/yGo5S+H73hkquyhdjr3R8m2lj09svwAAAP// AwBQSwMEFAAGAAgAAAAhAFr0LFu/AAAAFQEAAAsAAABfcmVscy8ucmVsc2zPwWrDMAwG4Ptg72B0 X5TuUMaI01uh19I+gLGVxCy2jGSy9e1nemrHjpL4P0nD4SetZiPRyNnCruvBUPYcYp4tXC/Htw8w Wl0ObuVMFm6kcBhfX4Yzra62kC6xqGlKVgtLreUTUf1CyWnHhXKbTCzJ1VbKjMX5LzcTvvf9HuXR gPHJNKdgQU5hB+ZyK23zHztFL6w81c5zQp6m6P9TMfB3PtPWFCczVQtB9N4U2rp2HOA44NMz4y8A AAD//wMAUEsDBBQABgAIAAAAIQCbAIozyQAAAOMAAAAPAAAAZHJzL2Rvd25yZXYueG1sRE/NasJA EL4LfYdlCr3VTSKpNXUVkbZ4EKEqiLchOybB7GzIbpP49m6h4HG+/5kvB1OLjlpXWVYQjyMQxLnV FRcKjoev13cQziNrrC2Tghs5WC6eRnPMtO35h7q9L0QIYZehgtL7JpPS5SUZdGPbEAfuYluDPpxt IXWLfQg3tUyi6E0arDg0lNjQuqT8uv81Cr577FeT+LPbXi/r2/mQ7k7bmJR6eR5WHyA8Df4h/ndv dJg/maZpkqTTGfz9FACQizsAAAD//wMAUEsBAi0AFAAGAAgAAAAhANvh9svuAAAAhQEAABMAAAAA AAAAAAAAAAAAAAAAAFtDb250ZW50X1R5cGVzXS54bWxQSwECLQAUAAYACAAAACEAWvQsW78AAAAV AQAACwAAAAAAAAAAAAAAAAAfAQAAX3JlbHMvLnJlbHNQSwECLQAUAAYACAAAACEAmwCKM8kAAADj AAAADwAAAAAAAAAAAAAAAAAHAgAAZHJzL2Rvd25yZXYueG1sUEsFBgAAAAADAAMAtwAAAP0CAAAA AA== ">
+                  <v:rect id="Rectangle 1193908311" o:spid="_x0000_s1052" style="position:absolute;left:19352;top:35567;width:68215;height:4465;visibility:visible;mso-wrap-style:square;v-text-anchor:middle" o:gfxdata="UEsDBBQABgAIAAAAIQDb4fbL7gAAAIUBAAATAAAAW0NvbnRlbnRfVHlwZXNdLnhtbHyQz07DMAyH 70i8Q+QralM4IITa7kDhCAiNB7ASt43WOlEcyvb2pNu4IODoPz9/n1xv9vOkForiPDdwXVagiI23 jocG3rdPxR0oScgWJ8/UwIEENu3lRb09BBKV0ywNjCmFe63FjDSjlD4Q50nv44wpl3HQAc0OB9I3 VXWrjedEnIq03oC27qjHjympx31un0wiTQLq4bS4shrAECZnMGVTvbD9QSnOhDInjzsyuiBXWQP0 r4R18jfgnHvJr4nOknrFmJ5xzhraRtHWf3Kkpfz/yGo5S+H73hkquyhdjr3R8m2lj09svwAAAP// AwBQSwMEFAAGAAgAAAAhAFr0LFu/AAAAFQEAAAsAAABfcmVscy8ucmVsc2zPwWrDMAwG4Ptg72B0 X5TuUMaI01uh19I+gLGVxCy2jGSy9e1nemrHjpL4P0nD4SetZiPRyNnCruvBUPYcYp4tXC/Htw8w Wl0ObuVMFm6kcBhfX4Yzra62kC6xqGlKVgtLreUTUf1CyWnHhXKbTCzJ1VbKjMX5LzcTvvf9HuXR gPHJNKdgQU5hB+ZyK23zHztFL6w81c5zQp6m6P9TMfB3PtPWFCczVQtB9N4U2rp2HOA44NMz4y8A AAD//wMAUEsDBBQABgAIAAAAIQBLq+TNxgAAAOMAAAAPAAAAZHJzL2Rvd25yZXYueG1sRE9fa8Iw EH8X9h3CDfamaesQ2xlFZcLmk6v7ALfm1pQ1l9pE7b79MhB8vN//W6wG24oL9b5xrCCdJCCIK6cb rhV8HnfjOQgfkDW2jknBL3lYLR9GCyy0u/IHXcpQixjCvkAFJoSukNJXhiz6ieuII/fteoshnn0t dY/XGG5bmSXJTFpsODYY7GhrqPopz1bB4dlR9pr5TVnb3Axfx/37CWdKPT0O6xcQgYZwF9/cbzrO T/NpnsynaQr/P0UA5PIPAAD//wMAUEsBAi0AFAAGAAgAAAAhANvh9svuAAAAhQEAABMAAAAAAAAA AAAAAAAAAAAAAFtDb250ZW50X1R5cGVzXS54bWxQSwECLQAUAAYACAAAACEAWvQsW78AAAAVAQAA CwAAAAAAAAAAAAAAAAAfAQAAX3JlbHMvLnJlbHNQSwECLQAUAAYACAAAACEAS6vkzcYAAADjAAAA DwAAAAAAAAAAAAAAAAAHAgAAZHJzL2Rvd25yZXYueG1sUEsFBgAAAAADAAMAtwAAAPoCAAAAAA== " filled="f" stroked="f">
                     <v:textbox inset="2.53958mm,2.53958mm,2.53958mm,2.53958mm">
                       <w:txbxContent>
                         <w:p>
@@ -6579,8 +6481,8 @@
                       </w:txbxContent>
                     </v:textbox>
                   </v:rect>
-                  <v:group id="Group 2127586471" o:spid="_x0000_s1053" style="position:absolute;left:19352;top:35567;width:68215;height:4465" coordorigin="19352,35567" coordsize="68214,4465" o:gfxdata="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">
-                    <v:rect id="Rectangle 2028747559" o:spid="_x0000_s1054" style="position:absolute;left:19352;top:35567;width:68215;height:4465;visibility:visible;mso-wrap-style:square;v-text-anchor:middle" o:gfxdata="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" filled="f" stroked="f">
+                  <v:group id="Group 2127586471" o:spid="_x0000_s1053" style="position:absolute;left:19352;top:35567;width:68215;height:4465" coordorigin="19352,35567" coordsize="68214,4465" o:gfxdata="UEsDBBQABgAIAAAAIQDb4fbL7gAAAIUBAAATAAAAW0NvbnRlbnRfVHlwZXNdLnhtbHyQz07DMAyH 70i8Q+QralM4IITa7kDhCAiNB7ASt43WOlEcyvb2pNu4IODoPz9/n1xv9vOkForiPDdwXVagiI23 jocG3rdPxR0oScgWJ8/UwIEENu3lRb09BBKV0ywNjCmFe63FjDSjlD4Q50nv44wpl3HQAc0OB9I3 VXWrjedEnIq03oC27qjHjympx31un0wiTQLq4bS4shrAECZnMGVTvbD9QSnOhDInjzsyuiBXWQP0 r4R18jfgnHvJr4nOknrFmJ5xzhraRtHWf3Kkpfz/yGo5S+H73hkquyhdjr3R8m2lj09svwAAAP// AwBQSwMEFAAGAAgAAAAhAFr0LFu/AAAAFQEAAAsAAABfcmVscy8ucmVsc2zPwWrDMAwG4Ptg72B0 X5TuUMaI01uh19I+gLGVxCy2jGSy9e1nemrHjpL4P0nD4SetZiPRyNnCruvBUPYcYp4tXC/Htw8w Wl0ObuVMFm6kcBhfX4Yzra62kC6xqGlKVgtLreUTUf1CyWnHhXKbTCzJ1VbKjMX5LzcTvvf9HuXR gPHJNKdgQU5hB+ZyK23zHztFL6w81c5zQp6m6P9TMfB3PtPWFCczVQtB9N4U2rp2HOA44NMz4y8A AAD//wMAUEsDBBQABgAIAAAAIQAKWshczAAAAOMAAAAPAAAAZHJzL2Rvd25yZXYueG1sRI9La8Mw EITvhfwHsYXeGllu88CNEkJISw+hkAeE3BZrY5tYK2OptvPvq0Khx2FmvmEWq8HWoqPWV441qHEC gjh3puJCw+n4/jwH4QOywdoxabiTh9Vy9LDAzLie99QdQiEihH2GGsoQmkxKn5dk0Y9dQxy9q2st hijbQpoW+wi3tUyTZCotVhwXSmxoU1J+O3xbDR899usXte12t+vmfjlOvs47RVo/PQ7rNxCBhvAf /mt/Gg2pSmeT+fR1puD3U/wDcvkDAAD//wMAUEsBAi0AFAAGAAgAAAAhANvh9svuAAAAhQEAABMA AAAAAAAAAAAAAAAAAAAAAFtDb250ZW50X1R5cGVzXS54bWxQSwECLQAUAAYACAAAACEAWvQsW78A AAAVAQAACwAAAAAAAAAAAAAAAAAfAQAAX3JlbHMvLnJlbHNQSwECLQAUAAYACAAAACEAClrIXMwA AADjAAAADwAAAAAAAAAAAAAAAAAHAgAAZHJzL2Rvd25yZXYueG1sUEsFBgAAAAADAAMAtwAAAAAD AAAAAA== ">
+                    <v:rect id="Rectangle 2028747559" o:spid="_x0000_s1054" style="position:absolute;left:19352;top:35567;width:68215;height:4465;visibility:visible;mso-wrap-style:square;v-text-anchor:middle" o:gfxdata="UEsDBBQABgAIAAAAIQDb4fbL7gAAAIUBAAATAAAAW0NvbnRlbnRfVHlwZXNdLnhtbHyQz07DMAyH 70i8Q+QralM4IITa7kDhCAiNB7ASt43WOlEcyvb2pNu4IODoPz9/n1xv9vOkForiPDdwXVagiI23 jocG3rdPxR0oScgWJ8/UwIEENu3lRb09BBKV0ywNjCmFe63FjDSjlD4Q50nv44wpl3HQAc0OB9I3 VXWrjedEnIq03oC27qjHjympx31un0wiTQLq4bS4shrAECZnMGVTvbD9QSnOhDInjzsyuiBXWQP0 r4R18jfgnHvJr4nOknrFmJ5xzhraRtHWf3Kkpfz/yGo5S+H73hkquyhdjr3R8m2lj09svwAAAP// AwBQSwMEFAAGAAgAAAAhAFr0LFu/AAAAFQEAAAsAAABfcmVscy8ucmVsc2zPwWrDMAwG4Ptg72B0 X5TuUMaI01uh19I+gLGVxCy2jGSy9e1nemrHjpL4P0nD4SetZiPRyNnCruvBUPYcYp4tXC/Htw8w Wl0ObuVMFm6kcBhfX4Yzra62kC6xqGlKVgtLreUTUf1CyWnHhXKbTCzJ1VbKjMX5LzcTvvf9HuXR gPHJNKdgQU5hB+ZyK23zHztFL6w81c5zQp6m6P9TMfB3PtPWFCczVQtB9N4U2rp2HOA44NMz4y8A AAD//wMAUEsDBBQABgAIAAAAIQD+2ld7ygAAAOMAAAAPAAAAZHJzL2Rvd25yZXYueG1sRI/NTsMw EITvSLyDtUi9UQerf0njVrQCCThBygMs8TaOiNchdtvw9hgJieNoZr7RlNvRdeJMQ2g9a7ibZiCI a29abjS8Hx5vVyBCRDbYeSYN3xRgu7m+KrEw/sJvdK5iIxKEQ4EabIx9IWWoLTkMU98TJ+/oB4cx yaGRZsBLgrtOqixbSIctpwWLPe0t1Z/VyWl4nXlSDyrsqsbldvw4vDx/4ULryc14vwYRaYz/4b/2 k9GgMrVazpbzeQ6/n9IfkJsfAAAA//8DAFBLAQItABQABgAIAAAAIQDb4fbL7gAAAIUBAAATAAAA AAAAAAAAAAAAAAAAAABbQ29udGVudF9UeXBlc10ueG1sUEsBAi0AFAAGAAgAAAAhAFr0LFu/AAAA FQEAAAsAAAAAAAAAAAAAAAAAHwEAAF9yZWxzLy5yZWxzUEsBAi0AFAAGAAgAAAAhAP7aV3vKAAAA 4wAAAA8AAAAAAAAAAAAAAAAABwIAAGRycy9kb3ducmV2LnhtbFBLBQYAAAAAAwADALcAAAD+AgAA AAA= " filled="f" stroked="f">
                       <v:textbox inset="2.53958mm,2.53958mm,2.53958mm,2.53958mm">
                         <w:txbxContent>
                           <w:p>
@@ -6592,8 +6494,8 @@
                         </w:txbxContent>
                       </v:textbox>
                     </v:rect>
-                    <v:group id="Group 2027548599" o:spid="_x0000_s1055" style="position:absolute;left:19352;top:35567;width:68215;height:4465" coordorigin="19352,35643" coordsize="68213,4312" o:gfxdata="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">
-                      <v:rect id="Rectangle 1870395804" o:spid="_x0000_s1056" style="position:absolute;left:19352;top:35643;width:68214;height:4312;visibility:visible;mso-wrap-style:square;v-text-anchor:middle" o:gfxdata="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" filled="f" stroked="f">
+                    <v:group id="Group 2027548599" o:spid="_x0000_s1055" style="position:absolute;left:19352;top:35567;width:68215;height:4465" coordorigin="19352,35643" coordsize="68213,4312" o:gfxdata="UEsDBBQABgAIAAAAIQDb4fbL7gAAAIUBAAATAAAAW0NvbnRlbnRfVHlwZXNdLnhtbHyQz07DMAyH 70i8Q+QralM4IITa7kDhCAiNB7ASt43WOlEcyvb2pNu4IODoPz9/n1xv9vOkForiPDdwXVagiI23 jocG3rdPxR0oScgWJ8/UwIEENu3lRb09BBKV0ywNjCmFe63FjDSjlD4Q50nv44wpl3HQAc0OB9I3 VXWrjedEnIq03oC27qjHjympx31un0wiTQLq4bS4shrAECZnMGVTvbD9QSnOhDInjzsyuiBXWQP0 r4R18jfgnHvJr4nOknrFmJ5xzhraRtHWf3Kkpfz/yGo5S+H73hkquyhdjr3R8m2lj09svwAAAP// AwBQSwMEFAAGAAgAAAAhAFr0LFu/AAAAFQEAAAsAAABfcmVscy8ucmVsc2zPwWrDMAwG4Ptg72B0 X5TuUMaI01uh19I+gLGVxCy2jGSy9e1nemrHjpL4P0nD4SetZiPRyNnCruvBUPYcYp4tXC/Htw8w Wl0ObuVMFm6kcBhfX4Yzra62kC6xqGlKVgtLreUTUf1CyWnHhXKbTCzJ1VbKjMX5LzcTvvf9HuXR gPHJNKdgQU5hB+ZyK23zHztFL6w81c5zQp6m6P9TMfB3PtPWFCczVQtB9N4U2rp2HOA44NMz4y8A AAD//wMAUEsDBBQABgAIAAAAIQDJMRsSzAAAAOMAAAAPAAAAZHJzL2Rvd25yZXYueG1sRI9Ba8JA FITvQv/D8gq96SapaTV1FZFWPEihWii9PbLPJJh9G7LbJP57Vyh4HGbmG2axGkwtOmpdZVlBPIlA EOdWV1wo+D5+jGcgnEfWWFsmBRdysFo+jBaYadvzF3UHX4gAYZehgtL7JpPS5SUZdBPbEAfvZFuD Psi2kLrFPsBNLZMoepEGKw4LJTa0KSk/H/6Mgm2P/fo5fu/259Pm8ntMP3/2MSn19Dis30B4Gvw9 /N/eaQVJlLym01k6n8PtU/gDcnkFAAD//wMAUEsBAi0AFAAGAAgAAAAhANvh9svuAAAAhQEAABMA AAAAAAAAAAAAAAAAAAAAAFtDb250ZW50X1R5cGVzXS54bWxQSwECLQAUAAYACAAAACEAWvQsW78A AAAVAQAACwAAAAAAAAAAAAAAAAAfAQAAX3JlbHMvLnJlbHNQSwECLQAUAAYACAAAACEAyTEbEswA AADjAAAADwAAAAAAAAAAAAAAAAAHAgAAZHJzL2Rvd25yZXYueG1sUEsFBgAAAAADAAMAtwAAAAAD AAAAAA== ">
+                      <v:rect id="Rectangle 1870395804" o:spid="_x0000_s1056" style="position:absolute;left:19352;top:35643;width:68214;height:4312;visibility:visible;mso-wrap-style:square;v-text-anchor:middle" o:gfxdata="UEsDBBQABgAIAAAAIQDb4fbL7gAAAIUBAAATAAAAW0NvbnRlbnRfVHlwZXNdLnhtbHyQz07DMAyH 70i8Q+QralM4IITa7kDhCAiNB7ASt43WOlEcyvb2pNu4IODoPz9/n1xv9vOkForiPDdwXVagiI23 jocG3rdPxR0oScgWJ8/UwIEENu3lRb09BBKV0ywNjCmFe63FjDSjlD4Q50nv44wpl3HQAc0OB9I3 VXWrjedEnIq03oC27qjHjympx31un0wiTQLq4bS4shrAECZnMGVTvbD9QSnOhDInjzsyuiBXWQP0 r4R18jfgnHvJr4nOknrFmJ5xzhraRtHWf3Kkpfz/yGo5S+H73hkquyhdjr3R8m2lj09svwAAAP// AwBQSwMEFAAGAAgAAAAhAFr0LFu/AAAAFQEAAAsAAABfcmVscy8ucmVsc2zPwWrDMAwG4Ptg72B0 X5TuUMaI01uh19I+gLGVxCy2jGSy9e1nemrHjpL4P0nD4SetZiPRyNnCruvBUPYcYp4tXC/Htw8w Wl0ObuVMFm6kcBhfX4Yzra62kC6xqGlKVgtLreUTUf1CyWnHhXKbTCzJ1VbKjMX5LzcTvvf9HuXR gPHJNKdgQU5hB+ZyK23zHztFL6w81c5zQp6m6P9TMfB3PtPWFCczVQtB9N4U2rp2HOA44NMz4y8A AAD//wMAUEsDBBQABgAIAAAAIQC4u/dSxwAAAOMAAAAPAAAAZHJzL2Rvd25yZXYueG1sRE9fT8Iw EH838Ts0Z+KbtEzAMSlEjCbCkw4/wLke6+J6HWuF+e2tCQmP9/t/i9XgWnGkPjSeNYxHCgRx5U3D tYbP3etdDiJEZIOtZ9LwSwFWy+urBRbGn/iDjmWsRQrhUKAGG2NXSBkqSw7DyHfEidv73mFMZ19L 0+MphbtWZkrNpMOGU4PFjp4tVd/lj9PwPvGUvWRhXdZuboev3XZzwJnWtzfD0yOISEO8iM/uN5Pm 5w/qfj7N1QT+f0oAyOUfAAAA//8DAFBLAQItABQABgAIAAAAIQDb4fbL7gAAAIUBAAATAAAAAAAA AAAAAAAAAAAAAABbQ29udGVudF9UeXBlc10ueG1sUEsBAi0AFAAGAAgAAAAhAFr0LFu/AAAAFQEA AAsAAAAAAAAAAAAAAAAAHwEAAF9yZWxzLy5yZWxzUEsBAi0AFAAGAAgAAAAhALi791LHAAAA4wAA AA8AAAAAAAAAAAAAAAAABwIAAGRycy9kb3ducmV2LnhtbFBLBQYAAAAAAwADALcAAAD7AgAAAAA= " filled="f" stroked="f">
                         <v:textbox inset="2.53958mm,2.53958mm,2.53958mm,2.53958mm">
                           <w:txbxContent>
                             <w:p>
@@ -6605,8 +6507,8 @@
                           </w:txbxContent>
                         </v:textbox>
                       </v:rect>
-                      <v:group id="Group 1124337169" o:spid="_x0000_s1057" style="position:absolute;left:19352;top:35643;width:68213;height:4312" coordorigin="3300,30964" coordsize="91684,5613" o:gfxdata="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">
-                        <v:rect id="Rectangle 446159181" o:spid="_x0000_s1058" style="position:absolute;left:3300;top:30964;width:91684;height:5613;visibility:visible;mso-wrap-style:square;v-text-anchor:middle" o:gfxdata="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" filled="f" stroked="f">
+                      <v:group id="Group 1124337169" o:spid="_x0000_s1057" style="position:absolute;left:19352;top:35643;width:68213;height:4312" coordorigin="3300,30964" coordsize="91684,5613" o:gfxdata="UEsDBBQABgAIAAAAIQDb4fbL7gAAAIUBAAATAAAAW0NvbnRlbnRfVHlwZXNdLnhtbHyQz07DMAyH 70i8Q+QralM4IITa7kDhCAiNB7ASt43WOlEcyvb2pNu4IODoPz9/n1xv9vOkForiPDdwXVagiI23 jocG3rdPxR0oScgWJ8/UwIEENu3lRb09BBKV0ywNjCmFe63FjDSjlD4Q50nv44wpl3HQAc0OB9I3 VXWrjedEnIq03oC27qjHjympx31un0wiTQLq4bS4shrAECZnMGVTvbD9QSnOhDInjzsyuiBXWQP0 r4R18jfgnHvJr4nOknrFmJ5xzhraRtHWf3Kkpfz/yGo5S+H73hkquyhdjr3R8m2lj09svwAAAP// AwBQSwMEFAAGAAgAAAAhAFr0LFu/AAAAFQEAAAsAAABfcmVscy8ucmVsc2zPwWrDMAwG4Ptg72B0 X5TuUMaI01uh19I+gLGVxCy2jGSy9e1nemrHjpL4P0nD4SetZiPRyNnCruvBUPYcYp4tXC/Htw8w Wl0ObuVMFm6kcBhfX4Yzra62kC6xqGlKVgtLreUTUf1CyWnHhXKbTCzJ1VbKjMX5LzcTvvf9HuXR gPHJNKdgQU5hB+ZyK23zHztFL6w81c5zQp6m6P9TMfB3PtPWFCczVQtB9N4U2rp2HOA44NMz4y8A AAD//wMAUEsDBBQABgAIAAAAIQDAg33WyQAAAOMAAAAPAAAAZHJzL2Rvd25yZXYueG1sRE9fa8Iw EH8f7DuEG/g209jNuc4oItvYgwhTYeztaM622FxKE9v67ZeB4OP9/t98OdhadNT6yrEGNU5AEOfO VFxoOOw/HmcgfEA2WDsmDRfysFzc380xM67nb+p2oRAxhH2GGsoQmkxKn5dk0Y9dQxy5o2sthni2 hTQt9jHc1nKSJFNpseLYUGJD65Ly0+5sNXz22K9S9d5tTsf15Xf/vP3ZKNJ69DCs3kAEGsJNfHV/ mThfTZ7S9EVNX+H/pwiAXPwBAAD//wMAUEsBAi0AFAAGAAgAAAAhANvh9svuAAAAhQEAABMAAAAA AAAAAAAAAAAAAAAAAFtDb250ZW50X1R5cGVzXS54bWxQSwECLQAUAAYACAAAACEAWvQsW78AAAAV AQAACwAAAAAAAAAAAAAAAAAfAQAAX3JlbHMvLnJlbHNQSwECLQAUAAYACAAAACEAwIN91skAAADj AAAADwAAAAAAAAAAAAAAAAAHAgAAZHJzL2Rvd25yZXYueG1sUEsFBgAAAAADAAMAtwAAAP0CAAAA AA== ">
+                        <v:rect id="Rectangle 446159181" o:spid="_x0000_s1058" style="position:absolute;left:3300;top:30964;width:91684;height:5613;visibility:visible;mso-wrap-style:square;v-text-anchor:middle" o:gfxdata="UEsDBBQABgAIAAAAIQDb4fbL7gAAAIUBAAATAAAAW0NvbnRlbnRfVHlwZXNdLnhtbHyQz07DMAyH 70i8Q+QralM4IITa7kDhCAiNB7ASt43WOlEcyvb2pNu4IODoPz9/n1xv9vOkForiPDdwXVagiI23 jocG3rdPxR0oScgWJ8/UwIEENu3lRb09BBKV0ywNjCmFe63FjDSjlD4Q50nv44wpl3HQAc0OB9I3 VXWrjedEnIq03oC27qjHjympx31un0wiTQLq4bS4shrAECZnMGVTvbD9QSnOhDInjzsyuiBXWQP0 r4R18jfgnHvJr4nOknrFmJ5xzhraRtHWf3Kkpfz/yGo5S+H73hkquyhdjr3R8m2lj09svwAAAP// AwBQSwMEFAAGAAgAAAAhAFr0LFu/AAAAFQEAAAsAAABfcmVscy8ucmVsc2zPwWrDMAwG4Ptg72B0 X5TuUMaI01uh19I+gLGVxCy2jGSy9e1nemrHjpL4P0nD4SetZiPRyNnCruvBUPYcYp4tXC/Htw8w Wl0ObuVMFm6kcBhfX4Yzra62kC6xqGlKVgtLreUTUf1CyWnHhXKbTCzJ1VbKjMX5LzcTvvf9HuXR gPHJNKdgQU5hB+ZyK23zHztFL6w81c5zQp6m6P9TMfB3PtPWFCczVQtB9N4U2rp2HOA44NMz4y8A AAD//wMAUEsDBBQABgAIAAAAIQAtmMNuyQAAAOIAAAAPAAAAZHJzL2Rvd25yZXYueG1sRI/BbsIw EETvlfoP1lbqrTiJ0ggCBrWoSG1PJfABS7zEEfE6xAbSv68rVepxNDNvNIvVaDtxpcG3jhWkkwQE ce10y42C/W7zNAXhA7LGzjEp+CYPq+X93QJL7W68pWsVGhEh7EtUYELoSyl9bciin7ieOHpHN1gM UQ6N1APeItx2MkuSQlpsOS4Y7GltqD5VF6vgK3eUvWX+tWrszIyH3efHGQulHh/GlzmIQGP4D/+1 37WCPC/S51k6TeH3UrwDcvkDAAD//wMAUEsBAi0AFAAGAAgAAAAhANvh9svuAAAAhQEAABMAAAAA AAAAAAAAAAAAAAAAAFtDb250ZW50X1R5cGVzXS54bWxQSwECLQAUAAYACAAAACEAWvQsW78AAAAV AQAACwAAAAAAAAAAAAAAAAAfAQAAX3JlbHMvLnJlbHNQSwECLQAUAAYACAAAACEALZjDbskAAADi AAAADwAAAAAAAAAAAAAAAAAHAgAAZHJzL2Rvd25yZXYueG1sUEsFBgAAAAADAAMAtwAAAP0CAAAA AA== " filled="f" stroked="f">
                           <v:textbox inset="2.53958mm,2.53958mm,2.53958mm,2.53958mm">
                             <w:txbxContent>
                               <w:p>
@@ -6618,7 +6520,7 @@
                             </w:txbxContent>
                           </v:textbox>
                         </v:rect>
-                        <v:oval id="Oval 821788922" o:spid="_x0000_s1059" style="position:absolute;left:90757;top:30964;width:4227;height:5613;visibility:visible;mso-wrap-style:square;v-text-anchor:middle" o:gfxdata="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" fillcolor="#f4a11e" stroked="f">
+                        <v:oval id="Oval 821788922" o:spid="_x0000_s1059" style="position:absolute;left:90757;top:30964;width:4227;height:5613;visibility:visible;mso-wrap-style:square;v-text-anchor:middle" o:gfxdata="UEsDBBQABgAIAAAAIQDb4fbL7gAAAIUBAAATAAAAW0NvbnRlbnRfVHlwZXNdLnhtbHyQz07DMAyH 70i8Q+QralM4IITa7kDhCAiNB7ASt43WOlEcyvb2pNu4IODoPz9/n1xv9vOkForiPDdwXVagiI23 jocG3rdPxR0oScgWJ8/UwIEENu3lRb09BBKV0ywNjCmFe63FjDSjlD4Q50nv44wpl3HQAc0OB9I3 VXWrjedEnIq03oC27qjHjympx31un0wiTQLq4bS4shrAECZnMGVTvbD9QSnOhDInjzsyuiBXWQP0 r4R18jfgnHvJr4nOknrFmJ5xzhraRtHWf3Kkpfz/yGo5S+H73hkquyhdjr3R8m2lj09svwAAAP// AwBQSwMEFAAGAAgAAAAhAFr0LFu/AAAAFQEAAAsAAABfcmVscy8ucmVsc2zPwWrDMAwG4Ptg72B0 X5TuUMaI01uh19I+gLGVxCy2jGSy9e1nemrHjpL4P0nD4SetZiPRyNnCruvBUPYcYp4tXC/Htw8w Wl0ObuVMFm6kcBhfX4Yzra62kC6xqGlKVgtLreUTUf1CyWnHhXKbTCzJ1VbKjMX5LzcTvvf9HuXR gPHJNKdgQU5hB+ZyK23zHztFL6w81c5zQp6m6P9TMfB3PtPWFCczVQtB9N4U2rp2HOA44NMz4y8A AAD//wMAUEsDBBQABgAIAAAAIQB3S84/ygAAAOIAAAAPAAAAZHJzL2Rvd25yZXYueG1sRI9BS8NA FITvQv/D8gQvYl+aQ41pt6UIAUWRNm3vj+wzCc2+jdltG/+9Kwgeh5n5hlmuR9upCw++daJhNk1A sVTOtFJrOOyLhwyUDySGOies4Zs9rFeTmyXlxl1lx5cy1CpCxOekoQmhzxF91bAlP3U9S/Q+3WAp RDnUaAa6RrjtME2SOVpqJS401PNzw9WpPFsNeP/KuO1LLL7e8Hievx8/6FRofXc7bhagAo/hP/zX fjEasnT2mGVPaQq/l+IdwNUPAAAA//8DAFBLAQItABQABgAIAAAAIQDb4fbL7gAAAIUBAAATAAAA AAAAAAAAAAAAAAAAAABbQ29udGVudF9UeXBlc10ueG1sUEsBAi0AFAAGAAgAAAAhAFr0LFu/AAAA FQEAAAsAAAAAAAAAAAAAAAAAHwEAAF9yZWxzLy5yZWxzUEsBAi0AFAAGAAgAAAAhAHdLzj/KAAAA 4gAAAA8AAAAAAAAAAAAAAAAABwIAAGRycy9kb3ducmV2LnhtbFBLBQYAAAAAAwADALcAAAD+AgAA AAA= " fillcolor="#f4a11e" stroked="f">
                           <v:textbox inset="2.53958mm,2.53958mm,2.53958mm,2.53958mm">
                             <w:txbxContent>
                               <w:p>
@@ -6630,7 +6532,7 @@
                             </w:txbxContent>
                           </v:textbox>
                         </v:oval>
-                        <v:oval id="Oval 632585160" o:spid="_x0000_s1060" style="position:absolute;left:3300;top:30964;width:4227;height:5613;visibility:visible;mso-wrap-style:square;v-text-anchor:middle" o:gfxdata="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" fillcolor="#f4a11e" stroked="f">
+                        <v:oval id="Oval 632585160" o:spid="_x0000_s1060" style="position:absolute;left:3300;top:30964;width:4227;height:5613;visibility:visible;mso-wrap-style:square;v-text-anchor:middle" o:gfxdata="UEsDBBQABgAIAAAAIQDb4fbL7gAAAIUBAAATAAAAW0NvbnRlbnRfVHlwZXNdLnhtbHyQz07DMAyH 70i8Q+QralM4IITa7kDhCAiNB7ASt43WOlEcyvb2pNu4IODoPz9/n1xv9vOkForiPDdwXVagiI23 jocG3rdPxR0oScgWJ8/UwIEENu3lRb09BBKV0ywNjCmFe63FjDSjlD4Q50nv44wpl3HQAc0OB9I3 VXWrjedEnIq03oC27qjHjympx31un0wiTQLq4bS4shrAECZnMGVTvbD9QSnOhDInjzsyuiBXWQP0 r4R18jfgnHvJr4nOknrFmJ5xzhraRtHWf3Kkpfz/yGo5S+H73hkquyhdjr3R8m2lj09svwAAAP// AwBQSwMEFAAGAAgAAAAhAFr0LFu/AAAAFQEAAAsAAABfcmVscy8ucmVsc2zPwWrDMAwG4Ptg72B0 X5TuUMaI01uh19I+gLGVxCy2jGSy9e1nemrHjpL4P0nD4SetZiPRyNnCruvBUPYcYp4tXC/Htw8w Wl0ObuVMFm6kcBhfX4Yzra62kC6xqGlKVgtLreUTUf1CyWnHhXKbTCzJ1VbKjMX5LzcTvvf9HuXR gPHJNKdgQU5hB+ZyK23zHztFL6w81c5zQp6m6P9TMfB3PtPWFCczVQtB9N4U2rp2HOA44NMz4y8A AAD//wMAUEsDBBQABgAIAAAAIQDeVbssyAAAAOIAAAAPAAAAZHJzL2Rvd25yZXYueG1sRI9Na8JA EIbvhf6HZQpepE60GCR1lVIIVCpi03ofstMkmJ1Ns6vGf+8ehB5f3i+e5XqwrTpz7xsnGqaTBBRL 6UwjlYaf7/x5AcoHEkOtE9ZwZQ/r1ePDkjLjLvLF5yJUKo6Iz0hDHUKXIfqyZkt+4jqW6P263lKI sq/Q9HSJ47bFWZKkaKmR+FBTx+81l8fiZDXgeMO47wrM/z7xcEq3hx0dc61HT8PbK6jAQ/gP39sf RkP6Mpsv5tM0QkSkiAO4ugEAAP//AwBQSwECLQAUAAYACAAAACEA2+H2y+4AAACFAQAAEwAAAAAA AAAAAAAAAAAAAAAAW0NvbnRlbnRfVHlwZXNdLnhtbFBLAQItABQABgAIAAAAIQBa9CxbvwAAABUB AAALAAAAAAAAAAAAAAAAAB8BAABfcmVscy8ucmVsc1BLAQItABQABgAIAAAAIQDeVbssyAAAAOIA AAAPAAAAAAAAAAAAAAAAAAcCAABkcnMvZG93bnJldi54bWxQSwUGAAAAAAMAAwC3AAAA/AIAAAAA " fillcolor="#f4a11e" stroked="f">
                           <v:textbox inset="2.53958mm,2.53958mm,2.53958mm,2.53958mm">
                             <w:txbxContent>
                               <w:p>
@@ -6642,7 +6544,7 @@
                             </w:txbxContent>
                           </v:textbox>
                         </v:oval>
-                        <v:rect id="Rectangle 2058375002" o:spid="_x0000_s1061" style="position:absolute;left:5402;top:30964;width:87450;height:5613;visibility:visible;mso-wrap-style:square;v-text-anchor:middle" o:gfxdata="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" fillcolor="#f4a11e" stroked="f">
+                        <v:rect id="Rectangle 2058375002" o:spid="_x0000_s1061" style="position:absolute;left:5402;top:30964;width:87450;height:5613;visibility:visible;mso-wrap-style:square;v-text-anchor:middle" o:gfxdata="UEsDBBQABgAIAAAAIQDb4fbL7gAAAIUBAAATAAAAW0NvbnRlbnRfVHlwZXNdLnhtbHyQz07DMAyH 70i8Q+QralM4IITa7kDhCAiNB7ASt43WOlEcyvb2pNu4IODoPz9/n1xv9vOkForiPDdwXVagiI23 jocG3rdPxR0oScgWJ8/UwIEENu3lRb09BBKV0ywNjCmFe63FjDSjlD4Q50nv44wpl3HQAc0OB9I3 VXWrjedEnIq03oC27qjHjympx31un0wiTQLq4bS4shrAECZnMGVTvbD9QSnOhDInjzsyuiBXWQP0 r4R18jfgnHvJr4nOknrFmJ5xzhraRtHWf3Kkpfz/yGo5S+H73hkquyhdjr3R8m2lj09svwAAAP// AwBQSwMEFAAGAAgAAAAhAFr0LFu/AAAAFQEAAAsAAABfcmVscy8ucmVsc2zPwWrDMAwG4Ptg72B0 X5TuUMaI01uh19I+gLGVxCy2jGSy9e1nemrHjpL4P0nD4SetZiPRyNnCruvBUPYcYp4tXC/Htw8w Wl0ObuVMFm6kcBhfX4Yzra62kC6xqGlKVgtLreUTUf1CyWnHhXKbTCzJ1VbKjMX5LzcTvvf9HuXR gPHJNKdgQU5hB+ZyK23zHztFL6w81c5zQp6m6P9TMfB3PtPWFCczVQtB9N4U2rp2HOA44NMz4y8A AAD//wMAUEsDBBQABgAIAAAAIQDeWmXzzAAAAOMAAAAPAAAAZHJzL2Rvd25yZXYueG1sRI/BTsMw EETvSPyDtUjcqF2XlpLWrRASEgcONNBDb6t4SdLG6xA7afr3GAmJ42hm3mjW29E1YqAu1J4NTCcK BHHhbc2lgc+Pl7sliBCRLTaeycCFAmw311drzKw/846GPJYiQThkaKCKsc2kDEVFDsPEt8TJ+/Kd w5hkV0rb4TnBXSO1UgvpsOa0UGFLzxUVp7x3Bh6HWh++Z41b7Md7fczfent57425vRmfViAijfE/ /Nd+tQa0mi9nD3OlNPx+Sn9Abn4AAAD//wMAUEsBAi0AFAAGAAgAAAAhANvh9svuAAAAhQEAABMA AAAAAAAAAAAAAAAAAAAAAFtDb250ZW50X1R5cGVzXS54bWxQSwECLQAUAAYACAAAACEAWvQsW78A AAAVAQAACwAAAAAAAAAAAAAAAAAfAQAAX3JlbHMvLnJlbHNQSwECLQAUAAYACAAAACEA3lpl88wA AADjAAAADwAAAAAAAAAAAAAAAAAHAgAAZHJzL2Rvd25yZXYueG1sUEsFBgAAAAADAAMAtwAAAAAD AAAAAA== " fillcolor="#f4a11e" stroked="f">
                           <v:textbox inset="2.53958mm,2.53958mm,2.53958mm,2.53958mm">
                             <w:txbxContent>
                               <w:p>
@@ -6719,14 +6621,382 @@
                 <w:szCs w:val="32"/>
               </w:rPr>
               <w:lastRenderedPageBreak/>
-              <w:t>T</w:t>
-            </w:r>
-            <w:r>
+              <w:t>TASK 1 - Report: "Approaches to developing, managing and leading different types of teams"</w:t>
+            </w:r>
+          </w:p>
+          <w:p>
+            <w:pPr>
+              <w:pStyle w:val="Heading2"/>
+              <w:rPr>
+                <w:sz w:val="28"/>
+                <w:szCs w:val="28"/>
+              </w:rPr>
+            </w:pPr>
+            <w:r>
+              <w:rPr>
+                <w:sz w:val="28"/>
+                <w:szCs w:val="28"/>
+              </w:rPr>
+              <w:t>AC1.1 Part 1: Leadership styles</w:t>
+            </w:r>
+          </w:p>
+          <w:p>
+            <w:pPr>
+              <w:spacing w:after="160"/>
+            </w:pPr>
+            <w:r>
+              <w:t>Several leadership styles are relevant to my position, and I move between them: transformational, transactional, servant, situational and, occasionally, laissez-faire.</w:t>
+            </w:r>
+          </w:p>
+          <w:p>
+            <w:pPr>
+              <w:spacing w:after="160"/>
+            </w:pPr>
+            <w:r>
+              <w:t xml:space="preserve">Transformational leadership leads through vision and inspiration, raising what people believe they are capable of (Burns, 1978; Bass, 1985). This matters</w:t>
+            </w:r>
+            <w:r>
+              <w:rPr>
+                <w:i/>
+              </w:rPr>
+              <w:t/>
+            </w:r>
+            <w:r>
+              <w:t xml:space="preserve"/>
+            </w:r>
+            <w:r>
+              <w:rPr>
+                <w:i/>
+              </w:rPr>
+              <w:t/>
+            </w:r>
+            <w:r>
+              <w:t xml:space="preserve"> because I am currently asking Digital Leads to do foundational, administrative and frankly unglamorous work, in a role that is voluntary. They need to understand where we are going. I have also used an analogy from my previous work as a sound engineer: audiences celebrate the performer and the sound they create, but rarely recognise the engineer whose work shapes it, except when something goes wrong. The work the Digital Leads are doing now is of that kind. The limitation of this style is that it depends heavily on my own energy and presence, which risks creating dependency on me rather than sustainable capability in them.</w:t>
+            </w:r>
+          </w:p>
+          <w:p>
+            <w:pPr>
+              <w:spacing w:after="160"/>
+            </w:pPr>
+            <w:r>
+              <w:t>Transactional leadership operates through exchange. In its traditional form it is unavailable to me: I cannot offer pay, responsibility points or promotion. However, the underlying principle remains usable through other currencies. I can support Digital Leads to develop practice they can evidence when applying for leadership roles. I can take them to conferences in London or Birmingham, put them forward to decision makers for Level 3, 4 and 5 coaching and mentoring qualifications, and celebrate their work publicly across the college as our future leaders. The exchange is career capital rather than remuneration. The limitation is that I hold no budget autonomy. I rely on approval from my line manager and from decision makers for qualification places, so I can promise very little directly, although I have been given authority to make the offer subject to approval.</w:t>
+            </w:r>
+          </w:p>
+          <w:p>
+            <w:pPr>
+              <w:spacing w:after="160"/>
+            </w:pPr>
+            <w:r>
+              <w:t xml:space="preserve">Servant leadership describes the leader as existing to serve the growth of others, and this is the position I hold (Greenleaf, 1977). I am a coach</w:t>
+            </w:r>
+            <w:r>
+              <w:rPr>
+                <w:i/>
+              </w:rPr>
+              <w:t/>
+            </w:r>
+            <w:r>
+              <w:t xml:space="preserve"> to the Digital Leads. The more I develop them, the more innovative the work becomes. It is their drive and their digital learning; I am a resource for them. The tension is that I occupy two positions simultaneously. I am also the architect of the mechanics and metrics, the person who reports upwards and holds accountability for whether we are meeting our objectives. Serving and holding to account are not always comfortable together.</w:t>
+            </w:r>
+          </w:p>
+          <w:p>
+            <w:pPr>
+              <w:spacing w:after="160"/>
+            </w:pPr>
+            <w:r>
+              <w:t xml:space="preserve">Situational leadership explains how I work across a network of very different individuals (Hersey and Blanchard, 1993). Some Digital Leads</w:t>
+            </w:r>
+            <w:r>
+              <w:rPr>
+                <w:i/>
+              </w:rPr>
+              <w:t xml:space="preserve"/>
+            </w:r>
+            <w:r>
+              <w:t xml:space="preserve"> are highly experienced and need only a framework and a collegiate direction before driving their own agenda. Others are capable and keen but need a sounding board to shape their vision for their department. A third group have less confidence and need more direct guidance, more of my time, and to see how I think and work so that they can become more autonomous over time. The limitation is that it depends on reading readiness accurately, and readiness is not fixed. It is task-specific and shifting: a Digital Lead may be confident with the audit itself but less confident delivering training to their team. Adjusting style to the situation rather than to the person is therefore more useful, but it requires sustained relationship and ongoing communication with each Digital Lead to remain effective.</w:t>
+            </w:r>
+          </w:p>
+          <w:p>
+            <w:pPr>
+              <w:spacing w:after="160"/>
+            </w:pPr>
+            <w:r>
+              <w:t xml:space="preserve">There are occasions when the situation, rather than the person, dictates the style. Where an audit identifies a GDPR breach or a potential breach, I cannot coach someone towards the answer. The problem has to be fixed immediately, and the learning put in place afterwards so it does not recur. In those moments I intervene rather than guide.</w:t>
+            </w:r>
+          </w:p>
+          <w:p>
+            <w:pPr>
+              <w:spacing w:after="160"/>
+            </w:pPr>
+          </w:p>
+          <w:p>
+            <w:pPr>
+              <w:pStyle w:val="Heading2"/>
+              <w:rPr>
+                <w:sz w:val="28"/>
+                <w:szCs w:val="28"/>
+              </w:rPr>
+            </w:pPr>
+            <w:r>
+              <w:rPr>
+                <w:sz w:val="28"/>
+                <w:szCs w:val="28"/>
+              </w:rPr>
+              <w:lastRenderedPageBreak/>
+              <w:t>AC1.1 Part 2: Models</w:t>
+            </w:r>
+          </w:p>
+          <w:p>
+            <w:pPr>
+              <w:spacing w:after="160"/>
+            </w:pPr>
+            <w:r>
+              <w:t xml:space="preserve">Lencioni's model is the one that aligns most closely with my situation, because accountability is my known weak point and Lencioni argues that accountability cannot exist without trust beneath it (Lencioni, 2002). This is why</w:t>
+            </w:r>
+            <w:r>
+              <w:rPr>
+                <w:i/>
+              </w:rPr>
+              <w:t/>
+            </w:r>
+            <w:r>
+              <w:t xml:space="preserve"> I invested in relationship first. I opened with the Digital Leads by presenting what I believed we would find across the college and my reasoning for it: that we have a dirty kitchen, but we all know how to clean a kitchen. The Jisc Discovery question set in December suggested we know about accessibility, while self-assessments from Heads of Area suggested we are not good at doing it. Our task was to find out what it really looked like. I believe trust was built at that point because I could explain the narrative honestly and show why this unglamorous, foundational work is what everything else depends on.</w:t>
+            </w:r>
+          </w:p>
+          <w:p>
+            <w:pPr>
+              <w:spacing w:after="160"/>
+            </w:pPr>
+            <w:r>
+              <w:t xml:space="preserve">Since then I have worked at maintaining those relationships. I respond to their communications first and as quickly as I can. I answer the phone every time. If they want me on their site, I go. If they want training delivered, I deliver it whenever they need it. I am not there to do the work for them, but to enable them to thrive in the role.</w:t>
+            </w:r>
+          </w:p>
+          <w:p>
+            <w:pPr>
+              <w:spacing w:after="160"/>
+            </w:pPr>
+            <w:r>
+              <w:t>The clear limitation of this model in my context is time. An Ofsted inspection is pending and expected within the next few months, and trust takes time to build. What I am keen to ensure is that if we are inspected, we can demonstrate that we understand the picture we are currently looking at, that we have an action plan to address it, and that things are moving positively forward.</w:t>
+            </w:r>
+          </w:p>
+          <w:p>
+            <w:pPr>
+              <w:spacing w:after="160"/>
+            </w:pPr>
+            <w:r>
+              <w:t xml:space="preserve">Katzenbach and Smith distinguish between a working group and a real team, the difference being shared purpose and mutual accountability (Katzenbach and Smith, 1993). Judged against that</w:t>
+            </w:r>
+            <w:r>
+              <w:rPr>
+                <w:i/>
+              </w:rPr>
+              <w:t/>
+            </w:r>
+            <w:r>
+              <w:t>, the Digital Leads are currently a working group: a network of individuals with a common task rather than a team. My intention is that they become a community that shares good practice, shares progress, and supports each other through problem-solving, and from there a genuine team, because they recognise that what they are doing together drives improvement across the organisation.</w:t>
+            </w:r>
+          </w:p>
+          <w:p>
+            <w:pPr>
+              <w:spacing w:after="160"/>
+            </w:pPr>
+          </w:p>
+          <w:p>
+            <w:pPr>
+              <w:pStyle w:val="Heading2"/>
+              <w:rPr>
+                <w:sz w:val="28"/>
+                <w:szCs w:val="28"/>
+              </w:rPr>
+            </w:pPr>
+            <w:r>
+              <w:rPr>
+                <w:sz w:val="28"/>
+                <w:szCs w:val="28"/>
+              </w:rPr>
+              <w:t>AC1.2: Analyse strategies for managing team leaders</w:t>
+            </w:r>
+          </w:p>
+          <w:p>
+            <w:pPr>
+              <w:spacing w:after="160"/>
+            </w:pPr>
+            <w:r>
+              <w:t>Managing team leaders in this context means leading colleagues who are themselves responsible for others, albeit in a voluntary capacity, and doing so from a position where I hold no authority.</w:t>
+            </w:r>
+          </w:p>
+          <w:p>
+            <w:pPr>
+              <w:spacing w:after="160"/>
+            </w:pPr>
+            <w:r>
+              <w:t xml:space="preserve">The first strategy is building credibility rather than capability alone. Most Digital Leads can already carry out the technical work. What they need is standing within their own department. This is why I use the staff newsletter and the internal SharePoint to make their work visible, and why I push them towards leading Teach Meets and training sessions with their own teams rather than delivering those sessions myself. I am also developing them as future leaders by taking them to conferences and putting them forward for mentoring and coaching qualifications.</w:t>
+            </w:r>
+          </w:p>
+          <w:p>
+            <w:pPr>
+              <w:spacing w:after="160"/>
+            </w:pPr>
+            <w:r>
+              <w:t>The second strategy is deliberately not working around them. I hold the audit data, so I know which members of staff need support, and I could approach those individuals directly. Doing so would be faster, but it would undermine the Digital Lead's authority and credibility in their own department, which are the two things I most need them to have.</w:t>
+            </w:r>
+          </w:p>
+          <w:p>
+            <w:pPr>
+              <w:spacing w:after="160"/>
+            </w:pPr>
+            <w:r>
+              <w:t>This shapes how the action plans work. Rather than issuing an action plan, I present it to the Digital Lead for approval. I set out what I believe needs to happen and ask whether that is what they would like to happen. I then ask whether they would like to put forward any members of staff for me to work with directly. This gives them ownership of their team's development, with my support, rather than positioning me as the person who intervenes in their area.</w:t>
+            </w:r>
+          </w:p>
+          <w:p>
+            <w:pPr>
+              <w:spacing w:after="160"/>
+            </w:pPr>
+            <w:r>
+              <w:lastRenderedPageBreak/>
+              <w:t>The limitation of this approach is pace. I hold the data and know which staff need support, so I could act directly and see rapid impact. Going through the Digital Lead is slower. But undercutting their authority for the sake of quick wins creates a longer-term problem: if I damage a Digital Lead's credibility, or lose their buy-in, there will be work later that I cannot do at all.</w:t>
+            </w:r>
+          </w:p>
+          <w:p>
+            <w:pPr>
+              <w:spacing w:after="160"/>
+            </w:pPr>
+            <w:r>
+              <w:t xml:space="preserve">This reflects Spillane's account of distributed leadership, where leadership is enacted through others rather than held by one person (Spillane, 2006). My leadership travels</w:t>
+            </w:r>
+            <w:r>
+              <w:rPr>
+                <w:i/>
+              </w:rPr>
+              <w:t/>
+            </w:r>
+            <w:r>
+              <w:t xml:space="preserve"> through the Digital Leads, and supporting them in that role, even as volunteers, achieves more over time than I could deliver alone. Wageman similarly finds that team leaders are most effective when they have autonomy, clear goals and support (Wageman, 2001). That is the basis</w:t>
+            </w:r>
+            <w:r>
+              <w:rPr>
+                <w:i/>
+              </w:rPr>
+              <w:t/>
+            </w:r>
+            <w:r>
+              <w:t xml:space="preserve"> of my approach: the more I develop Digital Leads as future leaders, the greater their impact on digital learning across the organisation.</w:t>
+            </w:r>
+          </w:p>
+          <w:p>
+            <w:pPr>
+              <w:spacing w:after="160"/>
+            </w:pPr>
+          </w:p>
+          <w:p>
+            <w:pPr>
+              <w:pStyle w:val="Heading2"/>
+              <w:rPr>
+                <w:sz w:val="28"/>
+                <w:szCs w:val="28"/>
+              </w:rPr>
+            </w:pPr>
+            <w:r>
+              <w:rPr>
+                <w:sz w:val="28"/>
+                <w:szCs w:val="28"/>
+              </w:rPr>
+              <w:t>AC1.3: Develop approaches to respond to the challenges of managing and leading multiple and remote teams</w:t>
+            </w:r>
+          </w:p>
+          <w:p>
+            <w:pPr>
+              <w:spacing w:after="160"/>
+            </w:pPr>
+            <w:r>
+              <w:t>Working with the Digital Leads presents several challenges. They are geographically dispersed across nine sites. Most know very little about each other and many have never met. Everything operates asynchronously, because timetables differ and there is no common free period across the network. Sites also differ in their infrastructure, with variation in Wi-Fi reliability, device availability and the wider context in which staff work.</w:t>
+            </w:r>
+          </w:p>
+          <w:p>
+            <w:pPr>
+              <w:spacing w:after="160"/>
+            </w:pPr>
+            <w:r>
+              <w:t>Several approaches are already in place. A dedicated Teams space carries messages, resources, direction and deadlines. I maintain weekly or fortnightly contact with each Digital Lead individually. I travel to their site when asked. I use a differentiated approach according to what each person needs rather than applying a single method across the network.</w:t>
+            </w:r>
+          </w:p>
+          <w:p>
+            <w:pPr>
+              <w:spacing w:after="160"/>
+            </w:pPr>
+            <w:r>
+              <w:t>Two further approaches would strengthen this, both of which I have discussed with my line manager.</w:t>
+            </w:r>
+          </w:p>
+          <w:p>
+            <w:pPr>
+              <w:spacing w:after="160"/>
+            </w:pPr>
+            <w:r>
+              <w:t>The first is buddying areas together, so that Digital Leads have a counterpart to work alongside rather than operating in isolation. This is under discussion. Some areas are keen; others are less aligned to the idea, so it would need to be built where the willingness exists rather than imposed across the network.</w:t>
+            </w:r>
+          </w:p>
+          <w:p>
+            <w:pPr>
+              <w:spacing w:after="160"/>
+            </w:pPr>
+            <w:r>
+              <w:t>The second is a termly meeting of all Digital Leads. This directly addresses the point made earlier in this report: judged against Katzenbach and Smith, the network currently functions as a working group of individuals with a common task rather than a team, and remote working does not generate the shared purpose and mutual accountability that would change that. A face-to-face meeting would create the conditions for sharing practice and problem-solving together. It would need careful planning. Travel arrangements would be required for those coming from other sites, and lesson cover may need to be arranged where the meeting clashes with teaching commitments. These are practical costs that would need approval, but a face-to-face meeting is the most direct route to building the relationships that remote working does not generate on its own.</w:t>
+            </w:r>
+          </w:p>
+          <w:p>
+            <w:pPr>
+              <w:spacing w:after="160"/>
+            </w:pPr>
+          </w:p>
+          <w:p>
+            <w:pPr>
+              <w:spacing w:after="160"/>
+            </w:pPr>
+          </w:p>
+          <w:p>
+            <w:pPr>
+              <w:spacing w:after="160"/>
+              <w:rPr>
+                <w:b/>
+                <w:sz w:val="26"/>
+              </w:rPr>
+            </w:pPr>
+          </w:p>
+          <w:p>
+            <w:pPr>
+              <w:spacing w:after="160"/>
+              <w:rPr>
+                <w:b/>
+                <w:sz w:val="26"/>
+              </w:rPr>
+            </w:pPr>
+          </w:p>
+          <w:p>
+            <w:pPr>
+              <w:spacing w:after="160"/>
+              <w:rPr>
+                <w:b/>
+                <w:sz w:val="26"/>
+              </w:rPr>
+            </w:pPr>
+          </w:p>
+          <w:p>
+            <w:pPr>
+              <w:pStyle w:val="Heading1"/>
               <w:rPr>
                 <w:sz w:val="32"/>
                 <w:szCs w:val="32"/>
               </w:rPr>
-              <w:t>ASK 1 — Report: "Approaches to developing, managing and leading different types of teams"</w:t>
+            </w:pPr>
+            <w:r>
+              <w:rPr>
+                <w:sz w:val="32"/>
+                <w:szCs w:val="32"/>
+              </w:rPr>
+              <w:lastRenderedPageBreak/>
+              <w:t>TASK 2 - Briefing paper: "Methods that can be used to monitor, manage and improve individual and team performance"</w:t>
             </w:r>
           </w:p>
           <w:p>
@@ -6742,7 +7012,7 @@
                 <w:sz w:val="28"/>
                 <w:szCs w:val="28"/>
               </w:rPr>
-              <w:t>AC1.1 Part 1 — Leadership styles</w:t>
+              <w:t>AC2.1 Part 1: Individuals</w:t>
             </w:r>
           </w:p>
           <w:p>
@@ -6750,7 +7020,7 @@
               <w:spacing w:after="160"/>
             </w:pPr>
             <w:r>
-              <w:t>Several leadership styles are relevant to my position, and I move between them: transformational, transactional, servant, situational and, occasionally, laissez-faire.</w:t>
+              <w:t xml:space="preserve">Selection begins with diagnosis. The Digital Health Check data shows specifically what each Digital Lead has assessed and where the gaps sit, which allows intervention to be targeted at the right person, at the right level. It is entirely possible for a department to be strong overall while particular individuals are not, in which case those individuals can be trained rather than the whole team. The reverse also occurs, where the data shows an entire team, or a substantial part of it, making the same mistakes. Having the data allows the decision to be made accurately rather than by assumption.</w:t>
             </w:r>
           </w:p>
           <w:p>
@@ -6758,114 +7028,40 @@
               <w:spacing w:after="160"/>
             </w:pPr>
             <w:r>
-              <w:t xml:space="preserve">Transformational leadership leads through vision and inspiration, raising what people believe they are capable of. Burns, J.M. (1978) </w:t>
+              <w:t xml:space="preserve">The most common error I have made in selecting activities is assuming a level of underlying knowledge that is not there, and pitching the activity too high as a result. This is a diagnostic failure rather than a delivery one: the activity may be well designed, but if it assumes basics the individual does not hold, it cannot land. It has required me to check more carefully what staff actually need before selecting the activity.</w:t>
+            </w:r>
+          </w:p>
+          <w:p>
+            <w:pPr>
+              <w:spacing w:after="160"/>
+            </w:pPr>
+            <w:r>
+              <w:t>Severity of need and available capacity then determine the form. Some individuals require only a nudge: a resource handed over, or a reminder to check that alt text is being applied consistently. Others need instructional coaching or mentoring to move towards working independently at the expected level. Staff with full timetables cannot regularly access one-to-one coaching or Teach Meets, so I maintain SharePoint sites containing guides, videos, advice and checklists supporting independent learning at a time that suits them. Where practice does not change over time, the process escalates to something more formal. For teams already working well, the discussion focuses instead on innovation and showcasing what they have achieved.</w:t>
+            </w:r>
+          </w:p>
+          <w:p>
+            <w:pPr>
+              <w:spacing w:after="160"/>
+            </w:pPr>
+            <w:r>
+              <w:t>Readiness is a further factor. Some staff, Digital Leads and Heads of Area will be defensive or resistant, and in terms of the adoption curve may sit among the laggards. These individuals need a different model of support to become ready and confident, rather than the same activity delivered more insistently.</w:t>
+            </w:r>
+          </w:p>
+          <w:p>
+            <w:pPr>
+              <w:spacing w:after="160"/>
+            </w:pPr>
+            <w:r>
+              <w:t xml:space="preserve">Varying the format also aligns with cognitive style. Sadler-Smith, E., Allinson, C.W. and Hayes, J. (2000) 'Learning Preferences and Cognitive Style: Some Implications for Continuing Professional Development', </w:t>
             </w:r>
             <w:r>
               <w:rPr>
                 <w:i/>
               </w:rPr>
-              <w:t>Leadership</w:t>
-            </w:r>
-            <w:r>
-              <w:t xml:space="preserve">, Harper &amp; Row, New York; Bass, B.M. (1985) </w:t>
-            </w:r>
-            <w:r>
-              <w:rPr>
-                <w:i/>
-              </w:rPr>
-              <w:t>Leadership and Performance Beyond Expectations</w:t>
-            </w:r>
-            <w:r>
-              <w:t>, Free Press, New York. This matters because I am currently asking Digital Leads to do foundational, administrative and frankly unglamorous work, in a role that is voluntary. They need to understand where we are going. I have also used an analogy from my previous work as a sound engineer: audiences celebrate the performer and the sound they create, but rarely recognise the engineer whose work shapes it, except when something goes wrong. The work the Digital Leads are doing now is of that kind. The limitatio</w:t>
-            </w:r>
-            <w:r>
-              <w:t>n of this style is that it depends heavily on my own energy and presence, which risks creating dependency on me rather than sustainable capability in them.</w:t>
-            </w:r>
-          </w:p>
-          <w:p>
-            <w:pPr>
-              <w:spacing w:after="160"/>
-            </w:pPr>
-            <w:r>
-              <w:t>Transactional leadership operates through exchange. In its traditional form it is unavailable to me: I cannot offer pay, responsibility points or promotion. However, the underlying principle remains usable through other currencies. I can support Digital Leads to develop practice they can evidence when applying for leadership roles. I can take them to conferences in London or Birmingham, put them forward to decision makers for Level 3, 4 and 5 coaching and mentoring qualifications, and celebrate their work p</w:t>
-            </w:r>
-            <w:r>
-              <w:t>ublicly across the college as our future leaders. The exchange is career capital rather than remuneration. The limitation is that I hold no budget autonomy. I rely on approval from my line manager and from decision makers for qualification places, so I can promise very little directly, although I have been given authority to make the offer subject to approval.</w:t>
-            </w:r>
-          </w:p>
-          <w:p>
-            <w:pPr>
-              <w:spacing w:after="160"/>
-            </w:pPr>
-            <w:r>
-              <w:t xml:space="preserve">Servant leadership describes the leader as existing to serve the growth of others, and this is the position I hold. Greenleaf, R.K. (1977) </w:t>
-            </w:r>
-            <w:r>
-              <w:rPr>
-                <w:i/>
-              </w:rPr>
-              <w:t>Servant Leadership: A Journey into the Nature of Legitimate Power and Greatness</w:t>
-            </w:r>
-            <w:r>
-              <w:t>, Paulist Press, New York. I am a coach to the Digital Leads. The more I develop them, the more innovative the work becomes. It is their drive and their digital learning; I am a resource for them. The tension is that I occupy two positions simultaneously. I am also the architect of the mechanics and metrics, the person who reports upwards and holds accountability for whether we are meeting our objectives. Serving and holding to account are not always comfortable together.</w:t>
-            </w:r>
-          </w:p>
-          <w:p>
-            <w:pPr>
-              <w:spacing w:after="160"/>
-            </w:pPr>
-            <w:r>
-              <w:t xml:space="preserve">Situational leadership explains how I work across a network of very different individuals. Hersey, P. and Blanchard, K.H. (1993) </w:t>
-            </w:r>
-            <w:r>
-              <w:rPr>
-                <w:i/>
-              </w:rPr>
-              <w:t xml:space="preserve">Management of Organizational </w:t>
-            </w:r>
-            <w:proofErr w:type="spellStart"/>
-            <w:r>
-              <w:rPr>
-                <w:i/>
-              </w:rPr>
-              <w:t>Behavior</w:t>
-            </w:r>
-            <w:proofErr w:type="spellEnd"/>
-            <w:r>
-              <w:rPr>
-                <w:i/>
-              </w:rPr>
-              <w:t>: Utilizing Human Resources</w:t>
-            </w:r>
-            <w:r>
-              <w:t xml:space="preserve">, 6th </w:t>
-            </w:r>
-            <w:proofErr w:type="spellStart"/>
-            <w:r>
-              <w:t>edn</w:t>
-            </w:r>
-            <w:proofErr w:type="spellEnd"/>
-            <w:r>
-              <w:t>, Prentice Hall, Englewood Cliffs NJ. Some Digital Leads are highly experienced and need only a framework and a collegiate direction before driving their own agenda. Others are capable and keen but need a sounding board to shape their vision for their department. A third group have less confidence and need more direct guidance, more of my time, and to see how I think and work so that they can become more autonomous over time. The limitation is that it depends on reading readiness accurately, and re</w:t>
-            </w:r>
-            <w:r>
-              <w:t>adiness is not fixed. It is task-specific and shifting: a Digital Lead may be confident with the audit itself but less confident delivering training to their team. Adjusting style to the situation rather than to the person is therefore more useful, but it requires sustained relationship and ongoing communication with each Digital Lead to remain effective.</w:t>
-            </w:r>
-          </w:p>
-          <w:p>
-            <w:pPr>
-              <w:spacing w:after="160"/>
-            </w:pPr>
-            <w:r>
-              <w:t xml:space="preserve">There are occasions when the situation, rather than the person, dictates the style. Where an audit identifies a GDPR breach or a potential breach, I cannot coach someone towards the answer. The problem </w:t>
-            </w:r>
-            <w:proofErr w:type="gramStart"/>
-            <w:r>
-              <w:t>has to</w:t>
-            </w:r>
-            <w:proofErr w:type="gramEnd"/>
-            <w:r>
-              <w:t xml:space="preserve"> be fixed immediately, and the learning put in place afterwards so it does not recur. In those moments I intervene rather than guide.</w:t>
+              <w:t>Management Learning</w:t>
+            </w:r>
+            <w:r>
+              <w:t>, 31, pp. 239–256. One person may prefer video they can pause and rewind; another a checklist to work through against the expectations; another someone alongside them while they make the changes. Providing multiple routes meets differing capacity and preference, and it makes escalation defensible: where someone has had several accessible routes to the same learning and practice still has not changed, escalation rests on evidence rather than assumption.</w:t>
             </w:r>
           </w:p>
           <w:p>
@@ -6886,8 +7082,41 @@
                 <w:sz w:val="28"/>
                 <w:szCs w:val="28"/>
               </w:rPr>
+              <w:t>AC2.1 Part 2: Teams</w:t>
+            </w:r>
+          </w:p>
+          <w:p>
+            <w:pPr>
+              <w:spacing w:after="160"/>
+            </w:pPr>
+            <w:r>
+              <w:t>Several factors operate at team level that do not apply when working with an individual.</w:t>
+            </w:r>
+          </w:p>
+          <w:p>
+            <w:pPr>
+              <w:spacing w:after="160"/>
+            </w:pPr>
+            <w:r>
+              <w:t xml:space="preserve">The first is Head of Area buy-in. To work with an individual I need that person's consent; to work with a whole team I need their manager's. Without it, a session can take place but the practice that follows it will not be reinforced.</w:t>
+            </w:r>
+          </w:p>
+          <w:p>
+            <w:pPr>
+              <w:spacing w:after="160"/>
+            </w:pPr>
+            <w:r>
+              <w:t>The second is group dynamic. As in any classroom, one person can derail the tone of a session and change both how the content lands and the direction the work then takes. This makes the opening important: bringing everyone together to understand the journey and the overall arc before working through the detail.</w:t>
+            </w:r>
+          </w:p>
+          <w:p>
+            <w:pPr>
+              <w:spacing w:after="160"/>
+            </w:pPr>
+            <w:r>
+              <w:t xml:space="preserve">The third is timetable and cover cost. It is unlikely that lessons can be covered to release a whole team, and the most likely answer to that request is no. There are, however, times when teams already meet, and the </w:t>
               <w:lastRenderedPageBreak/>
-              <w:t>AC1.1 Part 2 — Models</w:t>
+              <w:t>practical response is for me to be flexible enough to meet them in the space they already have rather than asking the organisation to create one.</w:t>
             </w:r>
           </w:p>
           <w:p>
@@ -6895,19 +7124,7 @@
               <w:spacing w:after="160"/>
             </w:pPr>
             <w:r>
-              <w:t xml:space="preserve">Lencioni's model is the one that aligns most closely with my situation, because accountability is my known weak point and Lencioni argues that accountability cannot exist without trust beneath it. Lencioni, P. (2002) </w:t>
-            </w:r>
-            <w:r>
-              <w:rPr>
-                <w:i/>
-              </w:rPr>
-              <w:t>The Five Dysfunctions of a Team: A Leadership Fable</w:t>
-            </w:r>
-            <w:r>
-              <w:t xml:space="preserve">, Jossey-Bass, San Francisco. This is why I invested in relationship first. I opened with the Digital Leads by presenting what I believed we would find across the college and my reasoning for it: that we have a dirty kitchen, but we all know how to clean a kitchen. The Jisc Discovery question set in December suggested we know about accessibility, while self-assessments from Heads of Area suggested we are not good at doing it. Our task was to find out what it really looked like. I believe trust was built at </w:t>
-            </w:r>
-            <w:r>
-              <w:t>that point because I could explain the narrative honestly and show why this unglamorous, foundational work is what everything else depends on.</w:t>
+              <w:t>Existing team culture matters. In one team an awkward relationship dynamic, compounded by significant changes in personnel, means learning and resources are not readily shared. I am working with that team alongside their Teaching, Learning and Assessment Manager, with the aim of moving towards a culture where resources are shared and peer support helps them develop as a group.</w:t>
             </w:r>
           </w:p>
           <w:p>
@@ -6915,15 +7132,7 @@
               <w:spacing w:after="160"/>
             </w:pPr>
             <w:r>
-              <w:t xml:space="preserve">Since </w:t>
-            </w:r>
-            <w:proofErr w:type="gramStart"/>
-            <w:r>
-              <w:t>then</w:t>
-            </w:r>
-            <w:proofErr w:type="gramEnd"/>
-            <w:r>
-              <w:t xml:space="preserve"> I have worked at maintaining those relationships. I respond to their communications first and as quickly as I can. I answer the phone every time. If they want me on their site, I go. If they want training delivered, I deliver it whenever they need it. I am not there to do the work for them, but to enable them to thrive in the role.</w:t>
+              <w:t>Spread of need is a further consideration. The Health Check data shows whether an entire team, a portion of it, or specific individuals require training. Where only part of a team needs an intervention, that group can be worked with directly and the remainder's time protected, either for bespoke support later or for more innovative work.</w:t>
             </w:r>
           </w:p>
           <w:p>
@@ -6931,32 +7140,7 @@
               <w:spacing w:after="160"/>
             </w:pPr>
             <w:r>
-              <w:t>The clear limitation of this model in my context is time. An Ofsted inspection is pending and expected within the next few months, and trust takes time to build. What I am keen to ensure is that if we are inspected, we can demonstrate that we understand the picture we are currently looking at, that we have an action plan to address it, and that things are moving positively forward.</w:t>
-            </w:r>
-          </w:p>
-          <w:p>
-            <w:pPr>
-              <w:spacing w:after="160"/>
-            </w:pPr>
-            <w:r>
-              <w:t xml:space="preserve">Katzenbach and Smith distinguish between a working group and a real </w:t>
-            </w:r>
-            <w:proofErr w:type="gramStart"/>
-            <w:r>
-              <w:t>team,</w:t>
-            </w:r>
-            <w:proofErr w:type="gramEnd"/>
-            <w:r>
-              <w:t xml:space="preserve"> the difference being shared purpose and mutual accountability. Katzenbach, J.R. and Smith, D.K. (1993) </w:t>
-            </w:r>
-            <w:r>
-              <w:rPr>
-                <w:i/>
-              </w:rPr>
-              <w:t>The Wisdom of Teams: Creating the High-Performance Organization</w:t>
-            </w:r>
-            <w:r>
-              <w:t>, Harvard Business School Press, Boston. Judged against that, the Digital Leads are currently a working group: a network of individuals with a common task rather than a team. My intention is that they become a community that shares good practice, shares progress, and supports each other through problem-solving, and from there a genuine team, because they recognise that what they are doing together drives improvement across the organisation.</w:t>
+              <w:t xml:space="preserve">How a team arrives at the need also shapes what can be delivered. The Digital Lead for English raised accessibility following the audit, and I communicated the data to the Deputy Head of Area, who recognised that staff were not consistently embedding it. The point landed fully only once we discussed the specific cohort: learners who did not achieve a grade 4 in GCSE English, whose barriers are likely to be significant, and for whom some existing material actively creates further barriers. She then wanted to understand cognitive overload and how material design can nurture curiosity. The audit surfaced the issue; framing why it mattered for that cohort is where my role adds something the Digital Lead could not.</w:t>
             </w:r>
           </w:p>
           <w:p>
@@ -6977,7 +7161,7 @@
                 <w:sz w:val="28"/>
                 <w:szCs w:val="28"/>
               </w:rPr>
-              <w:t>AC1.2 — Analyse strategies for managing team leaders</w:t>
+              <w:t>AC2.2: Coaching and mentoring models</w:t>
             </w:r>
           </w:p>
           <w:p>
@@ -6985,7 +7169,7 @@
               <w:spacing w:after="160"/>
             </w:pPr>
             <w:r>
-              <w:t>Managing team leaders in this context means leading colleagues who are themselves responsible for others, albeit in a voluntary capacity, and doing so from a position where I hold no authority.</w:t>
+              <w:t xml:space="preserve">Coaching and mentoring are related but distinct. Coaching assumes the coachee already holds the answer, and the coach's role is to draw it out so that the person has full ownership of the response. Mentoring assumes greater experience on the mentor's part, and involves offering advice, guidance and direction where it is needed.</w:t>
             </w:r>
           </w:p>
           <w:p>
@@ -6993,10 +7177,7 @@
               <w:spacing w:after="160"/>
             </w:pPr>
             <w:r>
-              <w:t>The first strategy is building credibility rather than capability alone. Most Digital Leads can already carry out the technical work. What they need is standing within their own department. This is why I use the staff newsletter and the internal SharePoint to make their work visible, and why I push them towards leading Teach Meets and training sessions with their own teams rather than delivering those sessions myself. I am also developing them as future leaders by taking them to conferences and putting them</w:t>
-            </w:r>
-            <w:r>
-              <w:t xml:space="preserve"> forward for mentoring and coaching qualifications.</w:t>
+              <w:t>In the work with Digital Leads both are necessary, and which applies depends on where the individual is in their development rather than on a fixed preference.</w:t>
             </w:r>
           </w:p>
           <w:p>
@@ -7004,7 +7185,16 @@
               <w:spacing w:after="160"/>
             </w:pPr>
             <w:r>
-              <w:t>The second strategy is deliberately not working around them. I hold the audit data, so I know which members of staff need support, and I could approach those individuals directly. Doing so would be faster, but it would undermine the Digital Lead's authority and credibility in their own department, which are the two things I most need them to have.</w:t>
+              <w:t xml:space="preserve">Mentoring applies where a Digital Lead does not yet hold the answer, which is the case with accessibility. Most have not previously worked in this area in any depth, so guiding them through it is appropriate. For those with less experience, this most closely resembles Knight's instructional coaching model, developed for educational settings and focused specifically on classroom practice. Knight, J. (2007) </w:t>
+            </w:r>
+            <w:r>
+              <w:rPr>
+                <w:i/>
+              </w:rPr>
+              <w:t>Instructional Coaching: A Partnership Approach to Improving Instruction</w:t>
+            </w:r>
+            <w:r>
+              <w:t>, Corwin Press, Thousand Oaks CA. That model suits the work on accessible resources by design, because the conversation is about concrete teaching practice and how it affects the learners in the room.</w:t>
             </w:r>
           </w:p>
           <w:p>
@@ -7012,7 +7202,16 @@
               <w:spacing w:after="160"/>
             </w:pPr>
             <w:r>
-              <w:t>This shapes how the action plans work. Rather than issuing an action plan, I present it to the Digital Lead for approval. I set out what I believe needs to happen and ask whether that is what they would like to happen. I then ask whether they would like to put forward any members of staff for me to work with directly. This gives them ownership of their team's development, with my support, rather than positioning me as the person who intervenes in their area.</w:t>
+              <w:t xml:space="preserve">Coaching applies once a Digital Lead holds their own direction and ambition for how digital learning develops in their department. At that point Whitmore's GROW model becomes more useful. Whitmore, J. (2009) </w:t>
+            </w:r>
+            <w:r>
+              <w:rPr>
+                <w:i/>
+              </w:rPr>
+              <w:t xml:space="preserve">Coaching for Performance: GROWing Human Potential and Purpose</w:t>
+            </w:r>
+            <w:r>
+              <w:t xml:space="preserve">, 4th edn, Nicholas Brealey, London. Working through goal, reality, options and will allows a Digital Lead to set out what they want to achieve in the short, medium and long term, examine the context they work in daily, and determine their own route forward. My role in that space is genuinely coaching rather than instructing.</w:t>
             </w:r>
           </w:p>
           <w:p>
@@ -7020,39 +7219,15 @@
               <w:spacing w:after="160"/>
             </w:pPr>
             <w:r>
-              <w:lastRenderedPageBreak/>
-              <w:t>The limitation of this approach is pace. I hold the data and know which staff need support, so I could act directly and see rapid impact. Going through the Digital Lead is slower. But undercutting their authority for the sake of quick wins creates a longer-term problem: if I damage a Digital Lead's credibility, or lose their buy-in, there will be work later that I cannot do at all.</w:t>
+              <w:t>The two therefore operate as a sequence rather than an either/or. Mentoring builds the underlying knowledge; coaching takes over once the Digital Lead has enough of it to lead their own agenda. The risk in this is misjudging where someone sits: coaching a person who does not yet have the knowledge produces frustration rather than ownership, which returns to the diagnostic error identified earlier of pitching an activity too high.</w:t>
             </w:r>
           </w:p>
           <w:p>
             <w:pPr>
               <w:spacing w:after="160"/>
-            </w:pPr>
-            <w:r>
-              <w:t xml:space="preserve">This reflects Spillane's account of distributed leadership, where leadership is enacted through others rather than held by one person. Spillane, J.P. (2006) </w:t>
-            </w:r>
-            <w:r>
-              <w:rPr>
-                <w:i/>
-              </w:rPr>
-              <w:t>Distributed Leadership</w:t>
-            </w:r>
-            <w:r>
-              <w:t xml:space="preserve">, Jossey-Bass, San Francisco. My leadership travels through the Digital Leads, and supporting them in that role, even as volunteers, achieves more over time than I could deliver alone. Wageman similarly finds that team leaders are most effective when they have autonomy, clear goals and support. Wageman, R. (2001) 'How Leaders Foster Self-Managing Team Effectiveness: Design Choices Versus Hands-On Coaching', </w:t>
-            </w:r>
-            <w:r>
-              <w:rPr>
-                <w:i/>
-              </w:rPr>
-              <w:t>Organization Science</w:t>
-            </w:r>
-            <w:r>
-              <w:t>, 12(5), pp. 559–577. That is the basis of my approach: the more I develop Digital Leads as future leaders, the greater their impact on digital learning across the organisation.</w:t>
-            </w:r>
-          </w:p>
-          <w:p>
-            <w:pPr>
-              <w:spacing w:after="160"/>
+              <w:rPr>
+                <w:b/>
+              </w:rPr>
             </w:pPr>
           </w:p>
           <w:p>
@@ -7068,7 +7243,8 @@
                 <w:sz w:val="28"/>
                 <w:szCs w:val="28"/>
               </w:rPr>
-              <w:t>AC1.3 — Develop approaches to respond to the challenges of managing and leading multiple and remote teams</w:t>
+              <w:lastRenderedPageBreak/>
+              <w:t>AC2.3: Motivational techniques</w:t>
             </w:r>
           </w:p>
           <w:p>
@@ -7076,7 +7252,7 @@
               <w:spacing w:after="160"/>
             </w:pPr>
             <w:r>
-              <w:t>Working with the Digital Leads presents several challenges. They are geographically dispersed across nine sites. Most know very little about each other and many have never met. Everything operates asynchronously, because timetables differ and there is no common free period across the network. Sites also differ in their infrastructure, with variation in Wi-Fi reliability, device availability and the wider context in which staff work.</w:t>
+              <w:t>Motivation is the most important element of making this programme work. I have no line management responsibility over the Digital Leads. I cannot offer pay, promotion or sanction. All thirty-six are volunteers and every one of them could stop tomorrow. How I motivate them is therefore not a supporting consideration but the mechanism the whole programme depends on.</w:t>
             </w:r>
           </w:p>
           <w:p>
@@ -7084,7 +7260,16 @@
               <w:spacing w:after="160"/>
             </w:pPr>
             <w:r>
-              <w:t>Several approaches are already in place. A dedicated Teams space carries messages, resources, direction and deadlines. I maintain weekly or fortnightly contact with each Digital Lead individually. I travel to their site when asked. I use a differentiated approach according to what each person needs rather than applying a single method across the network.</w:t>
+              <w:t xml:space="preserve">My focus has deliberately been on learners rather than on the organisation. The framing is that we are doing this for our learners, not for the college. This is a considered choice rather than a rhetorical one, and it follows Vroom's expectancy theory, which holds that motivation depends on people believing that effort produces performance, that performance produces an outcome, and that the outcome is one they value. Vroom, V.H. (1964) </w:t>
+            </w:r>
+            <w:r>
+              <w:rPr>
+                <w:i/>
+              </w:rPr>
+              <w:t>Work and Motivation</w:t>
+            </w:r>
+            <w:r>
+              <w:t xml:space="preserve">, Wiley, New York. There is a level of distrust about whether identified problems will actually be addressed at organisational level. If Digital Leads believe the data will be gathered and then nothing will follow, the link between performance and outcome breaks and motivation collapses. Framing the outcome as improvement for learners protects that link, because it is an outcome they can see for themselves and one they value.</w:t>
             </w:r>
           </w:p>
           <w:p>
@@ -7092,7 +7277,16 @@
               <w:spacing w:after="160"/>
             </w:pPr>
             <w:r>
-              <w:t>Two further approaches would strengthen this, both of which I have discussed with my line manager.</w:t>
+              <w:t xml:space="preserve">Deci and Ryan's self-determination theory identifies autonomy, competence and relatedness as the conditions for sustained motivation. Deci, E.L. and Ryan, R.M. (1985) </w:t>
+            </w:r>
+            <w:r>
+              <w:rPr>
+                <w:i/>
+              </w:rPr>
+              <w:t xml:space="preserve">Intrinsic Motivation and Self-Determination in Human Behavior</w:t>
+            </w:r>
+            <w:r>
+              <w:t>, Plenum, New York. The model I have built provides two of these. Digital Leads choose how to run their own area, which gives autonomy, and the CPD programme builds competence. Relatedness is the acknowledged gap, which is why the buddying system and the proposed termly meeting matter: they are attempts to address the one condition the current model does not meet.</w:t>
             </w:r>
           </w:p>
           <w:p>
@@ -7100,7 +7294,16 @@
               <w:spacing w:after="160"/>
             </w:pPr>
             <w:r>
-              <w:t>The first is buddying areas together, so that Digital Leads have a counterpart to work alongside rather than operating in isolation. This is under discussion. Some areas are keen; others are less aligned to the idea, so it would need to be built where the willingness exists rather than imposed across the network.</w:t>
+              <w:t xml:space="preserve">Herzberg's two-factor theory distinguishes hygiene factors from motivators. Herzberg, F. (1966) </w:t>
+            </w:r>
+            <w:r>
+              <w:rPr>
+                <w:i/>
+              </w:rPr>
+              <w:t>Work and the Nature of Man</w:t>
+            </w:r>
+            <w:r>
+              <w:t>, World Publishing, Cleveland. My position is unusual in that I have no hygiene factors available at all: no pay, no status, no improved conditions. I can work only with motivators, namely achievement, recognition, responsibility and growth. This is why I invest in Digital Leads as future leaders, so they gain experience they can carry into applications for higher roles, and why I invest in their staff, so they can see the effect of their work on their own learners.</w:t>
             </w:r>
           </w:p>
           <w:p>
@@ -7108,21 +7311,8 @@
               <w:spacing w:after="160"/>
             </w:pPr>
             <w:r>
-              <w:t>The second is a termly meeting of all Digital Leads. This directly addresses the point made earlier in this report: judged against Katzenbach and Smith, the network currently functions as a working group of individuals with a common task rather than a team, and remote working does not generate the shared purpose and mutual accountability that would change that. A face-to-face meeting would create the conditions for sharing practice and problem-solving together. It would need careful planning. Travel arrange</w:t>
-            </w:r>
-            <w:r>
-              <w:t>ments would be required for those coming from other sites, and lesson cover may need to be arranged where the meeting clashes with teaching commitments. These are practical costs that would need approval, but a face-to-face meeting is the most direct route to building the relationships that remote working does not generate on its own.</w:t>
-            </w:r>
-          </w:p>
-          <w:p>
-            <w:pPr>
-              <w:spacing w:after="160"/>
-            </w:pPr>
-          </w:p>
-          <w:p>
-            <w:pPr>
-              <w:spacing w:after="160"/>
-            </w:pPr>
+              <w:t>The limitation running through all of this is the same distrust identified above. Where staff question whether their work is respected or acted upon organisationally, motivation is fragile. My response is to keep the purpose located where it is credible: this is about their learners and their own development.</w:t>
+            </w:r>
           </w:p>
           <w:p>
             <w:pPr>
@@ -7153,6 +7343,69 @@
           </w:p>
           <w:p>
             <w:pPr>
+              <w:spacing w:after="160"/>
+              <w:rPr>
+                <w:b/>
+                <w:sz w:val="26"/>
+              </w:rPr>
+            </w:pPr>
+          </w:p>
+          <w:p>
+            <w:pPr>
+              <w:spacing w:after="160"/>
+              <w:rPr>
+                <w:b/>
+                <w:sz w:val="26"/>
+              </w:rPr>
+            </w:pPr>
+          </w:p>
+          <w:p>
+            <w:pPr>
+              <w:spacing w:after="160"/>
+              <w:rPr>
+                <w:b/>
+                <w:sz w:val="26"/>
+              </w:rPr>
+            </w:pPr>
+          </w:p>
+          <w:p>
+            <w:pPr>
+              <w:spacing w:after="160"/>
+              <w:rPr>
+                <w:b/>
+                <w:sz w:val="26"/>
+              </w:rPr>
+            </w:pPr>
+          </w:p>
+          <w:p>
+            <w:pPr>
+              <w:spacing w:after="160"/>
+              <w:rPr>
+                <w:b/>
+                <w:sz w:val="26"/>
+              </w:rPr>
+            </w:pPr>
+          </w:p>
+          <w:p>
+            <w:pPr>
+              <w:spacing w:after="160"/>
+              <w:rPr>
+                <w:b/>
+                <w:sz w:val="26"/>
+              </w:rPr>
+            </w:pPr>
+          </w:p>
+          <w:p>
+            <w:pPr>
+              <w:spacing w:after="160"/>
+              <w:rPr>
+                <w:b/>
+                <w:sz w:val="26"/>
+              </w:rPr>
+            </w:pPr>
+          </w:p>
+          <w:p>
+            <w:pPr>
               <w:pStyle w:val="Heading1"/>
               <w:rPr>
                 <w:sz w:val="32"/>
@@ -7165,7 +7418,7 @@
                 <w:szCs w:val="32"/>
               </w:rPr>
               <w:lastRenderedPageBreak/>
-              <w:t>TASK 2 — Briefing paper: "Methods that can be used to monitor, manage and improve individual and team performance"</w:t>
+              <w:t>TASK 3 - Good practice guide: "Approaches to achieving a balance of skills and experience in a team"</w:t>
             </w:r>
           </w:p>
           <w:p>
@@ -7181,7 +7434,7 @@
                 <w:sz w:val="28"/>
                 <w:szCs w:val="28"/>
               </w:rPr>
-              <w:t>AC2.1 Part 1 — Individuals</w:t>
+              <w:t>AC3.1: Analysing a process for recruiting team members</w:t>
             </w:r>
           </w:p>
           <w:p>
@@ -7189,15 +7442,7 @@
               <w:spacing w:after="160"/>
             </w:pPr>
             <w:r>
-              <w:t xml:space="preserve">Selection begins with diagnosis. The Digital Health Check data shows specifically what each Digital Lead has assessed and where the gaps sit, which allows intervention to be targeted at the right person, at the right level. It is entirely possible for a department to be strong overall while </w:t>
-            </w:r>
-            <w:proofErr w:type="gramStart"/>
-            <w:r>
-              <w:t>particular individuals</w:t>
-            </w:r>
-            <w:proofErr w:type="gramEnd"/>
-            <w:r>
-              <w:t xml:space="preserve"> are not, in which case those individuals can be trained rather than the whole team. The reverse also occurs, where the data shows an entire team, or a substantial part of it, making the same mistakes. Having the data allows the decision to be made accurately rather than by assumption.</w:t>
+              <w:t>The recruitment of thirty-six Digital Leads followed five stages. Each carried a trade-off, and setting these out is more useful than presenting the process as a model to copy.</w:t>
             </w:r>
           </w:p>
           <w:p>
@@ -7205,23 +7450,13 @@
               <w:spacing w:after="160"/>
             </w:pPr>
             <w:r>
-              <w:t xml:space="preserve">The most common error I have made in selecting activities is assuming a level of underlying knowledge that is not </w:t>
-            </w:r>
-            <w:proofErr w:type="gramStart"/>
-            <w:r>
-              <w:t>there, and</w:t>
-            </w:r>
-            <w:proofErr w:type="gramEnd"/>
-            <w:r>
-              <w:t xml:space="preserve"> pitching the activity too high as a result. This is a diagnostic failure rather than a delivery one: the activity may be well designed, but if it assumes basics the individual does not hold, it cannot land. It has required me to check more carefully what staff </w:t>
-            </w:r>
-            <w:proofErr w:type="gramStart"/>
-            <w:r>
-              <w:t>actually need</w:t>
-            </w:r>
-            <w:proofErr w:type="gramEnd"/>
-            <w:r>
-              <w:t xml:space="preserve"> before selecting the activity.</w:t>
+              <w:rPr>
+                <w:b/>
+              </w:rPr>
+              <w:t>Stage 1: define the role before recruiting.</w:t>
+            </w:r>
+            <w:r>
+              <w:t xml:space="preserve"> In the months before recruitment I set out exactly what Digital Leads would do, the accountability they would hold and the authority they would have within their departments. This was reviewed and approved by my line manager, the Assistant Principal for Quality Improvement, and signed off by the Vice Principal. Securing that endorsement before approaching anyone meant the role carried organisational weight rather than being a personal request.</w:t>
             </w:r>
           </w:p>
           <w:p>
@@ -7229,10 +7464,13 @@
               <w:spacing w:after="160"/>
             </w:pPr>
             <w:r>
-              <w:t>Severity of need and available capacity then determine the form. Some individuals require only a nudge: a resource handed over, or a reminder to check that alt text is being applied consistently. Others need instructional coaching or mentoring to move towards working independently at the expected level. Staff with full timetables cannot regularly access one-to-one coaching or Teach Meets, so I maintain SharePoint sites containing guides, videos, advice and checklists supporting independent learning at a tim</w:t>
-            </w:r>
-            <w:r>
-              <w:t>e that suits them. Where practice does not change over time, the process escalates to something more formal. For teams already working well, the discussion focuses instead on innovation and showcasing what they have achieved.</w:t>
+              <w:rPr>
+                <w:b/>
+              </w:rPr>
+              <w:t>Stage 2: recruit through managers rather than directly.</w:t>
+            </w:r>
+            <w:r>
+              <w:t xml:space="preserve"> I presented to Heads of Area, setting out the role, how I wanted Digital Leads recruited, the impact they would have and how I would train and work with them. I asked each Head of Area to identify someone in their team, ideally a member of teaching staff, and made clear that if nobody came forward the responsibility would fall to them. This guaranteed coverage of every area, but it also meant some Digital Leads were volunteered rather than volunteering.</w:t>
             </w:r>
           </w:p>
           <w:p>
@@ -7240,7 +7478,13 @@
               <w:spacing w:after="160"/>
             </w:pPr>
             <w:r>
-              <w:t>Readiness is a further factor. Some staff, Digital Leads and Heads of Area will be defensive or resistant, and in terms of the adoption curve may sit among the laggards. These individuals need a different model of support to become ready and confident, rather than the same activity delivered more insistently.</w:t>
+              <w:rPr>
+                <w:b/>
+              </w:rPr>
+              <w:t>Stage 3: selection by the manager, against my criteria.</w:t>
+            </w:r>
+            <w:r>
+              <w:t xml:space="preserve"> I specified the role and the kind of person needed, but Heads of Area chose. The limitation is inconsistency: some are confident, others much less so. What it delivers in return is subject specialism, knowledge of the team, and understanding of the context they work in. On balance this is the stronger trade, because that local knowledge cannot be recruited for centrally.</w:t>
             </w:r>
           </w:p>
           <w:p>
@@ -7248,22 +7492,56 @@
               <w:spacing w:after="160"/>
             </w:pPr>
             <w:r>
-              <w:t xml:space="preserve">Varying the format also aligns with cognitive style. Sadler-Smith, E., Allinson, C.W. and Hayes, J. (2000) 'Learning Preferences and Cognitive Style: Some Implications for Continuing Professional Development', </w:t>
-            </w:r>
-            <w:r>
-              <w:rPr>
-                <w:i/>
-              </w:rPr>
-              <w:t>Management Learning</w:t>
-            </w:r>
-            <w:r>
-              <w:t>, 31, pp. 239–256. One person may prefer video they can pause and rewind; another a checklist to work through against the expectations; another someone alongside them while they make the changes. Providing multiple routes meets differing capacity and preference, and it makes escalation defensible: where someone has had several accessible routes to the same learning and practice still has not changed, escalation rests on evidence rather than assumption.</w:t>
+              <w:rPr>
+                <w:b/>
+              </w:rPr>
+              <w:t>Stage 4: no formal application or interview.</w:t>
+            </w:r>
+            <w:r>
+              <w:t xml:space="preserve"> There was no CV, shortlisting or evidence of capability before people started, which means every relationship begins on a blank canvas. Some Digital Leads are forthcoming and we have moved quickly through their action plans with meaningful impact already. With others, communication has been limited and the relationship still needs building. Heads of Area who absorbed the role tend to be less available for additional meetings, though as the role grows some may find it easier to identify a colleague better placed to take it on.</w:t>
             </w:r>
           </w:p>
           <w:p>
             <w:pPr>
               <w:spacing w:after="160"/>
             </w:pPr>
+            <w:r>
+              <w:rPr>
+                <w:b/>
+              </w:rPr>
+              <w:t>Stage 5: onboarding as selection.</w:t>
+            </w:r>
+            <w:r>
+              <w:t xml:space="preserve"> The three-part CPD in June was training, but it also functioned as selection. It clarified for everyone what the role actually involved, and one Digital Lead withdrew as a result, her area then being covered by the Head of Area. This is selection through onboarding rather than selection before it.</w:t>
+            </w:r>
+          </w:p>
+          <w:p>
+            <w:pPr>
+              <w:spacing w:after="160"/>
+            </w:pPr>
+            <w:r>
+              <w:rPr>
+                <w:b/>
+              </w:rPr>
+              <w:t>What the process achieves and what it costs.</w:t>
+            </w:r>
+            <w:r>
+              <w:t xml:space="preserve"> Manager-led recruitment gave speed and complete coverage, at the cost of variable quality. The absence of a formal process removed any barrier to volunteering, which suits an unpaid role, but meant no screening for capability or willingness. Volunteering is itself a filter, and arguably a good one, since people who put themselves forward for unpaid work generally understand what they want from it. What could not be selected for was confidence, which has proved to matter more than technical skill.</w:t>
+            </w:r>
+          </w:p>
+          <w:p>
+            <w:pPr>
+              <w:spacing w:after="160"/>
+            </w:pPr>
+            <w:r>
+              <w:rPr>
+                <w:b/>
+              </w:rPr>
+              <w:t>Recommendation for future recruitment.</w:t>
+            </w:r>
+            <w:r>
+              <w:t xml:space="preserve"> I would keep the manager-led model. Heads of Area know their staff, know who is ready to take on responsibility as part of their own development towards leadership, and can judge whether someone has the capacity, capability and subject knowledge the role requires. Selecting the person themselves also gives the manager greater confidence in the appointment. What I would add is a short conversation with each nominee before the CPD begins. Not an interview, but a discussion of what the role actually involves, held either with the Head of Area present or without them. Better still would be attending team meetings to talk about the role directly and answer questions, which both recruits and explains the work to the wider department. Either approach would surface, before appointment rather than after, those who discover on closer inspection that the role is not for them.</w:t>
+            </w:r>
           </w:p>
           <w:p>
             <w:pPr>
@@ -7278,7 +7556,8 @@
                 <w:sz w:val="28"/>
                 <w:szCs w:val="28"/>
               </w:rPr>
-              <w:t>AC2.1 Part 2 — Teams</w:t>
+              <w:lastRenderedPageBreak/>
+              <w:t>AC3.2: Methods used to monitor and manage individual and team performance</w:t>
             </w:r>
           </w:p>
           <w:p>
@@ -7286,7 +7565,7 @@
               <w:spacing w:after="160"/>
             </w:pPr>
             <w:r>
-              <w:t>Several factors operate at team level that do not apply when working with an individual.</w:t>
+              <w:t>The core problem in this programme is that I monitor performance of people I do not manage. Appraisal, targets and supervision are not available to me. Four methods operate in their place.</w:t>
             </w:r>
           </w:p>
           <w:p>
@@ -7294,15 +7573,13 @@
               <w:spacing w:after="160"/>
             </w:pPr>
             <w:r>
-              <w:t xml:space="preserve">The first is Head of Area buy-in. To work with an </w:t>
-            </w:r>
-            <w:proofErr w:type="gramStart"/>
-            <w:r>
-              <w:t>individual</w:t>
-            </w:r>
-            <w:proofErr w:type="gramEnd"/>
-            <w:r>
-              <w:t xml:space="preserve"> I need that person's consent; to work with a whole team I need their manager's. Without it, a session can take place but the practice that follows it will not be reinforced.</w:t>
+              <w:rPr>
+                <w:b/>
+              </w:rPr>
+              <w:t>Diagnostic data.</w:t>
+            </w:r>
+            <w:r>
+              <w:t xml:space="preserve"> The Health Check produces individual-level scores across five indicators. This is performance information that most managers do not hold, and it can be shared with Heads of Area so they can direct improvement using authority I do not have.</w:t>
             </w:r>
           </w:p>
           <w:p>
@@ -7310,7 +7587,13 @@
               <w:spacing w:after="160"/>
             </w:pPr>
             <w:r>
-              <w:t>The second is group dynamic. As in any classroom, one person can derail the tone of a session and change both how the content lands and the direction the work then takes. This makes the opening important: bringing everyone together to understand the journey and the overall arc before working through the detail.</w:t>
+              <w:rPr>
+                <w:b/>
+              </w:rPr>
+              <w:t>Repeated measurement.</w:t>
+            </w:r>
+            <w:r>
+              <w:t xml:space="preserve"> The June baseline captured a snapshot. Re-audits in November, February and at the end of the academic year turn that into a trend for both individuals and teams. This is less intrusive than asking people to prove improvement, because the work should be happening anyway and the audit simply records whether it has.</w:t>
             </w:r>
           </w:p>
           <w:p>
@@ -7318,44 +7601,163 @@
               <w:spacing w:after="160"/>
             </w:pPr>
             <w:r>
-              <w:t xml:space="preserve">The third is timetable and cover cost. It is unlikely that lessons can be covered to release a whole team, and the most likely answer to that request is no. There are, however, times when teams already meet, and the </w:t>
-            </w:r>
-            <w:r>
+              <w:rPr>
+                <w:b/>
+              </w:rPr>
+              <w:t>Triangulation.</w:t>
+            </w:r>
+            <w:r>
+              <w:t xml:space="preserve"> Learning walks, resource sampling and Quality team involvement test the self-assessment, and the conversations that follow with Teaching, Learning and Assessment Managers and Heads of Area keep the work visible rather than allowing it to become a once-a-term data exercise.</w:t>
+            </w:r>
+          </w:p>
+          <w:p>
+            <w:pPr>
+              <w:spacing w:after="160"/>
+            </w:pPr>
+            <w:r>
+              <w:rPr>
+                <w:b/>
+              </w:rPr>
+              <w:t>Visibility and borrowed authority.</w:t>
+            </w:r>
+            <w:r>
+              <w:t xml:space="preserve"> Completion rates and RAG ratings are reported to the Vice Principal for Quality, who can see which areas are engaged and which are not. He does not usually act directly, but he permits me to use his name where work needs to happen, holding direct escalation in reserve for cases that do not resolve. He also mentors me in this, asking questions that improve the quality of how I hold areas to account. The method is therefore borrowed authority rather than delegated authority.</w:t>
+            </w:r>
+          </w:p>
+          <w:p>
+            <w:pPr>
+              <w:spacing w:after="160"/>
+            </w:pPr>
+            <w:r>
+              <w:rPr>
+                <w:b/>
+              </w:rPr>
+              <w:t>Framing.</w:t>
+            </w:r>
+            <w:r>
+              <w:t xml:space="preserve"> The audit is developmental rather than judgemental. It exists to identify what support is needed, not to catch people out. This matters practically: general CPD on accessibility has not landed, so the value of the data is in identifying precisely what an individual needs, whether that is alt text, heading structure or colour contrast, and targeting support accordingly. If Digital Leads believed the audit were a performance management instrument, they would score generously and the data would be worthless.</w:t>
+            </w:r>
+          </w:p>
+          <w:p>
+            <w:pPr>
+              <w:spacing w:after="160"/>
+            </w:pPr>
+            <w:r>
+              <w:rPr>
+                <w:b/>
+              </w:rPr>
+              <w:t>The tension.</w:t>
+            </w:r>
+            <w:r>
+              <w:t xml:space="preserve"> That framing sits uncomfortably alongside the fact that the data does reach senior leaders. I hold both positions: the audit is developmental, and it is also the evidence base by which areas become visible to the executive. I address this by being explicit that improvement in accessibility and inclusion is something the whole organisation needs to own. No part of the college is untouched by it, because the organisational objective is that the SEND Framework permeates the entire organisation rather than teaching alone.</w:t>
+            </w:r>
+          </w:p>
+          <w:p>
+            <w:pPr>
+              <w:spacing w:after="160"/>
+              <w:rPr>
+                <w:b/>
+                <w:sz w:val="26"/>
+              </w:rPr>
+            </w:pPr>
+          </w:p>
+          <w:p>
+            <w:pPr>
+              <w:spacing w:after="160"/>
+              <w:rPr>
+                <w:b/>
+                <w:sz w:val="26"/>
+              </w:rPr>
+            </w:pPr>
+          </w:p>
+          <w:p>
+            <w:pPr>
+              <w:spacing w:after="160"/>
+              <w:rPr>
+                <w:b/>
+                <w:sz w:val="26"/>
+              </w:rPr>
+            </w:pPr>
+          </w:p>
+          <w:p>
+            <w:pPr>
+              <w:spacing w:after="160"/>
+              <w:rPr>
+                <w:b/>
+                <w:sz w:val="26"/>
+              </w:rPr>
+            </w:pPr>
+          </w:p>
+          <w:p>
+            <w:pPr>
+              <w:spacing w:after="160"/>
+              <w:rPr>
+                <w:b/>
+                <w:sz w:val="26"/>
+              </w:rPr>
+            </w:pPr>
+          </w:p>
+          <w:p>
+            <w:pPr>
+              <w:spacing w:after="160"/>
+              <w:rPr>
+                <w:b/>
+                <w:sz w:val="26"/>
+              </w:rPr>
+            </w:pPr>
+          </w:p>
+          <w:p>
+            <w:pPr>
+              <w:spacing w:after="160"/>
+              <w:rPr>
+                <w:b/>
+                <w:sz w:val="26"/>
+              </w:rPr>
+            </w:pPr>
+          </w:p>
+          <w:p>
+            <w:pPr>
+              <w:spacing w:after="160"/>
+              <w:rPr>
+                <w:b/>
+                <w:sz w:val="26"/>
+              </w:rPr>
+            </w:pPr>
+          </w:p>
+          <w:p>
+            <w:pPr>
+              <w:spacing w:after="160"/>
+              <w:rPr>
+                <w:b/>
+                <w:sz w:val="26"/>
+              </w:rPr>
+            </w:pPr>
+          </w:p>
+          <w:p>
+            <w:pPr>
+              <w:spacing w:after="160"/>
+              <w:rPr>
+                <w:b/>
+                <w:sz w:val="26"/>
+              </w:rPr>
+            </w:pPr>
+          </w:p>
+          <w:p>
+            <w:pPr>
+              <w:pStyle w:val="Heading1"/>
+              <w:rPr>
+                <w:sz w:val="32"/>
+                <w:szCs w:val="32"/>
+              </w:rPr>
+            </w:pPr>
+            <w:r>
+              <w:rPr>
+                <w:sz w:val="32"/>
+                <w:szCs w:val="32"/>
+              </w:rPr>
               <w:lastRenderedPageBreak/>
-              <w:t>practical response is for me to be flexible enough to meet them in the space they already have rather than asking the organisation to create one.</w:t>
-            </w:r>
-          </w:p>
-          <w:p>
-            <w:pPr>
-              <w:spacing w:after="160"/>
-            </w:pPr>
-            <w:r>
-              <w:t>Existing team culture matters. In one team an awkward relationship dynamic, compounded by significant changes in personnel, means learning and resources are not readily shared. I am working with that team alongside their Teaching, Learning and Assessment Manager, with the aim of moving towards a culture where resources are shared and peer support helps them develop as a group.</w:t>
-            </w:r>
-          </w:p>
-          <w:p>
-            <w:pPr>
-              <w:spacing w:after="160"/>
-            </w:pPr>
-            <w:r>
-              <w:t>Spread of need is a further consideration. The Health Check data shows whether an entire team, a portion of it, or specific individuals require training. Where only part of a team needs an intervention, that group can be worked with directly and the remainder's time protected, either for bespoke support later or for more innovative work.</w:t>
-            </w:r>
-          </w:p>
-          <w:p>
-            <w:pPr>
-              <w:spacing w:after="160"/>
-            </w:pPr>
-            <w:r>
-              <w:t>How a team arrives at the need also shapes what can be delivered. The Digital Lead for English raised accessibility following the audit, and I communicated the data to the Deputy Head of Area, who recognised that staff were not consistently embedding it. The point landed fully only once we discussed the specific cohort: learners who did not achieve a grade 4 in GCSE English, whose barriers are likely to be significant, and for whom some existing material actively creates further barriers. She then wanted to</w:t>
-            </w:r>
-            <w:r>
-              <w:t xml:space="preserve"> understand cognitive overload and how material design can nurture curiosity. The audit surfaced the issue; framing why it mattered for that cohort is where my role adds something the Digital Lead could not.</w:t>
-            </w:r>
-          </w:p>
-          <w:p>
-            <w:pPr>
-              <w:spacing w:after="160"/>
-            </w:pPr>
+              <w:t>TASK 4 - Report: "Skills and approaches in managing talent and performance"</w:t>
+            </w:r>
           </w:p>
           <w:p>
             <w:pPr>
@@ -7370,7 +7772,7 @@
                 <w:sz w:val="28"/>
                 <w:szCs w:val="28"/>
               </w:rPr>
-              <w:t>AC2.2 — Coaching and mentoring models</w:t>
+              <w:t>AC4.1: Practical approaches for effective team management and leadership</w:t>
             </w:r>
           </w:p>
           <w:p>
@@ -7378,15 +7780,7 @@
               <w:spacing w:after="160"/>
             </w:pPr>
             <w:r>
-              <w:t xml:space="preserve">Coaching and mentoring are related but distinct. Coaching assumes the </w:t>
-            </w:r>
-            <w:proofErr w:type="spellStart"/>
-            <w:r>
-              <w:t>coachee</w:t>
-            </w:r>
-            <w:proofErr w:type="spellEnd"/>
-            <w:r>
-              <w:t xml:space="preserve"> already holds the answer, and the coach's role is to draw it out so that the person has full ownership of the response. Mentoring assumes greater experience on the mentor's part, and involves offering advice, guidance and direction where it is needed.</w:t>
+              <w:t>The approaches I use divide into two categories: those that constitute the coaching role itself, and the systems built to make that role possible.</w:t>
             </w:r>
           </w:p>
           <w:p>
@@ -7394,7 +7788,13 @@
               <w:spacing w:after="160"/>
             </w:pPr>
             <w:r>
-              <w:t>In the work with Digital Leads both are necessary, and which applies depends on where the individual is in their development rather than on a fixed preference.</w:t>
+              <w:rPr>
+                <w:b/>
+              </w:rPr>
+              <w:t>The tiered support model.</w:t>
+            </w:r>
+            <w:r>
+              <w:t xml:space="preserve"> This is the approach most closely aligned to my role as Digital Pedagogy Coach, and the one I would keep if everything else were stripped away. Digital Leads sit in three broad positions: those working independently who need only a framework and a collegiate direction; those who need a sounding board to check and shape what they intend to do; and those who need me to work hands-on with them and their teams. The tier is not fixed to the person, and someone confident in one aspect of the role may need considerably more support in another.</w:t>
             </w:r>
           </w:p>
           <w:p>
@@ -7402,16 +7802,13 @@
               <w:spacing w:after="160"/>
             </w:pPr>
             <w:r>
-              <w:t xml:space="preserve">Mentoring applies where a Digital Lead does not yet hold the answer, which is the case with accessibility. Most have not previously worked in this area in any depth, so guiding them through it is appropriate. For those with less experience, this most closely resembles Knight's instructional coaching model, developed for educational settings and focused specifically on classroom practice. Knight, J. (2007) </w:t>
-            </w:r>
-            <w:r>
-              <w:rPr>
-                <w:i/>
-              </w:rPr>
-              <w:t>Instructional Coaching: A Partnership Approach to Improving Instruction</w:t>
-            </w:r>
-            <w:r>
-              <w:t>, Corwin Press, Thousand Oaks CA. That model suits the work on accessible resources by design, because the conversation is about concrete teaching practice and how it affects the learners in the room.</w:t>
+              <w:rPr>
+                <w:b/>
+              </w:rPr>
+              <w:t>Responsiveness.</w:t>
+            </w:r>
+            <w:r>
+              <w:t xml:space="preserve"> I hold no line management authority over Digital Leads, but I do lead in the space of digital learning, and responsiveness is how that leadership is exercised. I answer their calls, respond to their messages first, and travel to their site where that is what is needed. This is not separate from the tiered model but part of how it works: those who need me to be more hands-on need me to be genuinely available, not available in principle.</w:t>
             </w:r>
           </w:p>
           <w:p>
@@ -7419,38 +7816,13 @@
               <w:spacing w:after="160"/>
             </w:pPr>
             <w:r>
-              <w:t xml:space="preserve">Coaching applies once a Digital Lead holds their own direction and ambition for how digital learning develops in their department. At that point Whitmore's GROW model becomes more useful. Whitmore, J. (2009) </w:t>
-            </w:r>
-            <w:r>
-              <w:rPr>
-                <w:i/>
-              </w:rPr>
-              <w:t xml:space="preserve">Coaching for Performance: </w:t>
-            </w:r>
-            <w:proofErr w:type="spellStart"/>
-            <w:r>
-              <w:rPr>
-                <w:i/>
-              </w:rPr>
-              <w:t>GROWing</w:t>
-            </w:r>
-            <w:proofErr w:type="spellEnd"/>
-            <w:r>
-              <w:rPr>
-                <w:i/>
-              </w:rPr>
-              <w:t xml:space="preserve"> Human Potential and Purpose</w:t>
-            </w:r>
-            <w:r>
-              <w:t xml:space="preserve">, 4th </w:t>
-            </w:r>
-            <w:proofErr w:type="spellStart"/>
-            <w:r>
-              <w:t>edn</w:t>
-            </w:r>
-            <w:proofErr w:type="spellEnd"/>
-            <w:r>
-              <w:t>, Nicholas Brealey, London. Working through goal, reality, options and will allows a Digital Lead to set out what they want to achieve in the short, medium and long term, examine the context they work in daily, and determine their own route forward. My role in that space is genuinely coaching rather than instructing.</w:t>
+              <w:rPr>
+                <w:b/>
+              </w:rPr>
+              <w:t>The supporting systems.</w:t>
+            </w:r>
+            <w:r>
+              <w:t xml:space="preserve"> The negotiated action plan, the shared diagnostic instrument, the single communication channel and the escalation process held in reserve sit outside the day-to-day coaching role. I built them because they make the coaching work possible. I need to know where the problems are, and I need my time to be spent where it has impact. The Health Check gives me eyes and ears across areas I cannot physically reach, the Teams space means information reaches everyone without depending on me remembering to pass it on, the action plan negotiated with each Digital Lead ensures ownership sits with them, and escalation exists so that non-engagement has a route to resolution without my having to confront it personally.</w:t>
             </w:r>
           </w:p>
           <w:p>
@@ -7458,7 +7830,27 @@
               <w:spacing w:after="160"/>
             </w:pPr>
             <w:r>
-              <w:t>The two therefore operate as a sequence rather than an either/or. Mentoring builds the underlying knowledge; coaching takes over once the Digital Lead has enough of it to lead their own agenda. The risk in this is misjudging where someone sits: coaching a person who does not yet have the knowledge produces frustration rather than ownership, which returns to the diagnostic error identified earlier of pitching an activity too high.</w:t>
+              <w:rPr>
+                <w:b/>
+              </w:rPr>
+              <w:t>What is not yet working.</w:t>
+            </w:r>
+            <w:r>
+              <w:t xml:space="preserve"> Engagement is not uniform. Some Digital Leads have read messages without responding, have not completed their Health Check, and have not taken up offers of support. That will require escalation, and I am clear that it does. My judgement at this stage, however, has been to prioritise action plans for those who are engaged, so that the people doing the work are not effectively penalised by my attention going to those who are not. The reasons for non-engagement are not yet established and could include workload, restructure or personal circumstances, and identifying the actual barrier matters more than applying pressure. Establishing that is work for the coming weeks. It is a limitation of the current approach that responsiveness works well for those who respond, and does not yet reach those who do not.</w:t>
+            </w:r>
+          </w:p>
+          <w:p>
+            <w:pPr>
+              <w:spacing w:after="160"/>
+            </w:pPr>
+            <w:r>
+              <w:rPr>
+                <w:b/>
+              </w:rPr>
+              <w:t>Alignment to organisational objectives.</w:t>
+            </w:r>
+            <w:r>
+              <w:t xml:space="preserve"> The impact these approaches produce has to be aligned to what the organisation is trying to achieve, which is why the programme was proposed around accessibility and inclusion specifically. That framing connects the day-to-day coaching work to the organisational objective that the SEND Framework permeates the college and that teaching, learning and assessment is inclusive for all. Without that alignment, the systems would generate activity rather than impact.</w:t>
             </w:r>
           </w:p>
           <w:p>
@@ -7482,8 +7874,17 @@
                 <w:sz w:val="28"/>
                 <w:szCs w:val="28"/>
               </w:rPr>
+              <w:t>AC4.2: Skills and techniques for current and future needs, and techniques for assessing these</w:t>
+            </w:r>
+          </w:p>
+          <w:p>
+            <w:pPr>
+              <w:spacing w:after="160"/>
+            </w:pPr>
+            <w:r>
+              <w:t xml:space="preserve">Everything currently sits on top of accessibility fundamentals, so the immediate requirement is that those are secure. By the end of this academic year I want the college to be able to say that everything leaving it is </w:t>
               <w:lastRenderedPageBreak/>
-              <w:t>AC2.3 — Motivational techniques</w:t>
+              <w:t>accessible: learning material, internal communications, outward posts and social media, produced at any level and in any department, including Professional Learner Services and the executive rather than teaching alone.</w:t>
             </w:r>
           </w:p>
           <w:p>
@@ -7491,7 +7892,7 @@
               <w:spacing w:after="160"/>
             </w:pPr>
             <w:r>
-              <w:t>Motivation is the most important element of making this programme work. I have no line management responsibility over the Digital Leads. I cannot offer pay, promotion or sanction. All thirty-six are volunteers and every one of them could stop tomorrow. How I motivate them is therefore not a supporting consideration but the mechanism the whole programme depends on.</w:t>
+              <w:t>Beyond that, four areas of capability are required.</w:t>
             </w:r>
           </w:p>
           <w:p>
@@ -7499,32 +7900,13 @@
               <w:spacing w:after="160"/>
             </w:pPr>
             <w:r>
-              <w:t xml:space="preserve">My focus has deliberately been on learners rather than on the organisation. The framing is that we are doing this for our learners, not for the college. This is a considered choice rather than a rhetorical one, and it follows Vroom's expectancy theory, which holds that motivation depends on people believing that effort produces performance, that performance produces an outcome, and that the outcome is one they value. Vroom, V.H. (1964) </w:t>
-            </w:r>
-            <w:r>
-              <w:rPr>
-                <w:i/>
-              </w:rPr>
-              <w:t>Work and Motivation</w:t>
-            </w:r>
-            <w:r>
-              <w:t xml:space="preserve">, Wiley, New York. There is a level of distrust about whether identified problems will </w:t>
-            </w:r>
-            <w:proofErr w:type="gramStart"/>
-            <w:r>
-              <w:t>actually be</w:t>
-            </w:r>
-            <w:proofErr w:type="gramEnd"/>
-            <w:r>
-              <w:t xml:space="preserve"> addressed at organisational level. If Digital Leads believe the data will be gathered and then nothing will follow, the link between performance and outcome breaks and motivation collapses. Framing the outcome as improvement for learners protects that link, because it is an outcome they can see for themselves and </w:t>
-            </w:r>
-            <w:proofErr w:type="gramStart"/>
-            <w:r>
-              <w:t>one</w:t>
-            </w:r>
-            <w:proofErr w:type="gramEnd"/>
-            <w:r>
-              <w:t xml:space="preserve"> they value.</w:t>
+              <w:rPr>
+                <w:b/>
+              </w:rPr>
+              <w:t>Digital learning environments.</w:t>
+            </w:r>
+            <w:r>
+              <w:t xml:space="preserve"> Once resources themselves are accessible, the question becomes how they reach learners. Most Teams environments contain all the necessary material, but it is not always easy to navigate. Reducing the number of clicks matters because learners who cannot find things disengage, and many of our learners are not digitally literate to begin with. Staff also need confidence in the legal and behavioural dimensions of an online learning space, including GDPR and safeguarding.</w:t>
             </w:r>
           </w:p>
           <w:p>
@@ -7532,24 +7914,13 @@
               <w:spacing w:after="160"/>
             </w:pPr>
             <w:r>
-              <w:t xml:space="preserve">Deci and Ryan's self-determination theory identifies autonomy, competence and relatedness as the conditions for sustained motivation. Deci, E.L. and Ryan, R.M. (1985) </w:t>
-            </w:r>
-            <w:r>
-              <w:rPr>
-                <w:i/>
-              </w:rPr>
-              <w:t xml:space="preserve">Intrinsic Motivation and Self-Determination in Human </w:t>
-            </w:r>
-            <w:proofErr w:type="spellStart"/>
-            <w:r>
-              <w:rPr>
-                <w:i/>
-              </w:rPr>
-              <w:t>Behavior</w:t>
-            </w:r>
-            <w:proofErr w:type="spellEnd"/>
-            <w:r>
-              <w:t>, Plenum, New York. The model I have built provides two of these. Digital Leads choose how to run their own area, which gives autonomy, and the CPD programme builds competence. Relatedness is the acknowledged gap, which is why the buddying system and the proposed termly meeting matter: they are attempts to address the one condition the current model does not meet.</w:t>
+              <w:rPr>
+                <w:b/>
+              </w:rPr>
+              <w:t>Learner digital skills baselining.</w:t>
+            </w:r>
+            <w:r>
+              <w:t xml:space="preserve"> This is work I have begun with Heads of Area. The Ofsted toolkit refers repeatedly to digital skills alongside English and maths in terms of baseline and progression, so staff need to be proficient enough to capture, address and monitor learner progress. This matters given that digital skills teaching in secondary schools is inconsistent and dependent on the confidence of individual teachers.</w:t>
             </w:r>
           </w:p>
           <w:p>
@@ -7557,16 +7928,13 @@
               <w:spacing w:after="160"/>
             </w:pPr>
             <w:r>
-              <w:t xml:space="preserve">Herzberg's two-factor theory distinguishes hygiene factors from motivators. Herzberg, F. (1966) </w:t>
-            </w:r>
-            <w:r>
-              <w:rPr>
-                <w:i/>
-              </w:rPr>
-              <w:t>Work and the Nature of Man</w:t>
-            </w:r>
-            <w:r>
-              <w:t>, World Publishing, Cleveland. My position is unusual in that I have no hygiene factors available at all: no pay, no status, no improved conditions. I can work only with motivators, namely achievement, recognition, responsibility and growth. This is why I invest in Digital Leads as future leaders, so they gain experience they can carry into applications for higher roles, and why I invest in their staff, so they can see the effect of their work on their own learners.</w:t>
+              <w:rPr>
+                <w:b/>
+              </w:rPr>
+              <w:t>Artificial intelligence.</w:t>
+            </w:r>
+            <w:r>
+              <w:t xml:space="preserve"> AI needs treating in the same way as accessibility, beginning with fundamentals. Generating impressive resources through clever prompting achieves little if staff cannot then embed them within a coherent model of teaching and learning. It is fast-moving and significant, but capability has to be built in a way that allows confidence to develop.</w:t>
             </w:r>
           </w:p>
           <w:p>
@@ -7574,115 +7942,44 @@
               <w:spacing w:after="160"/>
             </w:pPr>
             <w:r>
-              <w:t>The limitation running through all of this is the same distrust identified above. Where staff question whether their work is respected or acted upon organisationally, motivation is fragile. My response is to keep the purpose located where it is credible: this is about their learners and their own development.</w:t>
+              <w:rPr>
+                <w:b/>
+              </w:rPr>
+              <w:t>Data analysis.</w:t>
+            </w:r>
+            <w:r>
+              <w:t xml:space="preserve"> We can now collect data quickly. The requirement is to move it forward without absorbing planning time in analysis, which raises the question of whether automation or AI can carry the processing so that available time is spent shifting practice rather than interpreting spreadsheets.</w:t>
             </w:r>
           </w:p>
           <w:p>
             <w:pPr>
               <w:spacing w:after="160"/>
+            </w:pPr>
+            <w:r>
               <w:rPr>
                 <w:b/>
-                <w:sz w:val="26"/>
-              </w:rPr>
-            </w:pPr>
+              </w:rPr>
+              <w:t>Techniques for assessing capability.</w:t>
+            </w:r>
+            <w:r>
+              <w:t xml:space="preserve"> Assessment operates through several instruments. The Digital Health Check provides indicator-level data on individual practice. Learning walks provide observation independent of self-report. The RAG framework aggregates this to area level across weighted dimensions. The Jisc Discovery Tool is being released to staff shortly after induction, and will indicate what staff understand, what they are working towards and where they want to improve, giving both a capability picture and a gap analysis.</w:t>
+            </w:r>
           </w:p>
           <w:p>
             <w:pPr>
               <w:spacing w:after="160"/>
+            </w:pPr>
+            <w:r>
+              <w:t>Each has a weakness. The Health Check is a self-assessment carried out by Digital Leads of varying confidence, so inter-rater consistency is not assured. Coverage is uneven, with some dimensions substantially under-scored in the baseline. The Jisc Discovery Tool relies on self-report. Learning walks provide independent observation but sample only a fraction of practice. Used together they compensate for one another; used singly, any one of them would give a misleading picture.</w:t>
+            </w:r>
+          </w:p>
+          <w:p>
+            <w:pPr>
+              <w:spacing w:after="160"/>
               <w:rPr>
                 <w:b/>
-                <w:sz w:val="26"/>
-              </w:rPr>
-            </w:pPr>
-          </w:p>
-          <w:p>
-            <w:pPr>
-              <w:spacing w:after="160"/>
-              <w:rPr>
-                <w:b/>
-                <w:sz w:val="26"/>
-              </w:rPr>
-            </w:pPr>
-          </w:p>
-          <w:p>
-            <w:pPr>
-              <w:spacing w:after="160"/>
-              <w:rPr>
-                <w:b/>
-                <w:sz w:val="26"/>
-              </w:rPr>
-            </w:pPr>
-          </w:p>
-          <w:p>
-            <w:pPr>
-              <w:spacing w:after="160"/>
-              <w:rPr>
-                <w:b/>
-                <w:sz w:val="26"/>
-              </w:rPr>
-            </w:pPr>
-          </w:p>
-          <w:p>
-            <w:pPr>
-              <w:spacing w:after="160"/>
-              <w:rPr>
-                <w:b/>
-                <w:sz w:val="26"/>
-              </w:rPr>
-            </w:pPr>
-          </w:p>
-          <w:p>
-            <w:pPr>
-              <w:spacing w:after="160"/>
-              <w:rPr>
-                <w:b/>
-                <w:sz w:val="26"/>
-              </w:rPr>
-            </w:pPr>
-          </w:p>
-          <w:p>
-            <w:pPr>
-              <w:spacing w:after="160"/>
-              <w:rPr>
-                <w:b/>
-                <w:sz w:val="26"/>
-              </w:rPr>
-            </w:pPr>
-          </w:p>
-          <w:p>
-            <w:pPr>
-              <w:spacing w:after="160"/>
-              <w:rPr>
-                <w:b/>
-                <w:sz w:val="26"/>
-              </w:rPr>
-            </w:pPr>
-          </w:p>
-          <w:p>
-            <w:pPr>
-              <w:spacing w:after="160"/>
-              <w:rPr>
-                <w:b/>
-                <w:sz w:val="26"/>
-              </w:rPr>
-            </w:pPr>
-          </w:p>
-          <w:p>
-            <w:pPr>
-              <w:pStyle w:val="Heading1"/>
-              <w:rPr>
-                <w:sz w:val="32"/>
-                <w:szCs w:val="32"/>
-              </w:rPr>
-            </w:pPr>
-            <w:r>
-              <w:rPr>
-                <w:sz w:val="32"/>
-                <w:szCs w:val="32"/>
-              </w:rPr>
-              <w:lastRenderedPageBreak/>
-              <w:t>TASK 3 — Good practice guide: "Approaches to achieving a balance of skills and experience in a team"</w:t>
-            </w:r>
+              </w:rPr>
+            </w:pPr>
           </w:p>
           <w:p>
             <w:pPr>
@@ -7697,7 +7994,7 @@
                 <w:sz w:val="28"/>
                 <w:szCs w:val="28"/>
               </w:rPr>
-              <w:t>AC3.1 — Analysing a process for recruiting team members</w:t>
+              <w:t>AC4.3: Good practices for enabling and supporting high performing teams</w:t>
             </w:r>
           </w:p>
           <w:p>
@@ -7705,7 +8002,13 @@
               <w:spacing w:after="160"/>
             </w:pPr>
             <w:r>
-              <w:t>The recruitment of thirty-six Digital Leads followed five stages. Each carried a trade-off, and setting these out is more useful than presenting the process as a model to copy.</w:t>
+              <w:rPr>
+                <w:b/>
+              </w:rPr>
+              <w:t>Clarity of role.</w:t>
+            </w:r>
+            <w:r>
+              <w:t xml:space="preserve"> Everyone now understands what a Digital Lead does and why it matters. The role was defined and signed off at Vice Principal level, and recruited through Heads of Area. Its limitation is that clarity of role is not the same as clarity of shared purpose, which returns to the distinction drawn earlier between a working group and a team.</w:t>
             </w:r>
           </w:p>
           <w:p>
@@ -7716,18 +8019,19 @@
               <w:rPr>
                 <w:b/>
               </w:rPr>
-              <w:t>Stage 1: define the role before recruiting.</w:t>
-            </w:r>
-            <w:r>
-              <w:t xml:space="preserve"> In the months before </w:t>
-            </w:r>
-            <w:proofErr w:type="gramStart"/>
-            <w:r>
-              <w:t>recruitment</w:t>
-            </w:r>
-            <w:proofErr w:type="gramEnd"/>
-            <w:r>
-              <w:t xml:space="preserve"> I set out exactly what Digital Leads would do, the accountability they would hold and the authority they would have within their departments. This was reviewed and approved by my line manager, the Assistant Principal for Quality Improvement, and signed off by the Vice Principal. Securing that endorsement before approaching anyone meant the role carried organisational weight rather than being a personal request.</w:t>
+              <w:t>Psychological safety.</w:t>
+            </w:r>
+            <w:r>
+              <w:t xml:space="preserve"> The audit is deliberately designed as developmental and framed as an honest opening to a conversation about improving practice from the foundations upward. It is also honest about the fact that this is something we should already know and have not attended to for some time. Edmondson argues that teams perform best where people can admit not knowing something. Edmondson, A. (1999) 'Psychological Safety and Learning Behavior in Work Teams', </w:t>
+            </w:r>
+            <w:r>
+              <w:rPr>
+                <w:i/>
+              </w:rPr>
+              <w:t>Administrative Science Quarterly</w:t>
+            </w:r>
+            <w:r>
+              <w:t xml:space="preserve">, 44(2), pp. 350–383. The Jisc Discovery data from December showed that staff do know about accessibility and about Immersive Reader; what they are not doing is delivering on it day to day, and being able to say that openly is what makes improvement possible.</w:t>
             </w:r>
           </w:p>
           <w:p>
@@ -7735,13 +8039,22 @@
               <w:spacing w:after="160"/>
             </w:pPr>
             <w:r>
+              <w:lastRenderedPageBreak/>
+              <w:t xml:space="preserve">The limitation is that this depends on people believing the framing, and on the data actually influencing organisational decisions. It is also why I am working with the executive team. If staff are asked to improve accessibility while communications from the executive do not meet the same standard, the framing erodes and so does buy-in.</w:t>
+            </w:r>
+          </w:p>
+          <w:p>
+            <w:pPr>
+              <w:spacing w:after="160"/>
+            </w:pPr>
+            <w:r>
               <w:rPr>
                 <w:b/>
               </w:rPr>
-              <w:t>Stage 2: recruit through managers rather than directly.</w:t>
-            </w:r>
-            <w:r>
-              <w:t xml:space="preserve"> I presented to Heads of Area, setting out the role, how I wanted Digital Leads recruited, the impact they would have and how I would train and work with them. I asked each Head of Area to identify someone in their team, ideally a member of teaching staff, and made clear that if nobody came forward the responsibility would fall to them. This guaranteed coverage of every area, but it also meant some Digital Leads were volunteered rather than volunteering.</w:t>
+              <w:t>Baselining before training.</w:t>
+            </w:r>
+            <w:r>
+              <w:t xml:space="preserve"> I captured what learning material looked like before delivering CPD to all staff. This gives a clear view of the current picture and, more importantly, allows staff to see the impact of their own CPD time when the position improves. The limitation is that it requires openness. The baseline will not look good, and some staff are sensitive to being held to account for something they did not know. This is why building trust matters, why I support Digital Leads in how they deliver the training, and why the message has to be that we are growing together rather than being measured.</w:t>
             </w:r>
           </w:p>
           <w:p>
@@ -7752,10 +8065,10 @@
               <w:rPr>
                 <w:b/>
               </w:rPr>
-              <w:t>Stage 3: selection by the manager, against my criteria.</w:t>
-            </w:r>
-            <w:r>
-              <w:t xml:space="preserve"> I specified the role and the kind of person needed, but Heads of Area chose. The limitation is inconsistency: some are confident, others much less so. What it delivers in return is subject specialism, knowledge of the team, and understanding of the context they work in. On balance this is the stronger trade, because that local knowledge cannot be recruited for centrally.</w:t>
+              <w:t>Relatedness.</w:t>
+            </w:r>
+            <w:r>
+              <w:t xml:space="preserve"> This is the acknowledged gap. The buddying system requires knowing which teams need support and which are strong enough to offer it. The termly meeting would allow Digital Leads to feel part of a collective rather than working in silo, sharing good practice, bringing problems to solve together, and recognising that they are on the same journey even at different stages. Neither is yet in place.</w:t>
             </w:r>
           </w:p>
           <w:p>
@@ -7766,729 +8079,10 @@
               <w:rPr>
                 <w:b/>
               </w:rPr>
-              <w:t>Stage 4: no formal application or interview.</w:t>
-            </w:r>
-            <w:r>
-              <w:t xml:space="preserve"> There was no CV, shortlisting or evidence of capability before people started, which means every relationship begins on a blank canvas. Some Digital Leads are </w:t>
-            </w:r>
-            <w:proofErr w:type="gramStart"/>
-            <w:r>
-              <w:t>forthcoming</w:t>
-            </w:r>
-            <w:proofErr w:type="gramEnd"/>
-            <w:r>
-              <w:t xml:space="preserve"> and we have moved quickly through their action plans with meaningful impact already. With others, communication has been limited and the relationship still needs building. Heads of Area who absorbed the role tend to be less available for additional meetings, though as the role grows some may find it easier to identify a colleague better p</w:t>
-            </w:r>
-            <w:r>
-              <w:t>laced to take it on.</w:t>
-            </w:r>
-          </w:p>
-          <w:p>
-            <w:pPr>
-              <w:spacing w:after="160"/>
-            </w:pPr>
-            <w:r>
-              <w:rPr>
-                <w:b/>
-              </w:rPr>
-              <w:t>Stage 5: onboarding as selection.</w:t>
-            </w:r>
-            <w:r>
-              <w:t xml:space="preserve"> The three-part CPD in June was training, but it also functioned as selection. It clarified for everyone what the role </w:t>
-            </w:r>
-            <w:proofErr w:type="gramStart"/>
-            <w:r>
-              <w:t>actually involved</w:t>
-            </w:r>
-            <w:proofErr w:type="gramEnd"/>
-            <w:r>
-              <w:t>, and one Digital Lead withdrew as a result, her area then being covered by the Head of Area. This is selection through onboarding rather than selection before it.</w:t>
-            </w:r>
-          </w:p>
-          <w:p>
-            <w:pPr>
-              <w:spacing w:after="160"/>
-            </w:pPr>
-            <w:r>
-              <w:rPr>
-                <w:b/>
-              </w:rPr>
-              <w:t>What the process achieves and what it costs.</w:t>
-            </w:r>
-            <w:r>
-              <w:t xml:space="preserve"> Manager-led recruitment gave speed and complete coverage, at the cost of variable quality. The absence of a formal process removed any barrier to volunteering, which suits an unpaid role, but meant no screening for capability or willingness. Volunteering is itself a filter, and arguably a good one, since people who put themselves forward for unpaid work generally understand what they want from it. What could not be selected for was confidence, which has proved to matter more than technical skill.</w:t>
-            </w:r>
-          </w:p>
-          <w:p>
-            <w:pPr>
-              <w:spacing w:after="160"/>
-            </w:pPr>
-            <w:r>
-              <w:rPr>
-                <w:b/>
-              </w:rPr>
-              <w:t>Recommendation for future recruitment.</w:t>
-            </w:r>
-            <w:r>
-              <w:t xml:space="preserve"> I would keep the manager-led model. Heads of Area know their staff, know who is ready to take on responsibility as part of their own development towards leadership, and can judge whether someone has the capacity, capability and subject knowledge the role requires. Selecting the person themselves also gives the manager greater confidence in the appointment. What I would add is a short conversation with each nominee before the CPD begins. Not an interview, but a discussion of what the role </w:t>
-            </w:r>
-            <w:proofErr w:type="gramStart"/>
-            <w:r>
-              <w:t>actually involves</w:t>
-            </w:r>
-            <w:proofErr w:type="gramEnd"/>
-            <w:r>
-              <w:t>,</w:t>
-            </w:r>
-            <w:r>
-              <w:t xml:space="preserve"> held either with the Head of Area present or without them. Better still would be attending team meetings to talk about the role directly and answer questions, which both recruits and explains the work to the wider department. Either approach would surface, before appointment rather than after, those who discover on closer inspection that the role is not for them.</w:t>
-            </w:r>
-          </w:p>
-          <w:p>
-            <w:pPr>
-              <w:pStyle w:val="Heading2"/>
-              <w:rPr>
-                <w:sz w:val="28"/>
-                <w:szCs w:val="28"/>
-              </w:rPr>
-            </w:pPr>
-            <w:r>
-              <w:rPr>
-                <w:sz w:val="28"/>
-                <w:szCs w:val="28"/>
-              </w:rPr>
-              <w:lastRenderedPageBreak/>
-              <w:t>AC3.2 — Methods used to monitor and manage individual and team performance</w:t>
-            </w:r>
-          </w:p>
-          <w:p>
-            <w:pPr>
-              <w:spacing w:after="160"/>
-            </w:pPr>
-            <w:r>
-              <w:t>The core problem in this programme is that I monitor performance of people I do not manage. Appraisal, targets and supervision are not available to me. Four methods operate in their place.</w:t>
-            </w:r>
-          </w:p>
-          <w:p>
-            <w:pPr>
-              <w:spacing w:after="160"/>
-            </w:pPr>
-            <w:r>
-              <w:rPr>
-                <w:b/>
-              </w:rPr>
-              <w:t>Diagnostic data.</w:t>
-            </w:r>
-            <w:r>
-              <w:t xml:space="preserve"> The Health Check produces individual-level scores across five indicators. This is performance information that most managers do not hold, and it can be shared with Heads of Area so they can direct improvement using authority I do not have.</w:t>
-            </w:r>
-          </w:p>
-          <w:p>
-            <w:pPr>
-              <w:spacing w:after="160"/>
-            </w:pPr>
-            <w:r>
-              <w:rPr>
-                <w:b/>
-              </w:rPr>
-              <w:t>Repeated measurement.</w:t>
-            </w:r>
-            <w:r>
-              <w:t xml:space="preserve"> The June baseline captured a snapshot. Re-audits in November, February and at the end of the academic year turn that into a trend for both individuals and teams. This is less intrusive than asking people to prove improvement, because the work should be happening anyway and the audit simply records whether it has.</w:t>
-            </w:r>
-          </w:p>
-          <w:p>
-            <w:pPr>
-              <w:spacing w:after="160"/>
-            </w:pPr>
-            <w:r>
-              <w:rPr>
-                <w:b/>
-              </w:rPr>
-              <w:t>Triangulation.</w:t>
-            </w:r>
-            <w:r>
-              <w:t xml:space="preserve"> Learning walks, resource sampling and Quality team involvement test the self-assessment, and the conversations that follow with Teaching, Learning and Assessment Managers and Heads of Area keep the work visible rather than allowing it to become a once-a-term data exercise.</w:t>
-            </w:r>
-          </w:p>
-          <w:p>
-            <w:pPr>
-              <w:spacing w:after="160"/>
-            </w:pPr>
-            <w:r>
-              <w:rPr>
-                <w:b/>
-              </w:rPr>
-              <w:t>Visibility and borrowed authority.</w:t>
-            </w:r>
-            <w:r>
-              <w:t xml:space="preserve"> Completion rates and RAG ratings are reported to the Vice Principal for Quality, who can see which areas are engaged and which are not. He does not usually act directly, but he permits me to use his name where work needs to happen, holding direct escalation in reserve for cases that do not resolve. He also mentors me in this, asking questions that improve the quality of how I hold areas to account. The method is therefore borrowed authority rather than delegated authority.</w:t>
-            </w:r>
-          </w:p>
-          <w:p>
-            <w:pPr>
-              <w:spacing w:after="160"/>
-            </w:pPr>
-            <w:r>
-              <w:rPr>
-                <w:b/>
-              </w:rPr>
-              <w:t>Framing.</w:t>
-            </w:r>
-            <w:r>
-              <w:t xml:space="preserve"> The audit is developmental rather than judgemental. It exists to identify what support is needed, not to catch people out. This matters practically: general CPD on accessibility has not landed, so the value of the data is in identifying precisely what an individual needs, whether that is alt text, heading structure or colour contrast, and targeting support accordingly. If Digital Leads believed the audit were a performance management instrument, they would score generously and the data would be worthless.</w:t>
-            </w:r>
-          </w:p>
-          <w:p>
-            <w:pPr>
-              <w:spacing w:after="160"/>
-            </w:pPr>
-            <w:r>
-              <w:rPr>
-                <w:b/>
-              </w:rPr>
-              <w:t>The tension.</w:t>
-            </w:r>
-            <w:r>
-              <w:t xml:space="preserve"> That framing sits uncomfortably alongside the fact that the data does reach senior leaders. I hold both positions: the audit is developmental, and it is also the evidence base by which areas become visible to the executive. I address this by being explicit that improvement in accessibility and inclusion is something the whole organisation needs to own. No part of the college is untouched by it, because the organisational objective is that the SEND Framework permeates the entire organisation rather than tea</w:t>
-            </w:r>
-            <w:r>
-              <w:t>ching alone.</w:t>
-            </w:r>
-          </w:p>
-          <w:p>
-            <w:pPr>
-              <w:spacing w:after="160"/>
-              <w:rPr>
-                <w:b/>
-                <w:sz w:val="26"/>
-              </w:rPr>
-            </w:pPr>
-          </w:p>
-          <w:p>
-            <w:pPr>
-              <w:spacing w:after="160"/>
-              <w:rPr>
-                <w:b/>
-                <w:sz w:val="26"/>
-              </w:rPr>
-            </w:pPr>
-          </w:p>
-          <w:p>
-            <w:pPr>
-              <w:spacing w:after="160"/>
-              <w:rPr>
-                <w:b/>
-                <w:sz w:val="26"/>
-              </w:rPr>
-            </w:pPr>
-          </w:p>
-          <w:p>
-            <w:pPr>
-              <w:spacing w:after="160"/>
-              <w:rPr>
-                <w:b/>
-                <w:sz w:val="26"/>
-              </w:rPr>
-            </w:pPr>
-          </w:p>
-          <w:p>
-            <w:pPr>
-              <w:spacing w:after="160"/>
-              <w:rPr>
-                <w:b/>
-                <w:sz w:val="26"/>
-              </w:rPr>
-            </w:pPr>
-          </w:p>
-          <w:p>
-            <w:pPr>
-              <w:spacing w:after="160"/>
-              <w:rPr>
-                <w:b/>
-                <w:sz w:val="26"/>
-              </w:rPr>
-            </w:pPr>
-          </w:p>
-          <w:p>
-            <w:pPr>
-              <w:spacing w:after="160"/>
-              <w:rPr>
-                <w:b/>
-                <w:sz w:val="26"/>
-              </w:rPr>
-            </w:pPr>
-          </w:p>
-          <w:p>
-            <w:pPr>
-              <w:spacing w:after="160"/>
-              <w:rPr>
-                <w:b/>
-                <w:sz w:val="26"/>
-              </w:rPr>
-            </w:pPr>
-          </w:p>
-          <w:p>
-            <w:pPr>
-              <w:spacing w:after="160"/>
-              <w:rPr>
-                <w:b/>
-                <w:sz w:val="26"/>
-              </w:rPr>
-            </w:pPr>
-          </w:p>
-          <w:p>
-            <w:pPr>
-              <w:spacing w:after="160"/>
-              <w:rPr>
-                <w:b/>
-                <w:sz w:val="26"/>
-              </w:rPr>
-            </w:pPr>
-          </w:p>
-          <w:p>
-            <w:pPr>
-              <w:pStyle w:val="Heading1"/>
-              <w:rPr>
-                <w:sz w:val="32"/>
-                <w:szCs w:val="32"/>
-              </w:rPr>
-            </w:pPr>
-            <w:r>
-              <w:rPr>
-                <w:sz w:val="32"/>
-                <w:szCs w:val="32"/>
-              </w:rPr>
-              <w:lastRenderedPageBreak/>
-              <w:t>TASK 4 — Report: "Skills and approaches in managing talent and performance"</w:t>
-            </w:r>
-          </w:p>
-          <w:p>
-            <w:pPr>
-              <w:pStyle w:val="Heading2"/>
-              <w:rPr>
-                <w:sz w:val="28"/>
-                <w:szCs w:val="28"/>
-              </w:rPr>
-            </w:pPr>
-            <w:r>
-              <w:rPr>
-                <w:sz w:val="28"/>
-                <w:szCs w:val="28"/>
-              </w:rPr>
-              <w:t>AC4.1 — Practical approaches for effective team management and leadership</w:t>
-            </w:r>
-          </w:p>
-          <w:p>
-            <w:pPr>
-              <w:spacing w:after="160"/>
-            </w:pPr>
-            <w:r>
-              <w:t>The approaches I use divide into two categories: those that constitute the coaching role itself, and the systems built to make that role possible.</w:t>
-            </w:r>
-          </w:p>
-          <w:p>
-            <w:pPr>
-              <w:spacing w:after="160"/>
-            </w:pPr>
-            <w:r>
-              <w:rPr>
-                <w:b/>
-              </w:rPr>
-              <w:t>The tiered support model.</w:t>
-            </w:r>
-            <w:r>
-              <w:t xml:space="preserve"> This is the approach most closely aligned to my role as Digital Pedagogy Coach, and the one I would keep if everything else were stripped away. Digital Leads sit in three broad positions: those working independently who need only a framework and a collegiate direction; those who need a sounding board to check and shape what they intend to do; and those who need me to work hands-on with them and their teams. The tier is not fixed to the person, and someone confident in one aspect of the role may need consid</w:t>
-            </w:r>
-            <w:r>
-              <w:t>erably more support in another.</w:t>
-            </w:r>
-          </w:p>
-          <w:p>
-            <w:pPr>
-              <w:spacing w:after="160"/>
-            </w:pPr>
-            <w:r>
-              <w:rPr>
-                <w:b/>
-              </w:rPr>
-              <w:t>Responsiveness.</w:t>
-            </w:r>
-            <w:r>
-              <w:t xml:space="preserve"> I hold no line management authority over Digital Leads, but I do lead in the space of digital learning, and responsiveness is how that leadership is exercised. I answer their calls, respond to their messages first, and travel to their site where that is what is needed. This is not separate from the tiered model but part of how it works: those who need me to be more hands-on need me to be genuinely available, not available in principle.</w:t>
-            </w:r>
-          </w:p>
-          <w:p>
-            <w:pPr>
-              <w:spacing w:after="160"/>
-            </w:pPr>
-            <w:r>
-              <w:rPr>
-                <w:b/>
-              </w:rPr>
-              <w:t>The supporting systems.</w:t>
-            </w:r>
-            <w:r>
-              <w:t xml:space="preserve"> The negotiated action plan, the shared diagnostic instrument, the single communication channel and the escalation process held in reserve sit outside the day-to-day coaching role. I built them because they make the coaching work possible. I need to know where the problems are, and I need my time to be spent where it has impact. The Health Check gives me eyes and ears across areas I cannot physically reach, the Teams space means information reaches everyone without depending on me remembering to pass it on,</w:t>
-            </w:r>
-            <w:r>
-              <w:t xml:space="preserve"> the action plan negotiated with each Digital Lead ensures ownership sits with them, and escalation exists so that non-engagement has a route to resolution without my having to confront it personally.</w:t>
-            </w:r>
-          </w:p>
-          <w:p>
-            <w:pPr>
-              <w:spacing w:after="160"/>
-            </w:pPr>
-            <w:r>
-              <w:rPr>
-                <w:b/>
-              </w:rPr>
-              <w:t>What is not yet working.</w:t>
-            </w:r>
-            <w:r>
-              <w:t xml:space="preserve"> Engagement is not uniform. Some Digital Leads have read messages without responding, have not completed their Health Check, and have not taken up offers of support. That will require escalation, and I am clear that it does. My judgement at this stage, however, has been to prioritise action plans for those who are engaged, so that the people doing the work are not effectively penalised by my attention going to those who are not. The reasons for non-engagement are not yet established and could include worklo</w:t>
-            </w:r>
-            <w:r>
-              <w:t xml:space="preserve">ad, restructure or personal circumstances, and identifying the actual barrier matters more than applying pressure. Establishing that is work for the coming weeks. It is a limitation of the current approach that responsiveness works well for those who </w:t>
-            </w:r>
-            <w:proofErr w:type="gramStart"/>
-            <w:r>
-              <w:t>respond, and</w:t>
-            </w:r>
-            <w:proofErr w:type="gramEnd"/>
-            <w:r>
-              <w:t xml:space="preserve"> does not yet reach those who do not.</w:t>
-            </w:r>
-          </w:p>
-          <w:p>
-            <w:pPr>
-              <w:spacing w:after="160"/>
-            </w:pPr>
-            <w:r>
-              <w:rPr>
-                <w:b/>
-              </w:rPr>
-              <w:t>Alignment to organisational objectives.</w:t>
-            </w:r>
-            <w:r>
-              <w:t xml:space="preserve"> The impact these approaches produce </w:t>
-            </w:r>
-            <w:proofErr w:type="gramStart"/>
-            <w:r>
-              <w:t>has to</w:t>
-            </w:r>
-            <w:proofErr w:type="gramEnd"/>
-            <w:r>
-              <w:t xml:space="preserve"> be aligned to what the organisation is trying to achieve, which is why the programme was proposed around accessibility and inclusion specifically. That framing connects the day-to-day coaching work to the organisational objective that the SEND Framework permeates the </w:t>
-            </w:r>
-            <w:proofErr w:type="gramStart"/>
-            <w:r>
-              <w:t>college</w:t>
-            </w:r>
-            <w:proofErr w:type="gramEnd"/>
-            <w:r>
-              <w:t xml:space="preserve"> and that teaching, learning and assessment is inclusive for all. Without that alignment, the systems would generate activity rather than impact.</w:t>
-            </w:r>
-          </w:p>
-          <w:p>
-            <w:pPr>
-              <w:spacing w:after="160"/>
-              <w:rPr>
-                <w:b/>
-              </w:rPr>
-            </w:pPr>
-          </w:p>
-          <w:p>
-            <w:pPr>
-              <w:pStyle w:val="Heading2"/>
-              <w:rPr>
-                <w:sz w:val="28"/>
-                <w:szCs w:val="28"/>
-              </w:rPr>
-            </w:pPr>
-            <w:r>
-              <w:rPr>
-                <w:sz w:val="28"/>
-                <w:szCs w:val="28"/>
-              </w:rPr>
-              <w:t>AC4.2 — Skills and techniques for current and future needs, and techniques for assessing these</w:t>
-            </w:r>
-          </w:p>
-          <w:p>
-            <w:pPr>
-              <w:spacing w:after="160"/>
-            </w:pPr>
-            <w:r>
-              <w:t xml:space="preserve">Everything currently sits on top of accessibility fundamentals, so the immediate requirement is that those are secure. By the end of this academic </w:t>
-            </w:r>
-            <w:proofErr w:type="gramStart"/>
-            <w:r>
-              <w:t>year</w:t>
-            </w:r>
-            <w:proofErr w:type="gramEnd"/>
-            <w:r>
-              <w:t xml:space="preserve"> I want the college to be able to say that everything leaving it is </w:t>
-            </w:r>
-            <w:r>
-              <w:lastRenderedPageBreak/>
-              <w:t>accessible: learning material, internal communications, outward posts and social media, produced at any level and in any department, including Professional Learner Services and the executive rather than teaching alone.</w:t>
-            </w:r>
-          </w:p>
-          <w:p>
-            <w:pPr>
-              <w:spacing w:after="160"/>
-            </w:pPr>
-            <w:r>
-              <w:t>Beyond that, four areas of capability are required.</w:t>
-            </w:r>
-          </w:p>
-          <w:p>
-            <w:pPr>
-              <w:spacing w:after="160"/>
-            </w:pPr>
-            <w:r>
-              <w:rPr>
-                <w:b/>
-              </w:rPr>
-              <w:t>Digital learning environments.</w:t>
-            </w:r>
-            <w:r>
-              <w:t xml:space="preserve"> Once resources themselves are accessible, the question becomes how they reach learners. Most Teams environments contain all the necessary material, but it is not always easy to navigate. Reducing the number of clicks matters because learners who cannot find things disengage, and many of our learners are not digitally literate to begin with. Staff also need confidence in the legal and behavioural dimensions of an online learning space, including GDPR and safeguarding.</w:t>
-            </w:r>
-          </w:p>
-          <w:p>
-            <w:pPr>
-              <w:spacing w:after="160"/>
-            </w:pPr>
-            <w:r>
-              <w:rPr>
-                <w:b/>
-              </w:rPr>
-              <w:t>Learner digital skills baselining.</w:t>
-            </w:r>
-            <w:r>
-              <w:t xml:space="preserve"> This is work I have begun with Heads of Area. The Ofsted toolkit refers repeatedly to digital skills alongside English and maths in terms of baseline and progression, so staff need to be proficient enough to capture, address and monitor learner progress. This matters given that digital skills teaching in secondary schools is inconsistent and dependent on the confidence of individual teachers.</w:t>
-            </w:r>
-          </w:p>
-          <w:p>
-            <w:pPr>
-              <w:spacing w:after="160"/>
-            </w:pPr>
-            <w:r>
-              <w:rPr>
-                <w:b/>
-              </w:rPr>
-              <w:t>Artificial intelligence.</w:t>
-            </w:r>
-            <w:r>
-              <w:t xml:space="preserve"> AI needs treating in the same way as accessibility, beginning with fundamentals. Generating impressive resources through clever prompting achieves little if staff cannot then embed them within a coherent model of teaching and learning. It is fast-moving and significant, but capability </w:t>
-            </w:r>
-            <w:proofErr w:type="gramStart"/>
-            <w:r>
-              <w:t>has to</w:t>
-            </w:r>
-            <w:proofErr w:type="gramEnd"/>
-            <w:r>
-              <w:t xml:space="preserve"> be built in a way that allows confidence to develop.</w:t>
-            </w:r>
-          </w:p>
-          <w:p>
-            <w:pPr>
-              <w:spacing w:after="160"/>
-            </w:pPr>
-            <w:r>
-              <w:rPr>
-                <w:b/>
-              </w:rPr>
-              <w:t>Data analysis.</w:t>
-            </w:r>
-            <w:r>
-              <w:t xml:space="preserve"> We can now collect data quickly. The requirement is to move it forward without absorbing planning time in analysis, which raises the question of whether automation or AI can carry the processing so that available time is spent shifting practice rather than interpreting spreadsheets.</w:t>
-            </w:r>
-          </w:p>
-          <w:p>
-            <w:pPr>
-              <w:spacing w:after="160"/>
-            </w:pPr>
-            <w:r>
-              <w:rPr>
-                <w:b/>
-              </w:rPr>
-              <w:t>Techniques for assessing capability.</w:t>
-            </w:r>
-            <w:r>
-              <w:t xml:space="preserve"> Assessment operates through several instruments. The Digital Health Check provides indicator-level data on individual practice. Learning walks provide observation independent of self-report. The RAG framework aggregates this to area level across weighted dimensions. The Jisc Discovery Tool is being released to staff shortly after induction, and will indicate what staff understand, what they are working towards and where they want to improve, giving both a capability picture and a gap analysis.</w:t>
-            </w:r>
-          </w:p>
-          <w:p>
-            <w:pPr>
-              <w:spacing w:after="160"/>
-            </w:pPr>
-            <w:r>
-              <w:t>Each has a weakness. The Health Check is a self-assessment carried out by Digital Leads of varying confidence, so inter-rater consistency is not assured. Coverage is uneven, with some dimensions substantially under-scored in the baseline. The Jisc Discovery Tool relies on self-report. Learning walks provide independent observation but sample only a fraction of practice. Used together they compensate for one another; used singly, any one of them would give a misleading picture.</w:t>
-            </w:r>
-          </w:p>
-          <w:p>
-            <w:pPr>
-              <w:spacing w:after="160"/>
-              <w:rPr>
-                <w:b/>
-              </w:rPr>
-            </w:pPr>
-          </w:p>
-          <w:p>
-            <w:pPr>
-              <w:pStyle w:val="Heading2"/>
-              <w:rPr>
-                <w:sz w:val="28"/>
-                <w:szCs w:val="28"/>
-              </w:rPr>
-            </w:pPr>
-            <w:r>
-              <w:rPr>
-                <w:sz w:val="28"/>
-                <w:szCs w:val="28"/>
-              </w:rPr>
-              <w:t>AC4.3 — Good practices for enabling and supporting high performing teams</w:t>
-            </w:r>
-          </w:p>
-          <w:p>
-            <w:pPr>
-              <w:spacing w:after="160"/>
-            </w:pPr>
-            <w:r>
-              <w:rPr>
-                <w:b/>
-              </w:rPr>
-              <w:t>Clarity of role.</w:t>
-            </w:r>
-            <w:r>
-              <w:t xml:space="preserve"> Everyone now understands what a Digital Lead does and why it matters. The role was defined and signed off at Vice Principal </w:t>
-            </w:r>
-            <w:proofErr w:type="gramStart"/>
-            <w:r>
-              <w:t>level, and</w:t>
-            </w:r>
-            <w:proofErr w:type="gramEnd"/>
-            <w:r>
-              <w:t xml:space="preserve"> recruited through Heads of Area. Its limitation is that clarity of role is not the same as clarity of shared purpose, which returns to the distinction drawn earlier between a working group and a team.</w:t>
-            </w:r>
-          </w:p>
-          <w:p>
-            <w:pPr>
-              <w:spacing w:after="160"/>
-            </w:pPr>
-            <w:r>
-              <w:rPr>
-                <w:b/>
-              </w:rPr>
-              <w:t>Psychological safety.</w:t>
-            </w:r>
-            <w:r>
-              <w:t xml:space="preserve"> The audit is deliberately designed as developmental and framed as an honest opening to a conversation about improving practice from the foundations upward. It is also honest about the fact that this is something we should already know and have not attended to for some time. Edmondson argues that teams perform best where people can admit not knowing something. Edmondson, A. (1999) 'Psychological Safety and Learning </w:t>
-            </w:r>
-            <w:proofErr w:type="spellStart"/>
-            <w:r>
-              <w:t>Behavior</w:t>
-            </w:r>
-            <w:proofErr w:type="spellEnd"/>
-            <w:r>
-              <w:t xml:space="preserve"> in Work Teams', </w:t>
-            </w:r>
-            <w:r>
-              <w:rPr>
-                <w:i/>
-              </w:rPr>
-              <w:t>Administrative Science Quarterly</w:t>
-            </w:r>
-            <w:r>
-              <w:t xml:space="preserve">, 44(2), pp. 350–383. The Jisc Discovery data from December showed that staff do know about accessibility and about Immersive Reader; what they are not doing is delivering on it day to </w:t>
-            </w:r>
-            <w:proofErr w:type="gramStart"/>
-            <w:r>
-              <w:t>day, and</w:t>
-            </w:r>
-            <w:proofErr w:type="gramEnd"/>
-            <w:r>
-              <w:t xml:space="preserve"> being able to say that openly is what makes improvement possible.</w:t>
-            </w:r>
-          </w:p>
-          <w:p>
-            <w:pPr>
-              <w:spacing w:after="160"/>
-            </w:pPr>
-            <w:r>
-              <w:lastRenderedPageBreak/>
-              <w:t xml:space="preserve">The limitation is that this depends on people believing the framing, and on the data </w:t>
-            </w:r>
-            <w:proofErr w:type="gramStart"/>
-            <w:r>
-              <w:t>actually influencing</w:t>
-            </w:r>
-            <w:proofErr w:type="gramEnd"/>
-            <w:r>
-              <w:t xml:space="preserve"> organisational decisions. It is also why I am working with the executive team. If staff are asked to improve accessibility while communications from the executive do not meet the same standard, the framing erodes and so does buy-in.</w:t>
-            </w:r>
-          </w:p>
-          <w:p>
-            <w:pPr>
-              <w:spacing w:after="160"/>
-            </w:pPr>
-            <w:r>
-              <w:rPr>
-                <w:b/>
-              </w:rPr>
-              <w:t>Baselining before training.</w:t>
-            </w:r>
-            <w:r>
-              <w:t xml:space="preserve"> I captured what learning material looked like before delivering CPD to all staff. This gives a clear view of the current picture and, more importantly, allows staff to see the impact of their own CPD time when the position improves. The limitation is that it requires openness. The baseline will not look good, and some staff are sensitive to being held to account for something they did not know. This is why building trust matters, why I support Digital Leads in how they deliver the training, and why the mes</w:t>
-            </w:r>
-            <w:r>
-              <w:t xml:space="preserve">sage </w:t>
-            </w:r>
-            <w:proofErr w:type="gramStart"/>
-            <w:r>
-              <w:t>has to</w:t>
-            </w:r>
-            <w:proofErr w:type="gramEnd"/>
-            <w:r>
-              <w:t xml:space="preserve"> be that we are growing together rather than being measured.</w:t>
-            </w:r>
-          </w:p>
-          <w:p>
-            <w:pPr>
-              <w:spacing w:after="160"/>
-            </w:pPr>
-            <w:r>
-              <w:rPr>
-                <w:b/>
-              </w:rPr>
-              <w:t>Relatedness.</w:t>
-            </w:r>
-            <w:r>
-              <w:t xml:space="preserve"> This is the acknowledged gap. The buddying system requires knowing which teams need support and which are strong enough to offer it. The termly meeting would allow Digital Leads to feel part of a collective rather than working in silo, sharing good practice, bringing problems to solve together, and recognising that they are on the same journey even at different stages. Neither is yet in place.</w:t>
-            </w:r>
-          </w:p>
-          <w:p>
-            <w:pPr>
-              <w:spacing w:after="160"/>
-            </w:pPr>
-            <w:r>
-              <w:rPr>
-                <w:b/>
-              </w:rPr>
               <w:t>Judgement.</w:t>
             </w:r>
             <w:r>
-              <w:t xml:space="preserve"> On balance, the practices that establish safety and capability are secure, and the practice that would convert a network into a team is not. The Digital Leads are supported but not yet high </w:t>
-            </w:r>
-            <w:proofErr w:type="gramStart"/>
-            <w:r>
-              <w:t>performing, and</w:t>
-            </w:r>
-            <w:proofErr w:type="gramEnd"/>
-            <w:r>
-              <w:t xml:space="preserve"> closing the relatedness gap is the condition for that changing.</w:t>
+              <w:t xml:space="preserve"> On balance, the practices that establish safety and capability are secure, and the practice that would convert a network into a team is not. The Digital Leads are supported but not yet high performing, and closing the relatedness gap is the condition for that changing.</w:t>
             </w:r>
           </w:p>
           <w:p>
@@ -8822,9 +8416,9 @@
           </mc:Choice>
           <mc:Fallback>
             <w:pict>
-              <v:group w14:anchorId="152BB9D4" id="Group 3" o:spid="_x0000_s1062" style="width:537.1pt;height:26.95pt;mso-position-horizontal-relative:char;mso-position-vertical-relative:line" coordorigin="19352,36089" coordsize="68214,3420" o:gfxdata="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">
-                <v:group id="Group 1410127774" o:spid="_x0000_s1063" style="position:absolute;left:19352;top:36089;width:68215;height:3421" coordorigin="19352,36089" coordsize="68214,3420" o:gfxdata="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">
-                  <v:rect id="Rectangle 1757078779" o:spid="_x0000_s1064" style="position:absolute;left:19352;top:36089;width:68215;height:3421;visibility:visible;mso-wrap-style:square;v-text-anchor:middle" o:gfxdata="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" filled="f" stroked="f">
+              <v:group w14:anchorId="152BB9D4" id="Group 3" o:spid="_x0000_s1062" style="width:537.1pt;height:26.95pt;mso-position-horizontal-relative:char;mso-position-vertical-relative:line" coordorigin="19352,36089" coordsize="68214,3420" o:gfxdata="UEsDBBQABgAIAAAAIQC2gziS/gAAAOEBAAATAAAAW0NvbnRlbnRfVHlwZXNdLnhtbJSRQU7DMBBF 90jcwfIWJU67QAgl6YK0S0CoHGBkTxKLZGx5TGhvj5O2G0SRWNoz/78nu9wcxkFMGNg6quQqL6RA 0s5Y6ir5vt9lD1JwBDIwOMJKHpHlpr69KfdHjyxSmriSfYz+USnWPY7AufNIadK6MEJMx9ApD/oD OlTrorhX2lFEilmcO2RdNtjC5xDF9pCuTyYBB5bi6bQ4syoJ3g9WQ0ymaiLzg5KdCXlKLjvcW893 SUOqXwnz5DrgnHtJTxOsQfEKIT7DmDSUCaxw7Rqn8787ZsmRM9e2VmPeBN4uqYvTtW7jvijg9N/y JsXecLq0q+WD6m8AAAD//wMAUEsDBBQABgAIAAAAIQA4/SH/1gAAAJQBAAALAAAAX3JlbHMvLnJl bHOkkMFqwzAMhu+DvYPRfXGawxijTi+j0GvpHsDYimMaW0Yy2fr2M4PBMnrbUb/Q94l/f/hMi1qR JVI2sOt6UJgd+ZiDgffL8ekFlFSbvV0oo4EbChzGx4f9GRdb25HMsYhqlCwG5lrLq9biZkxWOiqY 22YiTra2kYMu1l1tQD30/bPm3wwYN0x18gb45AdQl1tp5j/sFB2T0FQ7R0nTNEV3j6o9feQzro1i OWA14Fm+Q8a1a8+Bvu/d/dMb2JY5uiPbhG/ktn4cqGU/er3pcvwCAAD//wMAUEsDBBQABgAIAAAA IQB8gxJc0QMAAJcVAAAOAAAAZHJzL2Uyb0RvYy54bWzsWNtu2zgQfV9g/4HQe2ORokRJiFMUbRMs UGyDXj6AlilbgCRqSSZ2/n6H1NWJ3dZp110XfZHJIUUND8+ZGfPy5bYq0b1QupD13MMXvodEncll Ua/m3udP1y9iD2nD6yUvZS3m3oPQ3surP/+43DSpIHIty6VQCBapdbpp5t7amCadzXS2FhXXF7IR NQzmUlXcQFetZkvFN7B6Vc6I70ezjVTLRslMaA3WN+2gd+XWz3ORmfd5roVB5dwD34x7Kvdc2Ofs 6pKnK8WbdZF1bvBneFHxooaPDku94YajO1U8WaoqMiW1zM1FJquZzPMiE24PsBvsP9rNjZJ3jdvL Kt2smgEmgPYRTs9eNvv7/kY1H5tbBUhsmhVg4Xp2L9tcVfYXvERbB9nDAJnYGpSBMYoJpph6KIOx gBKf4BbTbA3A29dwEoSEhR6yEyI/TqDtUM/Wb6eLhHA8/SLQhimz3oXZjmNDp3UYdnCrULGEL1Hs Y8IYA3dqXgHbHIBoYu82ecSunftJMLqfdKT5qQiAWPTIB/19fPi45o1wNNPpBE0WMp/FjCU9mh9A TbxelQLhccwh6t4bSKRTDXzaw6CDVNjB8gtE4GmjtLkRskK2MfcUuOR0x+/fadNypp9iHajldVGW YOdpWe8YgFzWAtTq3bUts11sHZdaGlvTQi4fgGC6ya4L+OY7rs0tVxAksIc2EDjmnv7njivhofKv Gk4iwZQA2820o6adxbTD62wtIR5lRnmo7bw2Lj613r66MzIv3M5GZzq3gQITzT5VA4tp5AdR1J9f r4bB/lsNe4LufjXQIAgiEgxYjloYRn5VJRAbi0fynaESGKVhzEJMHilhtP8PlIAZ9bvUcigzkhBK ni9mxhPkBZokIQ78GNJ1m2QnUhiGnq+FCQz7s8JTEE6YFYKz10JESRQHQKPdEmkwf68S4Pwwsyjx dOf8hhqRhBhSkpsw1IgBOGRdsiWin4AvT0rEBEcxDboSkRLCfr4QsB/4EcNxNISVUQmTsWOkcAiH HkmHgq0ubKG8B4UTKoGejRJOEBMxS0JKMBmY8P6el1Al99ZjOJD4UFxbpj8WQ0+C7ty/mQOiLItG 2wKfpwfKZC3LYmkrZTtHq9XidakQbGHuXdNXGL+1Zw0F8860I+tpp+izqCJOwBcWRT7DhA5/rRxf RusxfPlazDhPurgM8Zsu7cVGGAQ0xCwa7jXGRDMOHcOZ0IdcCsHqUIiJGQ1dQv5ReWYncvw3AcYV HWfAmPEyy/2N727cvtKG2z8XgbubSnu9OO27t8f71Kt/AQAA//8DAFBLAwQUAAYACAAAACEAOG2G Gd0AAAAFAQAADwAAAGRycy9kb3ducmV2LnhtbEyPQWvCQBCF70L/wzKF3uomWtuaZiMibU8iVAvF 25gdk2B2NmTXJP77rr3Uy8DjPd77Jl0MphYdta6yrCAeRyCIc6srLhR87z4eX0E4j6yxtkwKLuRg kd2NUky07fmLuq0vRChhl6CC0vsmkdLlJRl0Y9sQB+9oW4M+yLaQusU+lJtaTqLoWRqsOCyU2NCq pPy0PRsFnz32y2n83q1Px9Vlv5ttftYxKfVwPyzfQHga/H8YrvgBHbLAdLBn1k7UCsIj/u9evejl aQLioGA2nYPMUnlLn/0CAAD//wMAUEsBAi0AFAAGAAgAAAAhALaDOJL+AAAA4QEAABMAAAAAAAAA AAAAAAAAAAAAAFtDb250ZW50X1R5cGVzXS54bWxQSwECLQAUAAYACAAAACEAOP0h/9YAAACUAQAA CwAAAAAAAAAAAAAAAAAvAQAAX3JlbHMvLnJlbHNQSwECLQAUAAYACAAAACEAfIMSXNEDAACXFQAA DgAAAAAAAAAAAAAAAAAuAgAAZHJzL2Uyb0RvYy54bWxQSwECLQAUAAYACAAAACEAOG2GGd0AAAAF AQAADwAAAAAAAAAAAAAAAAArBgAAZHJzL2Rvd25yZXYueG1sUEsFBgAAAAAEAAQA8wAAADUHAAAA AA== ">
+                <v:group id="Group 1410127774" o:spid="_x0000_s1063" style="position:absolute;left:19352;top:36089;width:68215;height:3421" coordorigin="19352,36089" coordsize="68214,3420" o:gfxdata="UEsDBBQABgAIAAAAIQDb4fbL7gAAAIUBAAATAAAAW0NvbnRlbnRfVHlwZXNdLnhtbHyQz07DMAyH 70i8Q+QralM4IITa7kDhCAiNB7ASt43WOlEcyvb2pNu4IODoPz9/n1xv9vOkForiPDdwXVagiI23 jocG3rdPxR0oScgWJ8/UwIEENu3lRb09BBKV0ywNjCmFe63FjDSjlD4Q50nv44wpl3HQAc0OB9I3 VXWrjedEnIq03oC27qjHjympx31un0wiTQLq4bS4shrAECZnMGVTvbD9QSnOhDInjzsyuiBXWQP0 r4R18jfgnHvJr4nOknrFmJ5xzhraRtHWf3Kkpfz/yGo5S+H73hkquyhdjr3R8m2lj09svwAAAP// AwBQSwMEFAAGAAgAAAAhAFr0LFu/AAAAFQEAAAsAAABfcmVscy8ucmVsc2zPwWrDMAwG4Ptg72B0 X5TuUMaI01uh19I+gLGVxCy2jGSy9e1nemrHjpL4P0nD4SetZiPRyNnCruvBUPYcYp4tXC/Htw8w Wl0ObuVMFm6kcBhfX4Yzra62kC6xqGlKVgtLreUTUf1CyWnHhXKbTCzJ1VbKjMX5LzcTvvf9HuXR gPHJNKdgQU5hB+ZyK23zHztFL6w81c5zQp6m6P9TMfB3PtPWFCczVQtB9N4U2rp2HOA44NMz4y8A AAD//wMAUEsDBBQABgAIAAAAIQD7kKaUyAAAAOMAAAAPAAAAZHJzL2Rvd25yZXYueG1sRE9fa8Iw EH8f7DuEG/imadStozOKiMoeZDAdjL0dzdkWm0tpYlu//TIQ9ni//7dYDbYWHbW+cqxBTRIQxLkz FRcavk678SsIH5AN1o5Jw408rJaPDwvMjOv5k7pjKEQMYZ+hhjKEJpPS5yVZ9BPXEEfu7FqLIZ5t IU2LfQy3tZwmyYu0WHFsKLGhTUn55Xi1GvY99uuZ2naHy3lz+zk9f3wfFGk9ehrWbyACDeFffHe/ mzh/rhI1TdN0Dn8/RQDk8hcAAP//AwBQSwECLQAUAAYACAAAACEA2+H2y+4AAACFAQAAEwAAAAAA AAAAAAAAAAAAAAAAW0NvbnRlbnRfVHlwZXNdLnhtbFBLAQItABQABgAIAAAAIQBa9CxbvwAAABUB AAALAAAAAAAAAAAAAAAAAB8BAABfcmVscy8ucmVsc1BLAQItABQABgAIAAAAIQD7kKaUyAAAAOMA AAAPAAAAAAAAAAAAAAAAAAcCAABkcnMvZG93bnJldi54bWxQSwUGAAAAAAMAAwC3AAAA/AIAAAAA ">
+                  <v:rect id="Rectangle 1757078779" o:spid="_x0000_s1064" style="position:absolute;left:19352;top:36089;width:68215;height:3421;visibility:visible;mso-wrap-style:square;v-text-anchor:middle" o:gfxdata="UEsDBBQABgAIAAAAIQDb4fbL7gAAAIUBAAATAAAAW0NvbnRlbnRfVHlwZXNdLnhtbHyQz07DMAyH 70i8Q+QralM4IITa7kDhCAiNB7ASt43WOlEcyvb2pNu4IODoPz9/n1xv9vOkForiPDdwXVagiI23 jocG3rdPxR0oScgWJ8/UwIEENu3lRb09BBKV0ywNjCmFe63FjDSjlD4Q50nv44wpl3HQAc0OB9I3 VXWrjedEnIq03oC27qjHjympx31un0wiTQLq4bS4shrAECZnMGVTvbD9QSnOhDInjzsyuiBXWQP0 r4R18jfgnHvJr4nOknrFmJ5xzhraRtHWf3Kkpfz/yGo5S+H73hkquyhdjr3R8m2lj09svwAAAP// AwBQSwMEFAAGAAgAAAAhAFr0LFu/AAAAFQEAAAsAAABfcmVscy8ucmVsc2zPwWrDMAwG4Ptg72B0 X5TuUMaI01uh19I+gLGVxCy2jGSy9e1nemrHjpL4P0nD4SetZiPRyNnCruvBUPYcYp4tXC/Htw8w Wl0ObuVMFm6kcBhfX4Yzra62kC6xqGlKVgtLreUTUf1CyWnHhXKbTCzJ1VbKjMX5LzcTvvf9HuXR gPHJNKdgQU5hB+ZyK23zHztFL6w81c5zQp6m6P9TMfB3PtPWFCczVQtB9N4U2rp2HOA44NMz4y8A AAD//wMAUEsDBBQABgAIAAAAIQBvq6yBxgAAAOMAAAAPAAAAZHJzL2Rvd25yZXYueG1sRE9fT8Iw EH838Ts0Z8KbdCxIYVCIGk3QJx1+gHM91oX1OtcK49tTEhMf7/f/VpvBteJIfWg8a5iMMxDElTcN 1xq+dq/3cxAhIhtsPZOGMwXYrG9vVlgYf+JPOpaxFimEQ4EabIxdIWWoLDkMY98RJ27ve4cxnX0t TY+nFO5amWfZTDpsODVY7OjZUnUof52Gj6mn/CUPT2XtFnb43r2//eBM69Hd8LgEEWmI/+I/99ak +epBZWqu1AKuPyUA5PoCAAD//wMAUEsBAi0AFAAGAAgAAAAhANvh9svuAAAAhQEAABMAAAAAAAAA AAAAAAAAAAAAAFtDb250ZW50X1R5cGVzXS54bWxQSwECLQAUAAYACAAAACEAWvQsW78AAAAVAQAA CwAAAAAAAAAAAAAAAAAfAQAAX3JlbHMvLnJlbHNQSwECLQAUAAYACAAAACEAb6usgcYAAADjAAAA DwAAAAAAAAAAAAAAAAAHAgAAZHJzL2Rvd25yZXYueG1sUEsFBgAAAAADAAMAtwAAAPoCAAAAAA== " filled="f" stroked="f">
                     <v:textbox inset="2.53958mm,2.53958mm,2.53958mm,2.53958mm">
                       <w:txbxContent>
                         <w:p>
@@ -8836,8 +8430,8 @@
                       </w:txbxContent>
                     </v:textbox>
                   </v:rect>
-                  <v:group id="Group 1478460366" o:spid="_x0000_s1065" style="position:absolute;left:19352;top:36089;width:68215;height:3421" coordorigin="19352,36089" coordsize="68214,3420" o:gfxdata="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">
-                    <v:rect id="Rectangle 43336236" o:spid="_x0000_s1066" style="position:absolute;left:19352;top:36089;width:68215;height:3421;visibility:visible;mso-wrap-style:square;v-text-anchor:middle" o:gfxdata="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" filled="f" stroked="f">
+                  <v:group id="Group 1478460366" o:spid="_x0000_s1065" style="position:absolute;left:19352;top:36089;width:68215;height:3421" coordorigin="19352,36089" coordsize="68214,3420" o:gfxdata="UEsDBBQABgAIAAAAIQDb4fbL7gAAAIUBAAATAAAAW0NvbnRlbnRfVHlwZXNdLnhtbHyQz07DMAyH 70i8Q+QralM4IITa7kDhCAiNB7ASt43WOlEcyvb2pNu4IODoPz9/n1xv9vOkForiPDdwXVagiI23 jocG3rdPxR0oScgWJ8/UwIEENu3lRb09BBKV0ywNjCmFe63FjDSjlD4Q50nv44wpl3HQAc0OB9I3 VXWrjedEnIq03oC27qjHjympx31un0wiTQLq4bS4shrAECZnMGVTvbD9QSnOhDInjzsyuiBXWQP0 r4R18jfgnHvJr4nOknrFmJ5xzhraRtHWf3Kkpfz/yGo5S+H73hkquyhdjr3R8m2lj09svwAAAP// AwBQSwMEFAAGAAgAAAAhAFr0LFu/AAAAFQEAAAsAAABfcmVscy8ucmVsc2zPwWrDMAwG4Ptg72B0 X5TuUMaI01uh19I+gLGVxCy2jGSy9e1nemrHjpL4P0nD4SetZiPRyNnCruvBUPYcYp4tXC/Htw8w Wl0ObuVMFm6kcBhfX4Yzra62kC6xqGlKVgtLreUTUf1CyWnHhXKbTCzJ1VbKjMX5LzcTvvf9HuXR gPHJNKdgQU5hB+ZyK23zHztFL6w81c5zQp6m6P9TMfB3PtPWFCczVQtB9N4U2rp2HOA44NMz4y8A AAD//wMAUEsDBBQABgAIAAAAIQD0UrSNyAAAAOMAAAAPAAAAZHJzL2Rvd25yZXYueG1sRE/NasJA EL4X+g7LFLzpJlVTia4iUqUHEaqF4m3IjkkwOxuyaxLfvisIPc73P4tVbyrRUuNKywriUQSCOLO6 5FzBz2k7nIFwHlljZZkU3MnBavn6ssBU246/qT36XIQQdikqKLyvUyldVpBBN7I1ceAutjHow9nk UjfYhXBTyfcoSqTBkkNDgTVtCsqux5tRsOuwW4/jz3Z/vWzu59P08LuPSanBW7+eg/DU+3/x0/2l w/zJx2ySROMkgcdPAQC5/AMAAP//AwBQSwECLQAUAAYACAAAACEA2+H2y+4AAACFAQAAEwAAAAAA AAAAAAAAAAAAAAAAW0NvbnRlbnRfVHlwZXNdLnhtbFBLAQItABQABgAIAAAAIQBa9CxbvwAAABUB AAALAAAAAAAAAAAAAAAAAB8BAABfcmVscy8ucmVsc1BLAQItABQABgAIAAAAIQD0UrSNyAAAAOMA AAAPAAAAAAAAAAAAAAAAAAcCAABkcnMvZG93bnJldi54bWxQSwUGAAAAAAMAAwC3AAAA/AIAAAAA ">
+                    <v:rect id="Rectangle 43336236" o:spid="_x0000_s1066" style="position:absolute;left:19352;top:36089;width:68215;height:3421;visibility:visible;mso-wrap-style:square;v-text-anchor:middle" o:gfxdata="UEsDBBQABgAIAAAAIQDb4fbL7gAAAIUBAAATAAAAW0NvbnRlbnRfVHlwZXNdLnhtbHyQz07DMAyH 70i8Q+QralM4IITa7kDhCAiNB7ASt43WOlEcyvb2pNu4IODoPz9/n1xv9vOkForiPDdwXVagiI23 jocG3rdPxR0oScgWJ8/UwIEENu3lRb09BBKV0ywNjCmFe63FjDSjlD4Q50nv44wpl3HQAc0OB9I3 VXWrjedEnIq03oC27qjHjympx31un0wiTQLq4bS4shrAECZnMGVTvbD9QSnOhDInjzsyuiBXWQP0 r4R18jfgnHvJr4nOknrFmJ5xzhraRtHWf3Kkpfz/yGo5S+H73hkquyhdjr3R8m2lj09svwAAAP// AwBQSwMEFAAGAAgAAAAhAFr0LFu/AAAAFQEAAAsAAABfcmVscy8ucmVsc2zPwWrDMAwG4Ptg72B0 X5TuUMaI01uh19I+gLGVxCy2jGSy9e1nemrHjpL4P0nD4SetZiPRyNnCruvBUPYcYp4tXC/Htw8w Wl0ObuVMFm6kcBhfX4Yzra62kC6xqGlKVgtLreUTUf1CyWnHhXKbTCzJ1VbKjMX5LzcTvvf9HuXR gPHJNKdgQU5hB+ZyK23zHztFL6w81c5zQp6m6P9TMfB3PtPWFCczVQtB9N4U2rp2HOA44NMz4y8A AAD//wMAUEsDBBQABgAIAAAAIQBLk3QfyAAAAOEAAAAPAAAAZHJzL2Rvd25yZXYueG1sRI/BbsIw EETvlfoP1lbiVpwmKGoDBgGiEvQEoR+wjZc4arwOsQvh73GlSj2OZuaNZrYYbCsu1PvGsYKXcQKC uHK64VrB5/H9+RWED8gaW8ek4EYeFvPHhxkW2l35QJcy1CJC2BeowITQFVL6ypBFP3YdcfROrrcY ouxrqXu8RrhtZZokubTYcFww2NHaUPVd/lgF+4mjdJP6VVnbNzN8HT92Z8yVGj0NyymIQEP4D/+1 t1rBJMuyPM1y+H0U34Cc3wEAAP//AwBQSwECLQAUAAYACAAAACEA2+H2y+4AAACFAQAAEwAAAAAA AAAAAAAAAAAAAAAAW0NvbnRlbnRfVHlwZXNdLnhtbFBLAQItABQABgAIAAAAIQBa9CxbvwAAABUB AAALAAAAAAAAAAAAAAAAAB8BAABfcmVscy8ucmVsc1BLAQItABQABgAIAAAAIQBLk3QfyAAAAOEA AAAPAAAAAAAAAAAAAAAAAAcCAABkcnMvZG93bnJldi54bWxQSwUGAAAAAAMAAwC3AAAA/AIAAAAA " filled="f" stroked="f">
                       <v:textbox inset="2.53958mm,2.53958mm,2.53958mm,2.53958mm">
                         <w:txbxContent>
                           <w:p>
@@ -8849,8 +8443,8 @@
                         </w:txbxContent>
                       </v:textbox>
                     </v:rect>
-                    <v:group id="Group 1744587512" o:spid="_x0000_s1067" style="position:absolute;left:19352;top:36089;width:68215;height:3421" coordorigin="19352,36174" coordsize="68214,3252" o:gfxdata="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">
-                      <v:rect id="Rectangle 499513080" o:spid="_x0000_s1068" style="position:absolute;left:19352;top:36174;width:68215;height:3252;visibility:visible;mso-wrap-style:square;v-text-anchor:middle" o:gfxdata="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" filled="f" stroked="f">
+                    <v:group id="Group 1744587512" o:spid="_x0000_s1067" style="position:absolute;left:19352;top:36089;width:68215;height:3421" coordorigin="19352,36174" coordsize="68214,3252" o:gfxdata="UEsDBBQABgAIAAAAIQDb4fbL7gAAAIUBAAATAAAAW0NvbnRlbnRfVHlwZXNdLnhtbHyQz07DMAyH 70i8Q+QralM4IITa7kDhCAiNB7ASt43WOlEcyvb2pNu4IODoPz9/n1xv9vOkForiPDdwXVagiI23 jocG3rdPxR0oScgWJ8/UwIEENu3lRb09BBKV0ywNjCmFe63FjDSjlD4Q50nv44wpl3HQAc0OB9I3 VXWrjedEnIq03oC27qjHjympx31un0wiTQLq4bS4shrAECZnMGVTvbD9QSnOhDInjzsyuiBXWQP0 r4R18jfgnHvJr4nOknrFmJ5xzhraRtHWf3Kkpfz/yGo5S+H73hkquyhdjr3R8m2lj09svwAAAP// AwBQSwMEFAAGAAgAAAAhAFr0LFu/AAAAFQEAAAsAAABfcmVscy8ucmVsc2zPwWrDMAwG4Ptg72B0 X5TuUMaI01uh19I+gLGVxCy2jGSy9e1nemrHjpL4P0nD4SetZiPRyNnCruvBUPYcYp4tXC/Htw8w Wl0ObuVMFm6kcBhfX4Yzra62kC6xqGlKVgtLreUTUf1CyWnHhXKbTCzJ1VbKjMX5LzcTvvf9HuXR gPHJNKdgQU5hB+ZyK23zHztFL6w81c5zQp6m6P9TMfB3PtPWFCczVQtB9N4U2rp2HOA44NMz4y8A AAD//wMAUEsDBBQABgAIAAAAIQD+pCAnyAAAAOMAAAAPAAAAZHJzL2Rvd25yZXYueG1sRE/NasJA EL4X+g7LFLzpJmqqpK4i0koPIqgF8TZkxySYnQ3ZbRLf3i0IPc73P4tVbyrRUuNKywriUQSCOLO6 5FzBz+lrOAfhPLLGyjIpuJOD1fL1ZYGpth0fqD36XIQQdikqKLyvUyldVpBBN7I1ceCutjHow9nk UjfYhXBTyXEUvUuDJYeGAmvaFJTdjr9GwbbDbj2JP9vd7bq5X07J/ryLSanBW7/+AOGp9//ip/tb h/mz6TSZz5J4DH8/BQDk8gEAAP//AwBQSwECLQAUAAYACAAAACEA2+H2y+4AAACFAQAAEwAAAAAA AAAAAAAAAAAAAAAAW0NvbnRlbnRfVHlwZXNdLnhtbFBLAQItABQABgAIAAAAIQBa9CxbvwAAABUB AAALAAAAAAAAAAAAAAAAAB8BAABfcmVscy8ucmVsc1BLAQItABQABgAIAAAAIQD+pCAnyAAAAOMA AAAPAAAAAAAAAAAAAAAAAAcCAABkcnMvZG93bnJldi54bWxQSwUGAAAAAAMAAwC3AAAA/AIAAAAA ">
+                      <v:rect id="Rectangle 499513080" o:spid="_x0000_s1068" style="position:absolute;left:19352;top:36174;width:68215;height:3252;visibility:visible;mso-wrap-style:square;v-text-anchor:middle" o:gfxdata="UEsDBBQABgAIAAAAIQDb4fbL7gAAAIUBAAATAAAAW0NvbnRlbnRfVHlwZXNdLnhtbHyQz07DMAyH 70i8Q+QralM4IITa7kDhCAiNB7ASt43WOlEcyvb2pNu4IODoPz9/n1xv9vOkForiPDdwXVagiI23 jocG3rdPxR0oScgWJ8/UwIEENu3lRb09BBKV0ywNjCmFe63FjDSjlD4Q50nv44wpl3HQAc0OB9I3 VXWrjedEnIq03oC27qjHjympx31un0wiTQLq4bS4shrAECZnMGVTvbD9QSnOhDInjzsyuiBXWQP0 r4R18jfgnHvJr4nOknrFmJ5xzhraRtHWf3Kkpfz/yGo5S+H73hkquyhdjr3R8m2lj09svwAAAP// AwBQSwMEFAAGAAgAAAAhAFr0LFu/AAAAFQEAAAsAAABfcmVscy8ucmVsc2zPwWrDMAwG4Ptg72B0 X5TuUMaI01uh19I+gLGVxCy2jGSy9e1nemrHjpL4P0nD4SetZiPRyNnCruvBUPYcYp4tXC/Htw8w Wl0ObuVMFm6kcBhfX4Yzra62kC6xqGlKVgtLreUTUf1CyWnHhXKbTCzJ1VbKjMX5LzcTvvf9HuXR gPHJNKdgQU5hB+ZyK23zHztFL6w81c5zQp6m6P9TMfB3PtPWFCczVQtB9N4U2rp2HOA44NMz4y8A AAD//wMAUEsDBBQABgAIAAAAIQA9FwtpyAAAAOIAAAAPAAAAZHJzL2Rvd25yZXYueG1sRI9NbsIw EIX3lbiDNUjdFYeUIhIwCFCR2q5K4ABDPMQR8TjELoTb14tKXT69P32LVW8bcaPO144VjEcJCOLS 6ZorBcfD7mUGwgdkjY1jUvAgD6vl4GmBuXZ33tOtCJWII+xzVGBCaHMpfWnIoh+5ljh6Z9dZDFF2 ldQd3uO4bWSaJFNpseb4YLClraHyUvxYBd8TR+l76jdFZTPTnw5fn1ecKvU87NdzEIH68B/+a39o BZMsexu/JrMIEZEiDsjlLwAAAP//AwBQSwECLQAUAAYACAAAACEA2+H2y+4AAACFAQAAEwAAAAAA AAAAAAAAAAAAAAAAW0NvbnRlbnRfVHlwZXNdLnhtbFBLAQItABQABgAIAAAAIQBa9CxbvwAAABUB AAALAAAAAAAAAAAAAAAAAB8BAABfcmVscy8ucmVsc1BLAQItABQABgAIAAAAIQA9FwtpyAAAAOIA AAAPAAAAAAAAAAAAAAAAAAcCAABkcnMvZG93bnJldi54bWxQSwUGAAAAAAMAAwC3AAAA/AIAAAAA " filled="f" stroked="f">
                         <v:textbox inset="2.53958mm,2.53958mm,2.53958mm,2.53958mm">
                           <w:txbxContent>
                             <w:p>
@@ -8862,8 +8456,8 @@
                           </w:txbxContent>
                         </v:textbox>
                       </v:rect>
-                      <v:group id="Group 164268300" o:spid="_x0000_s1069" style="position:absolute;left:19352;top:36174;width:68215;height:3251" coordorigin="3300,30964" coordsize="91684,4227" o:gfxdata="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">
-                        <v:rect id="Rectangle 1030671862" o:spid="_x0000_s1070" style="position:absolute;left:3300;top:30964;width:91684;height:4227;visibility:visible;mso-wrap-style:square;v-text-anchor:middle" o:gfxdata="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" filled="f" stroked="f">
+                      <v:group id="Group 164268300" o:spid="_x0000_s1069" style="position:absolute;left:19352;top:36174;width:68215;height:3251" coordorigin="3300,30964" coordsize="91684,4227" o:gfxdata="UEsDBBQABgAIAAAAIQDb4fbL7gAAAIUBAAATAAAAW0NvbnRlbnRfVHlwZXNdLnhtbHyQz07DMAyH 70i8Q+QralM4IITa7kDhCAiNB7ASt43WOlEcyvb2pNu4IODoPz9/n1xv9vOkForiPDdwXVagiI23 jocG3rdPxR0oScgWJ8/UwIEENu3lRb09BBKV0ywNjCmFe63FjDSjlD4Q50nv44wpl3HQAc0OB9I3 VXWrjedEnIq03oC27qjHjympx31un0wiTQLq4bS4shrAECZnMGVTvbD9QSnOhDInjzsyuiBXWQP0 r4R18jfgnHvJr4nOknrFmJ5xzhraRtHWf3Kkpfz/yGo5S+H73hkquyhdjr3R8m2lj09svwAAAP// AwBQSwMEFAAGAAgAAAAhAFr0LFu/AAAAFQEAAAsAAABfcmVscy8ucmVsc2zPwWrDMAwG4Ptg72B0 X5TuUMaI01uh19I+gLGVxCy2jGSy9e1nemrHjpL4P0nD4SetZiPRyNnCruvBUPYcYp4tXC/Htw8w Wl0ObuVMFm6kcBhfX4Yzra62kC6xqGlKVgtLreUTUf1CyWnHhXKbTCzJ1VbKjMX5LzcTvvf9HuXR gPHJNKdgQU5hB+ZyK23zHztFL6w81c5zQp6m6P9TMfB3PtPWFCczVQtB9N4U2rp2HOA44NMz4y8A AAD//wMAUEsDBBQABgAIAAAAIQAjbN2PxwAAAOIAAAAPAAAAZHJzL2Rvd25yZXYueG1sRE9La8JA EL4X+h+WKfRWN9E2SOoqIrb0IAUfIL0N2TEJZmdDdk3iv+8cCj1+fO/FanSN6qkLtWcD6SQBRVx4 W3Np4HT8eJmDChHZYuOZDNwpwGr5+LDA3PqB99QfYqkkhEOOBqoY21zrUFTkMEx8SyzcxXcOo8Cu 1LbDQcJdo6dJkmmHNUtDhS1tKiquh5sz8DngsJ6l2353vWzuP8e37/MuJWOen8b1O6hIY/wX/7m/ rMzPXqfZfJbICbkkGPTyFwAA//8DAFBLAQItABQABgAIAAAAIQDb4fbL7gAAAIUBAAATAAAAAAAA AAAAAAAAAAAAAABbQ29udGVudF9UeXBlc10ueG1sUEsBAi0AFAAGAAgAAAAhAFr0LFu/AAAAFQEA AAsAAAAAAAAAAAAAAAAAHwEAAF9yZWxzLy5yZWxzUEsBAi0AFAAGAAgAAAAhACNs3Y/HAAAA4gAA AA8AAAAAAAAAAAAAAAAABwIAAGRycy9kb3ducmV2LnhtbFBLBQYAAAAAAwADALcAAAD7AgAAAAA= ">
+                        <v:rect id="Rectangle 1030671862" o:spid="_x0000_s1070" style="position:absolute;left:3300;top:30964;width:91684;height:4227;visibility:visible;mso-wrap-style:square;v-text-anchor:middle" o:gfxdata="UEsDBBQABgAIAAAAIQDb4fbL7gAAAIUBAAATAAAAW0NvbnRlbnRfVHlwZXNdLnhtbHyQz07DMAyH 70i8Q+QralM4IITa7kDhCAiNB7ASt43WOlEcyvb2pNu4IODoPz9/n1xv9vOkForiPDdwXVagiI23 jocG3rdPxR0oScgWJ8/UwIEENu3lRb09BBKV0ywNjCmFe63FjDSjlD4Q50nv44wpl3HQAc0OB9I3 VXWrjedEnIq03oC27qjHjympx31un0wiTQLq4bS4shrAECZnMGVTvbD9QSnOhDInjzsyuiBXWQP0 r4R18jfgnHvJr4nOknrFmJ5xzhraRtHWf3Kkpfz/yGo5S+H73hkquyhdjr3R8m2lj09svwAAAP// AwBQSwMEFAAGAAgAAAAhAFr0LFu/AAAAFQEAAAsAAABfcmVscy8ucmVsc2zPwWrDMAwG4Ptg72B0 X5TuUMaI01uh19I+gLGVxCy2jGSy9e1nemrHjpL4P0nD4SetZiPRyNnCruvBUPYcYp4tXC/Htw8w Wl0ObuVMFm6kcBhfX4Yzra62kC6xqGlKVgtLreUTUf1CyWnHhXKbTCzJ1VbKjMX5LzcTvvf9HuXR gPHJNKdgQU5hB+ZyK23zHztFL6w81c5zQp6m6P9TMfB3PtPWFCczVQtB9N4U2rp2HOA44NMz4y8A AAD//wMAUEsDBBQABgAIAAAAIQCRZcw3xgAAAOMAAAAPAAAAZHJzL2Rvd25yZXYueG1sRE9fT8Iw EH838Ts0Z+KbtAwzYFKIEkiQJxx+gGM918X1OtcK89tTExMf7/f/FqvBteJMfWg8axiPFAjiypuG aw3vx+3DDESIyAZbz6ThhwKslrc3CyyMv/AbnctYixTCoUANNsaukDJUlhyGke+IE/fhe4cxnX0t TY+XFO5amSmVS4cNpwaLHa0tVZ/lt9NwePSUbbLwUtZubofTcf/6hbnW93fD8xOISEP8F/+5dybN VxOVT8ezPIPfnxIAcnkFAAD//wMAUEsBAi0AFAAGAAgAAAAhANvh9svuAAAAhQEAABMAAAAAAAAA AAAAAAAAAAAAAFtDb250ZW50X1R5cGVzXS54bWxQSwECLQAUAAYACAAAACEAWvQsW78AAAAVAQAA CwAAAAAAAAAAAAAAAAAfAQAAX3JlbHMvLnJlbHNQSwECLQAUAAYACAAAACEAkWXMN8YAAADjAAAA DwAAAAAAAAAAAAAAAAAHAgAAZHJzL2Rvd25yZXYueG1sUEsFBgAAAAADAAMAtwAAAPoCAAAAAA== " filled="f" stroked="f">
                           <v:textbox inset="2.53958mm,2.53958mm,2.53958mm,2.53958mm">
                             <w:txbxContent>
                               <w:p>
@@ -8875,7 +8469,7 @@
                             </w:txbxContent>
                           </v:textbox>
                         </v:rect>
-                        <v:oval id="Oval 179542122" o:spid="_x0000_s1071" style="position:absolute;left:90757;top:30964;width:4227;height:4227;visibility:visible;mso-wrap-style:square;v-text-anchor:middle" o:gfxdata="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" fillcolor="#f4a11e" stroked="f">
+                        <v:oval id="Oval 179542122" o:spid="_x0000_s1071" style="position:absolute;left:90757;top:30964;width:4227;height:4227;visibility:visible;mso-wrap-style:square;v-text-anchor:middle" o:gfxdata="UEsDBBQABgAIAAAAIQDb4fbL7gAAAIUBAAATAAAAW0NvbnRlbnRfVHlwZXNdLnhtbHyQz07DMAyH 70i8Q+QralM4IITa7kDhCAiNB7ASt43WOlEcyvb2pNu4IODoPz9/n1xv9vOkForiPDdwXVagiI23 jocG3rdPxR0oScgWJ8/UwIEENu3lRb09BBKV0ywNjCmFe63FjDSjlD4Q50nv44wpl3HQAc0OB9I3 VXWrjedEnIq03oC27qjHjympx31un0wiTQLq4bS4shrAECZnMGVTvbD9QSnOhDInjzsyuiBXWQP0 r4R18jfgnHvJr4nOknrFmJ5xzhraRtHWf3Kkpfz/yGo5S+H73hkquyhdjr3R8m2lj09svwAAAP// AwBQSwMEFAAGAAgAAAAhAFr0LFu/AAAAFQEAAAsAAABfcmVscy8ucmVsc2zPwWrDMAwG4Ptg72B0 X5TuUMaI01uh19I+gLGVxCy2jGSy9e1nemrHjpL4P0nD4SetZiPRyNnCruvBUPYcYp4tXC/Htw8w Wl0ObuVMFm6kcBhfX4Yzra62kC6xqGlKVgtLreUTUf1CyWnHhXKbTCzJ1VbKjMX5LzcTvvf9HuXR gPHJNKdgQU5hB+ZyK23zHztFL6w81c5zQp6m6P9TMfB3PtPWFCczVQtB9N4U2rp2HOA44NMz4y8A AAD//wMAUEsDBBQABgAIAAAAIQAapeHJxwAAAOIAAAAPAAAAZHJzL2Rvd25yZXYueG1sRE9NS8NA EL0X/A/LFLwUO2motcZuiwgBiyIa2/uQnSah2dmY3bbx37uC4PHxvlebwbbqzL1vnGiYTRNQLKUz jVQadp/5zRKUDySGWies4Zs9bNZXoxVlxl3kg89FqFQMEZ+RhjqELkP0Zc2W/NR1LJE7uN5SiLCv 0PR0ieG2xTRJFmipkdhQU8dPNZfH4mQ14GTL+N4VmH+94P60eN2/0THX+no8PD6ACjyEf/Gf+9nE +Xf3t/N0lqbweyliwPUPAAAA//8DAFBLAQItABQABgAIAAAAIQDb4fbL7gAAAIUBAAATAAAAAAAA AAAAAAAAAAAAAABbQ29udGVudF9UeXBlc10ueG1sUEsBAi0AFAAGAAgAAAAhAFr0LFu/AAAAFQEA AAsAAAAAAAAAAAAAAAAAHwEAAF9yZWxzLy5yZWxzUEsBAi0AFAAGAAgAAAAhABql4cnHAAAA4gAA AA8AAAAAAAAAAAAAAAAABwIAAGRycy9kb3ducmV2LnhtbFBLBQYAAAAAAwADALcAAAD7AgAAAAA= " fillcolor="#f4a11e" stroked="f">
                           <v:textbox inset="2.53958mm,2.53958mm,2.53958mm,2.53958mm">
                             <w:txbxContent>
                               <w:p>
@@ -8887,7 +8481,7 @@
                             </w:txbxContent>
                           </v:textbox>
                         </v:oval>
-                        <v:oval id="Oval 766071249" o:spid="_x0000_s1072" style="position:absolute;left:3300;top:30964;width:4227;height:4227;visibility:visible;mso-wrap-style:square;v-text-anchor:middle" o:gfxdata="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" fillcolor="#f4a11e" stroked="f">
+                        <v:oval id="Oval 766071249" o:spid="_x0000_s1072" style="position:absolute;left:3300;top:30964;width:4227;height:4227;visibility:visible;mso-wrap-style:square;v-text-anchor:middle" o:gfxdata="UEsDBBQABgAIAAAAIQDb4fbL7gAAAIUBAAATAAAAW0NvbnRlbnRfVHlwZXNdLnhtbHyQz07DMAyH 70i8Q+QralM4IITa7kDhCAiNB7ASt43WOlEcyvb2pNu4IODoPz9/n1xv9vOkForiPDdwXVagiI23 jocG3rdPxR0oScgWJ8/UwIEENu3lRb09BBKV0ywNjCmFe63FjDSjlD4Q50nv44wpl3HQAc0OB9I3 VXWrjedEnIq03oC27qjHjympx31un0wiTQLq4bS4shrAECZnMGVTvbD9QSnOhDInjzsyuiBXWQP0 r4R18jfgnHvJr4nOknrFmJ5xzhraRtHWf3Kkpfz/yGo5S+H73hkquyhdjr3R8m2lj09svwAAAP// AwBQSwMEFAAGAAgAAAAhAFr0LFu/AAAAFQEAAAsAAABfcmVscy8ucmVsc2zPwWrDMAwG4Ptg72B0 X5TuUMaI01uh19I+gLGVxCy2jGSy9e1nemrHjpL4P0nD4SetZiPRyNnCruvBUPYcYp4tXC/Htw8w Wl0ObuVMFm6kcBhfX4Yzra62kC6xqGlKVgtLreUTUf1CyWnHhXKbTCzJ1VbKjMX5LzcTvvf9HuXR gPHJNKdgQU5hB+ZyK23zHztFL6w81c5zQp6m6P9TMfB3PtPWFCczVQtB9N4U2rp2HOA44NMz4y8A AAD//wMAUEsDBBQABgAIAAAAIQDwcFINygAAAOIAAAAPAAAAZHJzL2Rvd25yZXYueG1sRI9RS8NA EITfhf6HY4W+iN20lFRjr6UIgZaKaLTvS25NQnN7MXdt03/vCYKPw8x8wyzXg23VmXvfONEwnSSg WEpnGqk0fH7k9w+gfCAx1DphDVf2sF6NbpaUGXeRdz4XoVIRIj4jDXUIXYboy5ot+YnrWKL35XpL Icq+QtPTJcJti7MkSdFSI3Ghpo6fay6PxclqwLsd41tXYP69x8MpfTm80jHXenw7bJ5ABR7Cf/iv vTUaFmmaLKaz+SP8Xop3AFc/AAAA//8DAFBLAQItABQABgAIAAAAIQDb4fbL7gAAAIUBAAATAAAA AAAAAAAAAAAAAAAAAABbQ29udGVudF9UeXBlc10ueG1sUEsBAi0AFAAGAAgAAAAhAFr0LFu/AAAA FQEAAAsAAAAAAAAAAAAAAAAAHwEAAF9yZWxzLy5yZWxzUEsBAi0AFAAGAAgAAAAhAPBwUg3KAAAA 4gAAAA8AAAAAAAAAAAAAAAAABwIAAGRycy9kb3ducmV2LnhtbFBLBQYAAAAAAwADALcAAAD+AgAA AAA= " fillcolor="#f4a11e" stroked="f">
                           <v:textbox inset="2.53958mm,2.53958mm,2.53958mm,2.53958mm">
                             <w:txbxContent>
                               <w:p>
@@ -8899,7 +8493,7 @@
                             </w:txbxContent>
                           </v:textbox>
                         </v:oval>
-                        <v:rect id="Rectangle 533451764" o:spid="_x0000_s1073" style="position:absolute;left:5043;top:30964;width:87450;height:4227;visibility:visible;mso-wrap-style:square;v-text-anchor:middle" o:gfxdata="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" fillcolor="#f4a11e" stroked="f">
+                        <v:rect id="Rectangle 533451764" o:spid="_x0000_s1073" style="position:absolute;left:5043;top:30964;width:87450;height:4227;visibility:visible;mso-wrap-style:square;v-text-anchor:middle" o:gfxdata="UEsDBBQABgAIAAAAIQDb4fbL7gAAAIUBAAATAAAAW0NvbnRlbnRfVHlwZXNdLnhtbHyQz07DMAyH 70i8Q+QralM4IITa7kDhCAiNB7ASt43WOlEcyvb2pNu4IODoPz9/n1xv9vOkForiPDdwXVagiI23 jocG3rdPxR0oScgWJ8/UwIEENu3lRb09BBKV0ywNjCmFe63FjDSjlD4Q50nv44wpl3HQAc0OB9I3 VXWrjedEnIq03oC27qjHjympx31un0wiTQLq4bS4shrAECZnMGVTvbD9QSnOhDInjzsyuiBXWQP0 r4R18jfgnHvJr4nOknrFmJ5xzhraRtHWf3Kkpfz/yGo5S+H73hkquyhdjr3R8m2lj09svwAAAP// AwBQSwMEFAAGAAgAAAAhAFr0LFu/AAAAFQEAAAsAAABfcmVscy8ucmVsc2zPwWrDMAwG4Ptg72B0 X5TuUMaI01uh19I+gLGVxCy2jGSy9e1nemrHjpL4P0nD4SetZiPRyNnCruvBUPYcYp4tXC/Htw8w Wl0ObuVMFm6kcBhfX4Yzra62kC6xqGlKVgtLreUTUf1CyWnHhXKbTCzJ1VbKjMX5LzcTvvf9HuXR gPHJNKdgQU5hB+ZyK23zHztFL6w81c5zQp6m6P9TMfB3PtPWFCczVQtB9N4U2rp2HOA44NMz4y8A AAD//wMAUEsDBBQABgAIAAAAIQByNLtdywAAAOIAAAAPAAAAZHJzL2Rvd25yZXYueG1sRI9PS8NA FMTvgt9heYI3u/nXtMZuigiCBw8a7aG3R/aZRLNvY3aTpt/eFQSPw8z8htntF9OLmUbXWVYQryIQ xLXVHTcK3t8eb7YgnEfW2FsmBWdysC8vL3ZYaHviV5or34gAYVeggtb7oZDS1S0ZdCs7EAfvw44G fZBjI/WIpwA3vUyiKJcGOw4LLQ700FL9VU1Gwe3cJcfvtDf5YcmSz+p50ueXSanrq+X+DoSnxf+H /9pPWsE6TbN1vMkz+L0U7oAsfwAAAP//AwBQSwECLQAUAAYACAAAACEA2+H2y+4AAACFAQAAEwAA AAAAAAAAAAAAAAAAAAAAW0NvbnRlbnRfVHlwZXNdLnhtbFBLAQItABQABgAIAAAAIQBa9CxbvwAA ABUBAAALAAAAAAAAAAAAAAAAAB8BAABfcmVscy8ucmVsc1BLAQItABQABgAIAAAAIQByNLtdywAA AOIAAAAPAAAAAAAAAAAAAAAAAAcCAABkcnMvZG93bnJldi54bWxQSwUGAAAAAAMAAwC3AAAA/wIA AAAA " fillcolor="#f4a11e" stroked="f">
                           <v:textbox inset="2.53958mm,2.53958mm,2.53958mm,2.53958mm">
                             <w:txbxContent>
                               <w:p>
@@ -9064,18 +8658,27 @@
               <w:rPr>
                 <w:i/>
               </w:rPr>
-              <w:t xml:space="preserve">Intrinsic Motivation and Self-Determination in Human </w:t>
-            </w:r>
-            <w:proofErr w:type="spellStart"/>
+              <w:t xml:space="preserve">Intrinsic Motivation and Self-Determination in Human Behavior</w:t>
+            </w:r>
+            <w:r>
+              <w:t>. New York: Plenum.</w:t>
+            </w:r>
+          </w:p>
+          <w:p>
+            <w:pPr>
+              <w:spacing w:after="120"/>
+            </w:pPr>
+            <w:r>
+              <w:t xml:space="preserve">Edmondson, A. (1999) 'Psychological Safety and Learning Behavior in Work Teams', </w:t>
+            </w:r>
             <w:r>
               <w:rPr>
                 <w:i/>
               </w:rPr>
-              <w:t>Behavior</w:t>
-            </w:r>
-            <w:proofErr w:type="spellEnd"/>
-            <w:r>
-              <w:t>. New York: Plenum.</w:t>
+              <w:t>Administrative Science Quarterly</w:t>
+            </w:r>
+            <w:r>
+              <w:t>, 44(2), pp. 350–383.</w:t>
             </w:r>
           </w:p>
           <w:p>
@@ -9083,24 +8686,16 @@
               <w:spacing w:after="120"/>
             </w:pPr>
             <w:r>
-              <w:t xml:space="preserve">Edmondson, A. (1999) 'Psychological Safety and Learning </w:t>
-            </w:r>
-            <w:proofErr w:type="spellStart"/>
-            <w:r>
-              <w:t>Behavior</w:t>
-            </w:r>
-            <w:proofErr w:type="spellEnd"/>
-            <w:r>
-              <w:t xml:space="preserve"> in Work Teams', </w:t>
+              <w:t xml:space="preserve">Greenleaf, R.K. (1977) </w:t>
             </w:r>
             <w:r>
               <w:rPr>
                 <w:i/>
               </w:rPr>
-              <w:t>Administrative Science Quarterly</w:t>
-            </w:r>
-            <w:r>
-              <w:t>, 44(2), pp. 350–383.</w:t>
+              <w:t>Servant Leadership: A Journey into the Nature of Legitimate Power and Greatness</w:t>
+            </w:r>
+            <w:r>
+              <w:t>. New York: Paulist Press.</w:t>
             </w:r>
           </w:p>
           <w:p>
@@ -9108,16 +8703,16 @@
               <w:spacing w:after="120"/>
             </w:pPr>
             <w:r>
-              <w:t xml:space="preserve">Greenleaf, R.K. (1977) </w:t>
+              <w:t xml:space="preserve">Herzberg, F. (1966) </w:t>
             </w:r>
             <w:r>
               <w:rPr>
                 <w:i/>
               </w:rPr>
-              <w:t>Servant Leadership: A Journey into the Nature of Legitimate Power and Greatness</w:t>
-            </w:r>
-            <w:r>
-              <w:t>. New York: Paulist Press.</w:t>
+              <w:t>Work and the Nature of Man</w:t>
+            </w:r>
+            <w:r>
+              <w:t>. Cleveland: World Publishing.</w:t>
             </w:r>
           </w:p>
           <w:p>
@@ -9125,55 +8720,16 @@
               <w:spacing w:after="120"/>
             </w:pPr>
             <w:r>
-              <w:t xml:space="preserve">Herzberg, F. (1966) </w:t>
+              <w:t xml:space="preserve">Hersey, P. and Blanchard, K.H. (1993) </w:t>
             </w:r>
             <w:r>
               <w:rPr>
                 <w:i/>
               </w:rPr>
-              <w:t>Work and the Nature of Man</w:t>
-            </w:r>
-            <w:r>
-              <w:t>. Cleveland: World Publishing.</w:t>
-            </w:r>
-          </w:p>
-          <w:p>
-            <w:pPr>
-              <w:spacing w:after="120"/>
-            </w:pPr>
-            <w:r>
-              <w:t xml:space="preserve">Hersey, P. and Blanchard, K.H. (1993) </w:t>
-            </w:r>
-            <w:r>
-              <w:rPr>
-                <w:i/>
-              </w:rPr>
-              <w:t xml:space="preserve">Management of Organizational </w:t>
-            </w:r>
-            <w:proofErr w:type="spellStart"/>
-            <w:r>
-              <w:rPr>
-                <w:i/>
-              </w:rPr>
-              <w:t>Behavior</w:t>
-            </w:r>
-            <w:proofErr w:type="spellEnd"/>
-            <w:r>
-              <w:rPr>
-                <w:i/>
-              </w:rPr>
-              <w:t>: Utilizing Human Resources</w:t>
-            </w:r>
-            <w:r>
-              <w:t xml:space="preserve">. 6th </w:t>
-            </w:r>
-            <w:proofErr w:type="spellStart"/>
-            <w:r>
-              <w:t>edn</w:t>
-            </w:r>
-            <w:proofErr w:type="spellEnd"/>
-            <w:r>
-              <w:t>. Englewood Cliffs, NJ: Prentice Hall.</w:t>
+              <w:t xml:space="preserve">Management of Organizational Behavior: Utilizing Human Resources</w:t>
+            </w:r>
+            <w:r>
+              <w:t xml:space="preserve">. 6th edn. Englewood Cliffs, NJ: Prentice Hall.</w:t>
             </w:r>
           </w:p>
           <w:p>
@@ -9324,32 +8880,10 @@
               <w:rPr>
                 <w:i/>
               </w:rPr>
-              <w:t xml:space="preserve">Coaching for Performance: </w:t>
-            </w:r>
-            <w:proofErr w:type="spellStart"/>
-            <w:r>
-              <w:rPr>
-                <w:i/>
-              </w:rPr>
-              <w:t>GROWing</w:t>
-            </w:r>
-            <w:proofErr w:type="spellEnd"/>
-            <w:r>
-              <w:rPr>
-                <w:i/>
-              </w:rPr>
-              <w:t xml:space="preserve"> Human Potential and Purpose</w:t>
-            </w:r>
-            <w:r>
-              <w:t xml:space="preserve">. 4th </w:t>
-            </w:r>
-            <w:proofErr w:type="spellStart"/>
-            <w:r>
-              <w:t>edn</w:t>
-            </w:r>
-            <w:proofErr w:type="spellEnd"/>
-            <w:r>
-              <w:t>. London: Nicholas Brealey.</w:t>
+              <w:t xml:space="preserve">Coaching for Performance: GROWing Human Potential and Purpose</w:t>
+            </w:r>
+            <w:r>
+              <w:t xml:space="preserve">. 4th edn. London: Nicholas Brealey.</w:t>
             </w:r>
           </w:p>
           <w:p>
@@ -9409,10 +8943,7 @@
               <w:t>Understanding the brief.</w:t>
             </w:r>
             <w:r>
-              <w:t xml:space="preserve"> The four assessment tasks, their required parts and the command verbs were explained to me, including the distinction between "evaluate", "analyse", "assess", "examine" and "discuss", and what each criterion required me to demonstrate. I was also alerted to specific traps in the brief, such as the requirement to treat leadership styles and leadership models as separate sections within AC1.1, and to distinguish the factors affecting learning and development selection for individuals from those affecting tea</w:t>
-            </w:r>
-            <w:r>
-              <w:t>ms within AC2.1.</w:t>
+              <w:t xml:space="preserve"> The four assessment tasks, their required parts and the command verbs were explained to me, including the distinction between "evaluate", "analyse", "assess", "examine" and "discuss", and what each criterion required me to demonstrate. I was also alerted to specific traps in the brief, such as the requirement to treat leadership styles and leadership models as separate sections within AC1.1, and to distinguish the factors affecting learning and development selection for individuals from those affecting teams within AC2.1.</w:t>
             </w:r>
           </w:p>
           <w:p>
@@ -9440,15 +8971,7 @@
               <w:t>Editing my dictated text.</w:t>
             </w:r>
             <w:r>
-              <w:t xml:space="preserve"> My dictated responses were returned to me tidied for grammar, spelling, repetition and order, and dictation errors were corrected (for example "Katzenberg" for Katzenbach, "Percy and Blanchard" for Hersey and Blanchard, "</w:t>
-            </w:r>
-            <w:proofErr w:type="spellStart"/>
-            <w:r>
-              <w:t>Lugites</w:t>
-            </w:r>
-            <w:proofErr w:type="spellEnd"/>
-            <w:r>
-              <w:t>" for laggards). I reviewed and approved all edits and made further changes of my own.</w:t>
+              <w:t xml:space="preserve"> My dictated responses were returned to me tidied for grammar, spelling, repetition and order, and dictation errors were corrected (for example "Katzenberg" for Katzenbach, "Percy and Blanchard" for Hersey and Blanchard, "Lugites" for laggards). I reviewed and approved all edits and made further changes of my own.</w:t>
             </w:r>
           </w:p>
           <w:p>
@@ -9462,19 +8985,7 @@
               <w:t>Sources and referencing.</w:t>
             </w:r>
             <w:r>
-              <w:t xml:space="preserve"> Alongside my own reading</w:t>
-            </w:r>
-            <w:r>
-              <w:t xml:space="preserve">, </w:t>
-            </w:r>
-            <w:r>
-              <w:t xml:space="preserve">and learning through Mindful, and my use of academic research in my responses and notes, additional </w:t>
-            </w:r>
-            <w:r>
-              <w:t>r</w:t>
-            </w:r>
-            <w:r>
-              <w:t>elevant academic sources were suggested to me with guidance on where they supported my argument. I have verified each source and satisfied myself that it says what I have attributed to it.</w:t>
+              <w:t xml:space="preserve"> Alongside my own reading, and learning through Mindful, and my use of academic research in my responses and notes, additional relevant academic sources were suggested to me with guidance on where they supported my argument. I have verified each source and satisfied myself that it says what I have attributed to it.</w:t>
             </w:r>
           </w:p>
           <w:p>
@@ -9502,15 +9013,7 @@
               <w:t>Critical feedback.</w:t>
             </w:r>
             <w:r>
-              <w:t xml:space="preserve"> I received challenge on the strength and accuracy of my drafting, including where a criterion had not been fully met, where an argument repeated a point made in another section, and where a claim needed a limitation attached to satisfy an evaluative command verb. I acted on that feedback. Where I </w:t>
-            </w:r>
-            <w:proofErr w:type="gramStart"/>
-            <w:r>
-              <w:t>disagreed</w:t>
-            </w:r>
-            <w:proofErr w:type="gramEnd"/>
-            <w:r>
-              <w:t xml:space="preserve"> I said so, and on at least one occasion my reading of the evidence was the one carried forward.</w:t>
+              <w:t xml:space="preserve"> I received challenge on the strength and accuracy of my drafting, including where a criterion had not been fully met, where an argument repeated a point made in another section, and where a claim needed a limitation attached to satisfy an evaluative command verb. I acted on that feedback. Where I disagreed I said so, and on at least one occasion my reading of the evidence was the one carried forward.</w:t>
             </w:r>
           </w:p>
           <w:p>
@@ -9867,9 +9370,9 @@
           </mc:Choice>
           <mc:Fallback>
             <w:pict>
-              <v:group w14:anchorId="010397D5" id="Group 6" o:spid="_x0000_s1074" style="width:537.1pt;height:28.45pt;mso-position-horizontal-relative:char;mso-position-vertical-relative:line" coordorigin="19352,35994" coordsize="68214,3610" o:gfxdata="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">
-                <v:group id="Group 379118014" o:spid="_x0000_s1075" style="position:absolute;left:19352;top:35994;width:68215;height:3611" coordorigin="19352,36089" coordsize="68214,3420" o:gfxdata="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">
-                  <v:rect id="Rectangle 31051194" o:spid="_x0000_s1076" style="position:absolute;left:19352;top:36089;width:68215;height:3421;visibility:visible;mso-wrap-style:square;v-text-anchor:middle" o:gfxdata="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" filled="f" stroked="f">
+              <v:group w14:anchorId="010397D5" id="Group 6" o:spid="_x0000_s1074" style="width:537.1pt;height:28.45pt;mso-position-horizontal-relative:char;mso-position-vertical-relative:line" coordorigin="19352,35994" coordsize="68214,3610" o:gfxdata="UEsDBBQABgAIAAAAIQC2gziS/gAAAOEBAAATAAAAW0NvbnRlbnRfVHlwZXNdLnhtbJSRQU7DMBBF 90jcwfIWJU67QAgl6YK0S0CoHGBkTxKLZGx5TGhvj5O2G0SRWNoz/78nu9wcxkFMGNg6quQqL6RA 0s5Y6ir5vt9lD1JwBDIwOMJKHpHlpr69KfdHjyxSmriSfYz+USnWPY7AufNIadK6MEJMx9ApD/oD OlTrorhX2lFEilmcO2RdNtjC5xDF9pCuTyYBB5bi6bQ4syoJ3g9WQ0ymaiLzg5KdCXlKLjvcW893 SUOqXwnz5DrgnHtJTxOsQfEKIT7DmDSUCaxw7Rqn8787ZsmRM9e2VmPeBN4uqYvTtW7jvijg9N/y JsXecLq0q+WD6m8AAAD//wMAUEsDBBQABgAIAAAAIQA4/SH/1gAAAJQBAAALAAAAX3JlbHMvLnJl bHOkkMFqwzAMhu+DvYPRfXGawxijTi+j0GvpHsDYimMaW0Yy2fr2M4PBMnrbUb/Q94l/f/hMi1qR JVI2sOt6UJgd+ZiDgffL8ekFlFSbvV0oo4EbChzGx4f9GRdb25HMsYhqlCwG5lrLq9biZkxWOiqY 22YiTra2kYMu1l1tQD30/bPm3wwYN0x18gb45AdQl1tp5j/sFB2T0FQ7R0nTNEV3j6o9feQzro1i OWA14Fm+Q8a1a8+Bvu/d/dMb2JY5uiPbhG/ktn4cqGU/er3pcvwCAAD//wMAUEsDBBQABgAIAAAA IQAwQEKa/wMAAJ0VAAAOAAAAZHJzL2Uyb0RvYy54bWzsWNtu2zgQfS/QfyD0vpFI3YU4RdE2QYGi CXr5AFqmZAGSqJJM7Px9h9TdiZs63XXrRRPAFi+iZ86cMzPS+attVaI7JmTB64WFzxwLsTrlq6LO F9bXL5f/RBaSitYrWvKaLax7Jq1XFy9fnG+ahBG+5uWKCQSH1DLZNAtrrVST2LZM16yi8ow3rIbF jIuKKhiK3F4JuoHTq9ImjhPYGy5WjeApkxJm37aL1oU5P8tYqq6zTDKFyoUFtinzKcznUn/aF+c0 yQVt1kXamUGfYUVFixp+dDjqLVUU3YriwVFVkQoueabOUl7ZPMuKlBkfwBvs7HhzJfhtY3zJk03e DDABtDs4PfvY9OPdlWg+NzcCkNg0OWBhRtqXbSYq/Q1Woq2B7H6AjG0VSmEyiAj2sGehFNbcADuE tJimawBe34Zj1yehbyG9wY9jD64N6un63fQQH8LTHwLXsMXuTbBnhg2D1mDw4EagYgWnhzHGkaOt qWkFZDP4oXG6c/EAn43xsTsaH8Wt8c/0P3Ci+Cn/PeI84T9IRY5skL/Ghs9r2jBDMplMsMSOj3E8 QPkJlETrvGTI7VcMmuaegT4ykcCkR7gzI8EUhBmOAwUeQkCTRkh1xXiF9MXCEmCQURy9+yBVy5Z+ izag5pdFWcI8Tcp6NgG00jNAqt5cfaW2y61hEYl0hPXUkq/ugVqySS8L+M0PVKobKiA9YAttIGUs LPntlgpmofJ9DVGIsUeA52o6ENPBcjqgdbrmkIlSJSzUDt4ok5laa1/fKp4VxrPRmM5sCP9Erbs6 wH5Awsh1MRgzFcJk3niY63j/rPpnStARjLvkOYvgkAkgggT3On8sE0xJsC8TPKTBbiY4ghJwCGUm COG/R3PUwmSt4wwg+v9Sg8l3IwFPUA2xE5OQhBg6kZkaxvk/QA049JxOUPvUQHxoeH5YF4+hBscN 3DAMQdwdmhM1jGvPV8MEiFlmGWrDQxiOVxtcg/9JqyGCnBWFJBji1zZJeJz/VTVABHH4oy6J+DgI dmqD6zrw1/ZZThzoQgp20GQUQ4yDyIMAmCbRIwTS8m8XQ+B4QUCiEcyJGMa1Q8SwD4deCwYF3WXo VvkRFI6oBVPeT0ILx8iLcaTbdoIHXV3f0RLhcfoQFsRO6Iea6/qZaSqHngZd5H+aBawsi0bqNp8m expmyctipXtmvUeKfPmmFAh8WFiX3muM33Vim207rLN2zaPhX8a0T6vY8yLIHtBJ95W0Zcw4fQhj nsobp0kYV5PuL2E6wgQ+iaCTHZ7qpsWmXzqEM74D9ZTsTzJR6PmmKP9btWaWO/6bFOOdCGPGB1nz SN+9d3viGt4Bwo7ZS8bp2Nw9vlW9+A4AAP//AwBQSwMEFAAGAAgAAAAhACe9DDLdAAAABQEAAA8A AABkcnMvZG93bnJldi54bWxMj0FrwkAQhe+F/odlCt7qJrbammYjIrYnEaqF4m3MjkkwOxuyaxL/ fdde2svA4z3e+yZdDKYWHbWusqwgHkcgiHOrKy4UfO3fH19BOI+ssbZMCq7kYJHd36WYaNvzJ3U7 X4hQwi5BBaX3TSKly0sy6Ma2IQ7eybYGfZBtIXWLfSg3tZxE0UwarDgslNjQqqT8vLsYBR899sun eN1tzqfV9bCfbr83MSk1ehiWbyA8Df4vDDf8gA5ZYDraC2snagXhEf97b1708jwBcVQwnc1BZqn8 T5/9AAAA//8DAFBLAQItABQABgAIAAAAIQC2gziS/gAAAOEBAAATAAAAAAAAAAAAAAAAAAAAAABb Q29udGVudF9UeXBlc10ueG1sUEsBAi0AFAAGAAgAAAAhADj9If/WAAAAlAEAAAsAAAAAAAAAAAAA AAAALwEAAF9yZWxzLy5yZWxzUEsBAi0AFAAGAAgAAAAhADBAQpr/AwAAnRUAAA4AAAAAAAAAAAAA AAAALgIAAGRycy9lMm9Eb2MueG1sUEsBAi0AFAAGAAgAAAAhACe9DDLdAAAABQEAAA8AAAAAAAAA AAAAAAAAWQYAAGRycy9kb3ducmV2LnhtbFBLBQYAAAAABAAEAPMAAABjBwAAAAA= ">
+                <v:group id="Group 379118014" o:spid="_x0000_s1075" style="position:absolute;left:19352;top:35994;width:68215;height:3611" coordorigin="19352,36089" coordsize="68214,3420" o:gfxdata="UEsDBBQABgAIAAAAIQDb4fbL7gAAAIUBAAATAAAAW0NvbnRlbnRfVHlwZXNdLnhtbHyQz07DMAyH 70i8Q+QralM4IITa7kDhCAiNB7ASt43WOlEcyvb2pNu4IODoPz9/n1xv9vOkForiPDdwXVagiI23 jocG3rdPxR0oScgWJ8/UwIEENu3lRb09BBKV0ywNjCmFe63FjDSjlD4Q50nv44wpl3HQAc0OB9I3 VXWrjedEnIq03oC27qjHjympx31un0wiTQLq4bS4shrAECZnMGVTvbD9QSnOhDInjzsyuiBXWQP0 r4R18jfgnHvJr4nOknrFmJ5xzhraRtHWf3Kkpfz/yGo5S+H73hkquyhdjr3R8m2lj09svwAAAP// AwBQSwMEFAAGAAgAAAAhAFr0LFu/AAAAFQEAAAsAAABfcmVscy8ucmVsc2zPwWrDMAwG4Ptg72B0 X5TuUMaI01uh19I+gLGVxCy2jGSy9e1nemrHjpL4P0nD4SetZiPRyNnCruvBUPYcYp4tXC/Htw8w Wl0ObuVMFm6kcBhfX4Yzra62kC6xqGlKVgtLreUTUf1CyWnHhXKbTCzJ1VbKjMX5LzcTvvf9HuXR gPHJNKdgQU5hB+ZyK23zHztFL6w81c5zQp6m6P9TMfB3PtPWFCczVQtB9N4U2rp2HOA44NMz4y8A AAD//wMAUEsDBBQABgAIAAAAIQDMMchtywAAAOIAAAAPAAAAZHJzL2Rvd25yZXYueG1sRI9Ba8JA FITvhf6H5RV6q5uttmp0FZFaPEihKoi3R/aZBLNvQ3abxH/fFQo9DjPzDTNf9rYSLTW+dKxBDRIQ xJkzJecajofNywSED8gGK8ek4UYelovHhzmmxnX8Te0+5CJC2KeooQihTqX0WUEW/cDVxNG7uMZi iLLJpWmwi3BbydckeZcWS44LBda0Lii77n+shs8Ou9VQfbS762V9Ox/evk47RVo/P/WrGYhAffgP /7W3RsNwPFVqkqgR3C/FOyAXvwAAAP//AwBQSwECLQAUAAYACAAAACEA2+H2y+4AAACFAQAAEwAA AAAAAAAAAAAAAAAAAAAAW0NvbnRlbnRfVHlwZXNdLnhtbFBLAQItABQABgAIAAAAIQBa9CxbvwAA ABUBAAALAAAAAAAAAAAAAAAAAB8BAABfcmVscy8ucmVsc1BLAQItABQABgAIAAAAIQDMMchtywAA AOIAAAAPAAAAAAAAAAAAAAAAAAcCAABkcnMvZG93bnJldi54bWxQSwUGAAAAAAMAAwC3AAAA/wIA AAAA ">
+                  <v:rect id="Rectangle 31051194" o:spid="_x0000_s1076" style="position:absolute;left:19352;top:36089;width:68215;height:3421;visibility:visible;mso-wrap-style:square;v-text-anchor:middle" o:gfxdata="UEsDBBQABgAIAAAAIQDb4fbL7gAAAIUBAAATAAAAW0NvbnRlbnRfVHlwZXNdLnhtbHyQz07DMAyH 70i8Q+QralM4IITa7kDhCAiNB7ASt43WOlEcyvb2pNu4IODoPz9/n1xv9vOkForiPDdwXVagiI23 jocG3rdPxR0oScgWJ8/UwIEENu3lRb09BBKV0ywNjCmFe63FjDSjlD4Q50nv44wpl3HQAc0OB9I3 VXWrjedEnIq03oC27qjHjympx31un0wiTQLq4bS4shrAECZnMGVTvbD9QSnOhDInjzsyuiBXWQP0 r4R18jfgnHvJr4nOknrFmJ5xzhraRtHWf3Kkpfz/yGo5S+H73hkquyhdjr3R8m2lj09svwAAAP// AwBQSwMEFAAGAAgAAAAhAFr0LFu/AAAAFQEAAAsAAABfcmVscy8ucmVsc2zPwWrDMAwG4Ptg72B0 X5TuUMaI01uh19I+gLGVxCy2jGSy9e1nemrHjpL4P0nD4SetZiPRyNnCruvBUPYcYp4tXC/Htw8w Wl0ObuVMFm6kcBhfX4Yzra62kC6xqGlKVgtLreUTUf1CyWnHhXKbTCzJ1VbKjMX5LzcTvvf9HuXR gPHJNKdgQU5hB+ZyK23zHztFL6w81c5zQp6m6P9TMfB3PtPWFCczVQtB9N4U2rp2HOA44NMz4y8A AAD//wMAUEsDBBQABgAIAAAAIQCbk5FhyAAAAOEAAAAPAAAAZHJzL2Rvd25yZXYueG1sRI/BbsIw EETvSPyDtUjcwEmgqAQMaisq0Z4g9AOWeBtHjddpbCD9e1ypUo+jmXmjWW9724grdb52rCCdJiCI S6drrhR8nF4njyB8QNbYOCYFP+RhuxkO1phrd+MjXYtQiQhhn6MCE0KbS+lLQxb91LXE0ft0ncUQ ZVdJ3eEtwm0jsyRZSIs1xwWDLb0YKr+Ki1VwmDvKdpl/Liq7NP359P72jQulxqP+aQUiUB/+w3/t vVYwS5OHNF3O4fdRfANycwcAAP//AwBQSwECLQAUAAYACAAAACEA2+H2y+4AAACFAQAAEwAAAAAA AAAAAAAAAAAAAAAAW0NvbnRlbnRfVHlwZXNdLnhtbFBLAQItABQABgAIAAAAIQBa9CxbvwAAABUB AAALAAAAAAAAAAAAAAAAAB8BAABfcmVscy8ucmVsc1BLAQItABQABgAIAAAAIQCbk5FhyAAAAOEA AAAPAAAAAAAAAAAAAAAAAAcCAABkcnMvZG93bnJldi54bWxQSwUGAAAAAAMAAwC3AAAA/AIAAAAA " filled="f" stroked="f">
                     <v:textbox inset="2.53958mm,2.53958mm,2.53958mm,2.53958mm">
                       <w:txbxContent>
                         <w:p>
@@ -9881,8 +9384,8 @@
                       </w:txbxContent>
                     </v:textbox>
                   </v:rect>
-                  <v:group id="Group 1562783315" o:spid="_x0000_s1077" style="position:absolute;left:19352;top:36089;width:68215;height:3421" coordorigin="19352,36089" coordsize="68214,3420" o:gfxdata="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">
-                    <v:rect id="Rectangle 1700667676" o:spid="_x0000_s1078" style="position:absolute;left:19352;top:36089;width:68215;height:3421;visibility:visible;mso-wrap-style:square;v-text-anchor:middle" o:gfxdata="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" filled="f" stroked="f">
+                  <v:group id="Group 1562783315" o:spid="_x0000_s1077" style="position:absolute;left:19352;top:36089;width:68215;height:3421" coordorigin="19352,36089" coordsize="68214,3420" o:gfxdata="UEsDBBQABgAIAAAAIQDb4fbL7gAAAIUBAAATAAAAW0NvbnRlbnRfVHlwZXNdLnhtbHyQz07DMAyH 70i8Q+QralM4IITa7kDhCAiNB7ASt43WOlEcyvb2pNu4IODoPz9/n1xv9vOkForiPDdwXVagiI23 jocG3rdPxR0oScgWJ8/UwIEENu3lRb09BBKV0ywNjCmFe63FjDSjlD4Q50nv44wpl3HQAc0OB9I3 VXWrjedEnIq03oC27qjHjympx31un0wiTQLq4bS4shrAECZnMGVTvbD9QSnOhDInjzsyuiBXWQP0 r4R18jfgnHvJr4nOknrFmJ5xzhraRtHWf3Kkpfz/yGo5S+H73hkquyhdjr3R8m2lj09svwAAAP// AwBQSwMEFAAGAAgAAAAhAFr0LFu/AAAAFQEAAAsAAABfcmVscy8ucmVsc2zPwWrDMAwG4Ptg72B0 X5TuUMaI01uh19I+gLGVxCy2jGSy9e1nemrHjpL4P0nD4SetZiPRyNnCruvBUPYcYp4tXC/Htw8w Wl0ObuVMFm6kcBhfX4Yzra62kC6xqGlKVgtLreUTUf1CyWnHhXKbTCzJ1VbKjMX5LzcTvvf9HuXR gPHJNKdgQU5hB+ZyK23zHztFL6w81c5zQp6m6P9TMfB3PtPWFCczVQtB9N4U2rp2HOA44NMz4y8A AAD//wMAUEsDBBQABgAIAAAAIQCbPzxFyAAAAOMAAAAPAAAAZHJzL2Rvd25yZXYueG1sRE/NasJA EL4LfYdlhN7qJoZYia4i0pYepKAWxNuQHZNgdjZkt0l8+64geJzvf5brwdSio9ZVlhXEkwgEcW51 xYWC3+Pn2xyE88gaa8uk4EYO1quX0RIzbXveU3fwhQgh7DJUUHrfZFK6vCSDbmIb4sBdbGvQh7Mt pG6xD+GmltMomkmDFYeGEhvalpRfD39GwVeP/SaJP7rd9bK9nY/pz2kXk1Kv42GzAOFp8E/xw/2t w/x0Nn2fJ0mcwv2nAIBc/QMAAP//AwBQSwECLQAUAAYACAAAACEA2+H2y+4AAACFAQAAEwAAAAAA AAAAAAAAAAAAAAAAW0NvbnRlbnRfVHlwZXNdLnhtbFBLAQItABQABgAIAAAAIQBa9CxbvwAAABUB AAALAAAAAAAAAAAAAAAAAB8BAABfcmVscy8ucmVsc1BLAQItABQABgAIAAAAIQCbPzxFyAAAAOMA AAAPAAAAAAAAAAAAAAAAAAcCAABkcnMvZG93bnJldi54bWxQSwUGAAAAAAMAAwC3AAAA/AIAAAAA ">
+                    <v:rect id="Rectangle 1700667676" o:spid="_x0000_s1078" style="position:absolute;left:19352;top:36089;width:68215;height:3421;visibility:visible;mso-wrap-style:square;v-text-anchor:middle" o:gfxdata="UEsDBBQABgAIAAAAIQDb4fbL7gAAAIUBAAATAAAAW0NvbnRlbnRfVHlwZXNdLnhtbHyQz07DMAyH 70i8Q+QralM4IITa7kDhCAiNB7ASt43WOlEcyvb2pNu4IODoPz9/n1xv9vOkForiPDdwXVagiI23 jocG3rdPxR0oScgWJ8/UwIEENu3lRb09BBKV0ywNjCmFe63FjDSjlD4Q50nv44wpl3HQAc0OB9I3 VXWrjedEnIq03oC27qjHjympx31un0wiTQLq4bS4shrAECZnMGVTvbD9QSnOhDInjzsyuiBXWQP0 r4R18jfgnHvJr4nOknrFmJ5xzhraRtHWf3Kkpfz/yGo5S+H73hkquyhdjr3R8m2lj09svwAAAP// AwBQSwMEFAAGAAgAAAAhAFr0LFu/AAAAFQEAAAsAAABfcmVscy8ucmVsc2zPwWrDMAwG4Ptg72B0 X5TuUMaI01uh19I+gLGVxCy2jGSy9e1nemrHjpL4P0nD4SetZiPRyNnCruvBUPYcYp4tXC/Htw8w Wl0ObuVMFm6kcBhfX4Yzra62kC6xqGlKVgtLreUTUf1CyWnHhXKbTCzJ1VbKjMX5LzcTvvf9HuXR gPHJNKdgQU5hB+ZyK23zHztFL6w81c5zQp6m6P9TMfB3PtPWFCczVQtB9N4U2rp2HOA44NMz4y8A AAD//wMAUEsDBBQABgAIAAAAIQCyt0fsyAAAAOMAAAAPAAAAZHJzL2Rvd25yZXYueG1sRI/RTsMw DEXfkfiHyEi8sZQKdVCWTQyBtPE0Wj7ANKapaJyuCVv39zMSEvLT9b0+theryffqQGPsAhu4nWWg iJtgO24NfNSvN/egYkK22AcmAyeKsFpeXiywtOHI73SoUqsEwrFEAy6lodQ6No48xlkYiMX7CqPH JHJstR3xKHDf6zzLCu2xY9ngcKBnR8139eMN7O4C5S95XFetf3DTZ/223WNhzPXV9PQIKtGU/sN/ 0xsr588FWcyl4PcnaYBengEAAP//AwBQSwECLQAUAAYACAAAACEA2+H2y+4AAACFAQAAEwAAAAAA AAAAAAAAAAAAAAAAW0NvbnRlbnRfVHlwZXNdLnhtbFBLAQItABQABgAIAAAAIQBa9CxbvwAAABUB AAALAAAAAAAAAAAAAAAAAB8BAABfcmVscy8ucmVsc1BLAQItABQABgAIAAAAIQCyt0fsyAAAAOMA AAAPAAAAAAAAAAAAAAAAAAcCAABkcnMvZG93bnJldi54bWxQSwUGAAAAAAMAAwC3AAAA/AIAAAAA " filled="f" stroked="f">
                       <v:textbox inset="2.53958mm,2.53958mm,2.53958mm,2.53958mm">
                         <w:txbxContent>
                           <w:p>
@@ -9894,8 +9397,8 @@
                         </w:txbxContent>
                       </v:textbox>
                     </v:rect>
-                    <v:group id="Group 1909272718" o:spid="_x0000_s1079" style="position:absolute;left:19352;top:36089;width:68215;height:3421" coordorigin="19352,36174" coordsize="68214,3252" o:gfxdata="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">
-                      <v:rect id="Rectangle 1036377721" o:spid="_x0000_s1080" style="position:absolute;left:19352;top:36174;width:68215;height:3252;visibility:visible;mso-wrap-style:square;v-text-anchor:middle" o:gfxdata="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" filled="f" stroked="f">
+                    <v:group id="Group 1909272718" o:spid="_x0000_s1079" style="position:absolute;left:19352;top:36089;width:68215;height:3421" coordorigin="19352,36174" coordsize="68214,3252" o:gfxdata="UEsDBBQABgAIAAAAIQDb4fbL7gAAAIUBAAATAAAAW0NvbnRlbnRfVHlwZXNdLnhtbHyQz07DMAyH 70i8Q+QralM4IITa7kDhCAiNB7ASt43WOlEcyvb2pNu4IODoPz9/n1xv9vOkForiPDdwXVagiI23 jocG3rdPxR0oScgWJ8/UwIEENu3lRb09BBKV0ywNjCmFe63FjDSjlD4Q50nv44wpl3HQAc0OB9I3 VXWrjedEnIq03oC27qjHjympx31un0wiTQLq4bS4shrAECZnMGVTvbD9QSnOhDInjzsyuiBXWQP0 r4R18jfgnHvJr4nOknrFmJ5xzhraRtHWf3Kkpfz/yGo5S+H73hkquyhdjr3R8m2lj09svwAAAP// AwBQSwMEFAAGAAgAAAAhAFr0LFu/AAAAFQEAAAsAAABfcmVscy8ucmVsc2zPwWrDMAwG4Ptg72B0 X5TuUMaI01uh19I+gLGVxCy2jGSy9e1nemrHjpL4P0nD4SetZiPRyNnCruvBUPYcYp4tXC/Htw8w Wl0ObuVMFm6kcBhfX4Yzra62kC6xqGlKVgtLreUTUf1CyWnHhXKbTCzJ1VbKjMX5LzcTvvf9HuXR gPHJNKdgQU5hB+ZyK23zHztFL6w81c5zQp6m6P9TMfB3PtPWFCczVQtB9N4U2rp2HOA44NMz4y8A AAD//wMAUEsDBBQABgAIAAAAIQCmpL2yzAAAAOMAAAAPAAAAZHJzL2Rvd25yZXYueG1sRI9Ba8JA EIXvhf6HZQq91U0irZq6iogtPYigFkpvQ3ZMgtnZkN0m8d93DoUeZ96b975ZrkfXqJ66UHs2kE4S UMSFtzWXBj7Pb09zUCEiW2w8k4EbBViv7u+WmFs/8JH6UyyVhHDI0UAVY5trHYqKHIaJb4lFu/jO YZSxK7XtcJBw1+gsSV60w5qlocKWthUV19OPM/A+4LCZprt+f71sb9/n58PXPiVjHh/GzSuoSGP8 N/9df1jBXySLbJbNUoGWn2QBevULAAD//wMAUEsBAi0AFAAGAAgAAAAhANvh9svuAAAAhQEAABMA AAAAAAAAAAAAAAAAAAAAAFtDb250ZW50X1R5cGVzXS54bWxQSwECLQAUAAYACAAAACEAWvQsW78A AAAVAQAACwAAAAAAAAAAAAAAAAAfAQAAX3JlbHMvLnJlbHNQSwECLQAUAAYACAAAACEApqS9sswA AADjAAAADwAAAAAAAAAAAAAAAAAHAgAAZHJzL2Rvd25yZXYueG1sUEsFBgAAAAADAAMAtwAAAAAD AAAAAA== ">
+                      <v:rect id="Rectangle 1036377721" o:spid="_x0000_s1080" style="position:absolute;left:19352;top:36174;width:68215;height:3252;visibility:visible;mso-wrap-style:square;v-text-anchor:middle" o:gfxdata="UEsDBBQABgAIAAAAIQDb4fbL7gAAAIUBAAATAAAAW0NvbnRlbnRfVHlwZXNdLnhtbHyQz07DMAyH 70i8Q+QralM4IITa7kDhCAiNB7ASt43WOlEcyvb2pNu4IODoPz9/n1xv9vOkForiPDdwXVagiI23 jocG3rdPxR0oScgWJ8/UwIEENu3lRb09BBKV0ywNjCmFe63FjDSjlD4Q50nv44wpl3HQAc0OB9I3 VXWrjedEnIq03oC27qjHjympx31un0wiTQLq4bS4shrAECZnMGVTvbD9QSnOhDInjzsyuiBXWQP0 r4R18jfgnHvJr4nOknrFmJ5xzhraRtHWf3Kkpfz/yGo5S+H73hkquyhdjr3R8m2lj09svwAAAP// AwBQSwMEFAAGAAgAAAAhAFr0LFu/AAAAFQEAAAsAAABfcmVscy8ucmVsc2zPwWrDMAwG4Ptg72B0 X5TuUMaI01uh19I+gLGVxCy2jGSy9e1nemrHjpL4P0nD4SetZiPRyNnCruvBUPYcYp4tXC/Htw8w Wl0ObuVMFm6kcBhfX4Yzra62kC6xqGlKVgtLreUTUf1CyWnHhXKbTCzJ1VbKjMX5LzcTvvf9HuXR gPHJNKdgQU5hB+ZyK23zHztFL6w81c5zQp6m6P9TMfB3PtPWFCczVQtB9N4U2rp2HOA44NMz4y8A AAD//wMAUEsDBBQABgAIAAAAIQD67VcOxwAAAOMAAAAPAAAAZHJzL2Rvd25yZXYueG1sRE9fT8Iw EH834Ts0R+KbdAyzwaQQNJqgTzr4AMd6rgvrda4VxrenJCY+3u//LdeDbcWJet84VjCdJCCIK6cb rhXsd28PcxA+IGtsHZOCC3lYr0Z3Syy0O/MXncpQixjCvkAFJoSukNJXhiz6ieuII/fteoshnn0t dY/nGG5bmSZJJi02HBsMdvRiqDqWv1bB56Oj9DX1z2VtF2Y47D7efzBT6n48bJ5ABBrCv/jPvdVx fjLLZnmep1O4/RQBkKsrAAAA//8DAFBLAQItABQABgAIAAAAIQDb4fbL7gAAAIUBAAATAAAAAAAA AAAAAAAAAAAAAABbQ29udGVudF9UeXBlc10ueG1sUEsBAi0AFAAGAAgAAAAhAFr0LFu/AAAAFQEA AAsAAAAAAAAAAAAAAAAAHwEAAF9yZWxzLy5yZWxzUEsBAi0AFAAGAAgAAAAhAPrtVw7HAAAA4wAA AA8AAAAAAAAAAAAAAAAABwIAAGRycy9kb3ducmV2LnhtbFBLBQYAAAAAAwADALcAAAD7AgAAAAA= " filled="f" stroked="f">
                         <v:textbox inset="2.53958mm,2.53958mm,2.53958mm,2.53958mm">
                           <w:txbxContent>
                             <w:p>
@@ -9907,8 +9410,8 @@
                           </w:txbxContent>
                         </v:textbox>
                       </v:rect>
-                      <v:group id="Group 1817087261" o:spid="_x0000_s1081" style="position:absolute;left:19352;top:36174;width:68215;height:3251" coordorigin="3300,30964" coordsize="91684,4227" o:gfxdata="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">
-                        <v:rect id="Rectangle 1604662861" o:spid="_x0000_s1082" style="position:absolute;left:3300;top:30964;width:91684;height:4227;visibility:visible;mso-wrap-style:square;v-text-anchor:middle" o:gfxdata="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" filled="f" stroked="f">
+                      <v:group id="Group 1817087261" o:spid="_x0000_s1081" style="position:absolute;left:19352;top:36174;width:68215;height:3251" coordorigin="3300,30964" coordsize="91684,4227" o:gfxdata="UEsDBBQABgAIAAAAIQDb4fbL7gAAAIUBAAATAAAAW0NvbnRlbnRfVHlwZXNdLnhtbHyQz07DMAyH 70i8Q+QralM4IITa7kDhCAiNB7ASt43WOlEcyvb2pNu4IODoPz9/n1xv9vOkForiPDdwXVagiI23 jocG3rdPxR0oScgWJ8/UwIEENu3lRb09BBKV0ywNjCmFe63FjDSjlD4Q50nv44wpl3HQAc0OB9I3 VXWrjedEnIq03oC27qjHjympx31un0wiTQLq4bS4shrAECZnMGVTvbD9QSnOhDInjzsyuiBXWQP0 r4R18jfgnHvJr4nOknrFmJ5xzhraRtHWf3Kkpfz/yGo5S+H73hkquyhdjr3R8m2lj09svwAAAP// AwBQSwMEFAAGAAgAAAAhAFr0LFu/AAAAFQEAAAsAAABfcmVscy8ucmVsc2zPwWrDMAwG4Ptg72B0 X5TuUMaI01uh19I+gLGVxCy2jGSy9e1nemrHjpL4P0nD4SetZiPRyNnCruvBUPYcYp4tXC/Htw8w Wl0ObuVMFm6kcBhfX4Yzra62kC6xqGlKVgtLreUTUf1CyWnHhXKbTCzJ1VbKjMX5LzcTvvf9HuXR gPHJNKdgQU5hB+ZyK23zHztFL6w81c5zQp6m6P9TMfB3PtPWFCczVQtB9N4U2rp2HOA44NMz4y8A AAD//wMAUEsDBBQABgAIAAAAIQDjFj0UyAAAAOMAAAAPAAAAZHJzL2Rvd25yZXYueG1sRE9fa8Iw EH8X9h3CDXzTNA61VKOIbOKDDKaD4dvRnG2xuZQma+u3XwaDPd7v/623g61FR62vHGtQ0wQEce5M xYWGz8vbJAXhA7LB2jFpeJCH7eZptMbMuJ4/qDuHQsQQ9hlqKENoMil9XpJFP3UNceRurrUY4tkW 0rTYx3Bby1mSLKTFimNDiQ3tS8rv52+r4dBjv3tRr93pfts/rpf5+9dJkdbj52G3AhFoCP/iP/fR xPmpWibpcrZQ8PtTBEBufgAAAP//AwBQSwECLQAUAAYACAAAACEA2+H2y+4AAACFAQAAEwAAAAAA AAAAAAAAAAAAAAAAW0NvbnRlbnRfVHlwZXNdLnhtbFBLAQItABQABgAIAAAAIQBa9CxbvwAAABUB AAALAAAAAAAAAAAAAAAAAB8BAABfcmVscy8ucmVsc1BLAQItABQABgAIAAAAIQDjFj0UyAAAAOMA AAAPAAAAAAAAAAAAAAAAAAcCAABkcnMvZG93bnJldi54bWxQSwUGAAAAAAMAAwC3AAAA/AIAAAAA ">
+                        <v:rect id="Rectangle 1604662861" o:spid="_x0000_s1082" style="position:absolute;left:3300;top:30964;width:91684;height:4227;visibility:visible;mso-wrap-style:square;v-text-anchor:middle" o:gfxdata="UEsDBBQABgAIAAAAIQDb4fbL7gAAAIUBAAATAAAAW0NvbnRlbnRfVHlwZXNdLnhtbHyQz07DMAyH 70i8Q+QralM4IITa7kDhCAiNB7ASt43WOlEcyvb2pNu4IODoPz9/n1xv9vOkForiPDdwXVagiI23 jocG3rdPxR0oScgWJ8/UwIEENu3lRb09BBKV0ywNjCmFe63FjDSjlD4Q50nv44wpl3HQAc0OB9I3 VXWrjedEnIq03oC27qjHjympx31un0wiTQLq4bS4shrAECZnMGVTvbD9QSnOhDInjzsyuiBXWQP0 r4R18jfgnHvJr4nOknrFmJ5xzhraRtHWf3Kkpfz/yGo5S+H73hkquyhdjr3R8m2lj09svwAAAP// AwBQSwMEFAAGAAgAAAAhAFr0LFu/AAAAFQEAAAsAAABfcmVscy8ucmVsc2zPwWrDMAwG4Ptg72B0 X5TuUMaI01uh19I+gLGVxCy2jGSy9e1nemrHjpL4P0nD4SetZiPRyNnCruvBUPYcYp4tXC/Htw8w Wl0ObuVMFm6kcBhfX4Yzra62kC6xqGlKVgtLreUTUf1CyWnHhXKbTCzJ1VbKjMX5LzcTvvf9HuXR gPHJNKdgQU5hB+ZyK23zHztFL6w81c5zQp6m6P9TMfB3PtPWFCczVQtB9N4U2rp2HOA44NMz4y8A AAD//wMAUEsDBBQABgAIAAAAIQDzgJrTxgAAAOMAAAAPAAAAZHJzL2Rvd25yZXYueG1sRE9fa8Iw EH8X/A7hhL1papHgqlHc2GDbk6t+gLM5m2Jz6ZpMu2+/DAY+3u//rbeDa8WV+tB41jCfZSCIK28a rjUcD6/TJYgQkQ22nknDDwXYbsajNRbG3/iTrmWsRQrhUKAGG2NXSBkqSw7DzHfEiTv73mFMZ19L 0+MthbtW5lmmpMOGU4PFjp4tVZfy22nYLzzlL3l4Kmv3aIfT4eP9C5XWD5NhtwIRaYh38b/7zaT5 KlsolS/VHP5+SgDIzS8AAAD//wMAUEsBAi0AFAAGAAgAAAAhANvh9svuAAAAhQEAABMAAAAAAAAA AAAAAAAAAAAAAFtDb250ZW50X1R5cGVzXS54bWxQSwECLQAUAAYACAAAACEAWvQsW78AAAAVAQAA CwAAAAAAAAAAAAAAAAAfAQAAX3JlbHMvLnJlbHNQSwECLQAUAAYACAAAACEA84Ca08YAAADjAAAA DwAAAAAAAAAAAAAAAAAHAgAAZHJzL2Rvd25yZXYueG1sUEsFBgAAAAADAAMAtwAAAPoCAAAAAA== " filled="f" stroked="f">
                           <v:textbox inset="2.53958mm,2.53958mm,2.53958mm,2.53958mm">
                             <w:txbxContent>
                               <w:p>
@@ -9920,7 +9423,7 @@
                             </w:txbxContent>
                           </v:textbox>
                         </v:rect>
-                        <v:oval id="Oval 1982050211" o:spid="_x0000_s1083" style="position:absolute;left:90757;top:30964;width:4227;height:4227;visibility:visible;mso-wrap-style:square;v-text-anchor:middle" o:gfxdata="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" fillcolor="#f4a11e" stroked="f">
+                        <v:oval id="Oval 1982050211" o:spid="_x0000_s1083" style="position:absolute;left:90757;top:30964;width:4227;height:4227;visibility:visible;mso-wrap-style:square;v-text-anchor:middle" o:gfxdata="UEsDBBQABgAIAAAAIQDb4fbL7gAAAIUBAAATAAAAW0NvbnRlbnRfVHlwZXNdLnhtbHyQz07DMAyH 70i8Q+QralM4IITa7kDhCAiNB7ASt43WOlEcyvb2pNu4IODoPz9/n1xv9vOkForiPDdwXVagiI23 jocG3rdPxR0oScgWJ8/UwIEENu3lRb09BBKV0ywNjCmFe63FjDSjlD4Q50nv44wpl3HQAc0OB9I3 VXWrjedEnIq03oC27qjHjympx31un0wiTQLq4bS4shrAECZnMGVTvbD9QSnOhDInjzsyuiBXWQP0 r4R18jfgnHvJr4nOknrFmJ5xzhraRtHWf3Kkpfz/yGo5S+H73hkquyhdjr3R8m2lj09svwAAAP// AwBQSwMEFAAGAAgAAAAhAFr0LFu/AAAAFQEAAAsAAABfcmVscy8ucmVsc2zPwWrDMAwG4Ptg72B0 X5TuUMaI01uh19I+gLGVxCy2jGSy9e1nemrHjpL4P0nD4SetZiPRyNnCruvBUPYcYp4tXC/Htw8w Wl0ObuVMFm6kcBhfX4Yzra62kC6xqGlKVgtLreUTUf1CyWnHhXKbTCzJ1VbKjMX5LzcTvvf9HuXR gPHJNKdgQU5hB+ZyK23zHztFL6w81c5zQp6m6P9TMfB3PtPWFCczVQtB9N4U2rp2HOA44NMz4y8A AAD//wMAUEsDBBQABgAIAAAAIQDEZcFBxgAAAOMAAAAPAAAAZHJzL2Rvd25yZXYueG1sRE9fS8Mw EH8X/A7hBF/EXVpwzG7ZEKGgKDLr9n40Z1vWXGqTbfXbG0Hw8X7/b7WZXK9OPIbOi4FspkGx1N52 0hjYfZS3C1AhkljqvbCBbw6wWV9erKiw/izvfKpio1KIhIIMtDEOBWKoW3YUZn5gSdynHx3FdI4N 2pHOKdz1mGs9R0edpIaWBn5suT5UR2cAb54Zt0OF5dcL7o/z1/0bHUpjrq+mhyWoyFP8F/+5n2ya f7/I9Z3Oswx+f0oA4PoHAAD//wMAUEsBAi0AFAAGAAgAAAAhANvh9svuAAAAhQEAABMAAAAAAAAA AAAAAAAAAAAAAFtDb250ZW50X1R5cGVzXS54bWxQSwECLQAUAAYACAAAACEAWvQsW78AAAAVAQAA CwAAAAAAAAAAAAAAAAAfAQAAX3JlbHMvLnJlbHNQSwECLQAUAAYACAAAACEAxGXBQcYAAADjAAAA DwAAAAAAAAAAAAAAAAAHAgAAZHJzL2Rvd25yZXYueG1sUEsFBgAAAAADAAMAtwAAAPoCAAAAAA== " fillcolor="#f4a11e" stroked="f">
                           <v:textbox inset="2.53958mm,2.53958mm,2.53958mm,2.53958mm">
                             <w:txbxContent>
                               <w:p>
@@ -9932,7 +9435,7 @@
                             </w:txbxContent>
                           </v:textbox>
                         </v:oval>
-                        <v:oval id="Oval 1448466089" o:spid="_x0000_s1084" style="position:absolute;left:3300;top:30964;width:4227;height:4227;visibility:visible;mso-wrap-style:square;v-text-anchor:middle" o:gfxdata="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" fillcolor="#f4a11e" stroked="f">
+                        <v:oval id="Oval 1448466089" o:spid="_x0000_s1084" style="position:absolute;left:3300;top:30964;width:4227;height:4227;visibility:visible;mso-wrap-style:square;v-text-anchor:middle" o:gfxdata="UEsDBBQABgAIAAAAIQDb4fbL7gAAAIUBAAATAAAAW0NvbnRlbnRfVHlwZXNdLnhtbHyQz07DMAyH 70i8Q+QralM4IITa7kDhCAiNB7ASt43WOlEcyvb2pNu4IODoPz9/n1xv9vOkForiPDdwXVagiI23 jocG3rdPxR0oScgWJ8/UwIEENu3lRb09BBKV0ywNjCmFe63FjDSjlD4Q50nv44wpl3HQAc0OB9I3 VXWrjedEnIq03oC27qjHjympx31un0wiTQLq4bS4shrAECZnMGVTvbD9QSnOhDInjzsyuiBXWQP0 r4R18jfgnHvJr4nOknrFmJ5xzhraRtHWf3Kkpfz/yGo5S+H73hkquyhdjr3R8m2lj09svwAAAP// AwBQSwMEFAAGAAgAAAAhAFr0LFu/AAAAFQEAAAsAAABfcmVscy8ucmVsc2zPwWrDMAwG4Ptg72B0 X5TuUMaI01uh19I+gLGVxCy2jGSy9e1nemrHjpL4P0nD4SetZiPRyNnCruvBUPYcYp4tXC/Htw8w Wl0ObuVMFm6kcBhfX4Yzra62kC6xqGlKVgtLreUTUf1CyWnHhXKbTCzJ1VbKjMX5LzcTvvf9HuXR gPHJNKdgQU5hB+ZyK23zHztFL6w81c5zQp6m6P9TMfB3PtPWFCczVQtB9N4U2rp2HOA44NMz4y8A AAD//wMAUEsDBBQABgAIAAAAIQD1SREdxwAAAOMAAAAPAAAAZHJzL2Rvd25yZXYueG1sRE/NSsNA EL4LfYdlCl6knSghxNhtKYWAoojG9j5kxyQ0Oxuz2za+vSsIHuf7n9Vmsr068+g7JxpulwkoltqZ ThoN+49ykYPygcRQ74Q1fLOHzXp2taLCuIu887kKjYoh4gvS0IYwFIi+btmSX7qBJXKfbrQU4jk2 aEa6xHDb412SZGipk9jQ0sC7lutjdbIa8OaJ8W2osPx6xsMpezm80rHU+no+bR9ABZ7Cv/jP/Wji /DTN0yxL8nv4/SkCgOsfAAAA//8DAFBLAQItABQABgAIAAAAIQDb4fbL7gAAAIUBAAATAAAAAAAA AAAAAAAAAAAAAABbQ29udGVudF9UeXBlc10ueG1sUEsBAi0AFAAGAAgAAAAhAFr0LFu/AAAAFQEA AAsAAAAAAAAAAAAAAAAAHwEAAF9yZWxzLy5yZWxzUEsBAi0AFAAGAAgAAAAhAPVJER3HAAAA4wAA AA8AAAAAAAAAAAAAAAAABwIAAGRycy9kb3ducmV2LnhtbFBLBQYAAAAAAwADALcAAAD7AgAAAAA= " fillcolor="#f4a11e" stroked="f">
                           <v:textbox inset="2.53958mm,2.53958mm,2.53958mm,2.53958mm">
                             <w:txbxContent>
                               <w:p>
@@ -9944,7 +9447,7 @@
                             </w:txbxContent>
                           </v:textbox>
                         </v:oval>
-                        <v:rect id="Rectangle 165282725" o:spid="_x0000_s1085" style="position:absolute;left:5043;top:30964;width:87450;height:4227;visibility:visible;mso-wrap-style:square;v-text-anchor:middle" o:gfxdata="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" fillcolor="#f4a11e" stroked="f">
+                        <v:rect id="Rectangle 165282725" o:spid="_x0000_s1085" style="position:absolute;left:5043;top:30964;width:87450;height:4227;visibility:visible;mso-wrap-style:square;v-text-anchor:middle" o:gfxdata="UEsDBBQABgAIAAAAIQDb4fbL7gAAAIUBAAATAAAAW0NvbnRlbnRfVHlwZXNdLnhtbHyQz07DMAyH 70i8Q+QralM4IITa7kDhCAiNB7ASt43WOlEcyvb2pNu4IODoPz9/n1xv9vOkForiPDdwXVagiI23 jocG3rdPxR0oScgWJ8/UwIEENu3lRb09BBKV0ywNjCmFe63FjDSjlD4Q50nv44wpl3HQAc0OB9I3 VXWrjedEnIq03oC27qjHjympx31un0wiTQLq4bS4shrAECZnMGVTvbD9QSnOhDInjzsyuiBXWQP0 r4R18jfgnHvJr4nOknrFmJ5xzhraRtHWf3Kkpfz/yGo5S+H73hkquyhdjr3R8m2lj09svwAAAP// AwBQSwMEFAAGAAgAAAAhAFr0LFu/AAAAFQEAAAsAAABfcmVscy8ucmVsc2zPwWrDMAwG4Ptg72B0 X5TuUMaI01uh19I+gLGVxCy2jGSy9e1nemrHjpL4P0nD4SetZiPRyNnCruvBUPYcYp4tXC/Htw8w Wl0ObuVMFm6kcBhfX4Yzra62kC6xqGlKVgtLreUTUf1CyWnHhXKbTCzJ1VbKjMX5LzcTvvf9HuXR gPHJNKdgQU5hB+ZyK23zHztFL6w81c5zQp6m6P9TMfB3PtPWFCczVQtB9N4U2rp2HOA44NMz4y8A AAD//wMAUEsDBBQABgAIAAAAIQDFV7/HyAAAAOIAAAAPAAAAZHJzL2Rvd25yZXYueG1sRE/PT8Iw FL6b+D80z4SbdBYZMCjEmJBw8KBTDtxe1sc2XV/n2o3x31sTE49fvt+b3WgbMVDna8caHqYJCOLC mZpLDR/v+/slCB+QDTaOScOVPOy2tzcbzIy78BsNeShFDGGfoYYqhDaT0hcVWfRT1xJH7uw6iyHC rpSmw0sMt41USZJKizXHhgpbeq6o+Mp7q2E11Or0PWtsehwf1Wf+0pvra6/15G58WoMINIZ/8Z/7 YOL8dK6WaqHm8HspYpDbHwAAAP//AwBQSwECLQAUAAYACAAAACEA2+H2y+4AAACFAQAAEwAAAAAA AAAAAAAAAAAAAAAAW0NvbnRlbnRfVHlwZXNdLnhtbFBLAQItABQABgAIAAAAIQBa9CxbvwAAABUB AAALAAAAAAAAAAAAAAAAAB8BAABfcmVscy8ucmVsc1BLAQItABQABgAIAAAAIQDFV7/HyAAAAOIA AAAPAAAAAAAAAAAAAAAAAAcCAABkcnMvZG93bnJldi54bWxQSwUGAAAAAAMAAwC3AAAA/AIAAAAA " fillcolor="#f4a11e" stroked="f">
                           <v:textbox inset="2.53958mm,2.53958mm,2.53958mm,2.53958mm">
                             <w:txbxContent>
                               <w:p>

</xml_diff>